<commit_message>
Release v7.0: Admin Power Panel, Manual User Creation & Category Homologation
</commit_message>
<xml_diff>
--- a/Curso Conceptos básicos sobre la IA.docx
+++ b/Curso Conceptos básicos sobre la IA.docx
@@ -3,167 +3,191 @@
 <w:document xmlns:wpc="http://schemas.microsoft.com/office/word/2010/wordprocessingCanvas" xmlns:cx="http://schemas.microsoft.com/office/drawing/2014/chartex" xmlns:cx1="http://schemas.microsoft.com/office/drawing/2015/9/8/chartex" xmlns:cx2="http://schemas.microsoft.com/office/drawing/2015/10/21/chartex" xmlns:cx3="http://schemas.microsoft.com/office/drawing/2016/5/9/chartex" xmlns:cx4="http://schemas.microsoft.com/office/drawing/2016/5/10/chartex" xmlns:cx5="http://schemas.microsoft.com/office/drawing/2016/5/11/chartex" xmlns:cx6="http://schemas.microsoft.com/office/drawing/2016/5/12/chartex" xmlns:cx7="http://schemas.microsoft.com/office/drawing/2016/5/13/chartex" xmlns:cx8="http://schemas.microsoft.com/office/drawing/2016/5/14/chartex" xmlns:mc="http://schemas.openxmlformats.org/markup-compatibility/2006" xmlns:aink="http://schemas.microsoft.com/office/drawing/2016/ink" xmlns:am3d="http://schemas.microsoft.com/office/drawing/2017/model3d" xmlns:o="urn:schemas-microsoft-com:office:office" xmlns:oel="http://schemas.microsoft.com/office/2019/extlst" xmlns:r="http://schemas.openxmlformats.org/officeDocument/2006/relationships" xmlns:m="http://schemas.openxmlformats.org/officeDocument/2006/math" xmlns:v="urn:schemas-microsoft-com:vml" xmlns:wp14="http://schemas.microsoft.com/office/word/2010/wordprocessingDrawing" xmlns:wp="http://schemas.openxmlformats.org/drawingml/2006/wordprocessingDrawing" xmlns:w10="urn:schemas-microsoft-com:office:word" xmlns:w="http://schemas.openxmlformats.org/wordprocessingml/2006/main" xmlns:w14="http://schemas.microsoft.com/office/word/2010/wordml" xmlns:w15="http://schemas.microsoft.com/office/word/2012/wordml" xmlns:w16cex="http://schemas.microsoft.com/office/word/2018/wordml/cex" xmlns:w16cid="http://schemas.microsoft.com/office/word/2016/wordml/cid" xmlns:w16="http://schemas.microsoft.com/office/word/2018/wordml" xmlns:w16du="http://schemas.microsoft.com/office/word/2023/wordml/word16du" xmlns:w16sdtdh="http://schemas.microsoft.com/office/word/2020/wordml/sdtdatahash" xmlns:w16sdtfl="http://schemas.microsoft.com/office/word/2024/wordml/sdtformatlock" xmlns:w16se="http://schemas.microsoft.com/office/word/2015/wordml/symex" xmlns:wpg="http://schemas.microsoft.com/office/word/2010/wordprocessingGroup" xmlns:wpi="http://schemas.microsoft.com/office/word/2010/wordprocessingInk" xmlns:wne="http://schemas.microsoft.com/office/word/2006/wordml" xmlns:wps="http://schemas.microsoft.com/office/word/2010/wordprocessingShape" mc:Ignorable="w14 w15 w16se w16cid w16 w16cex w16sdtdh w16sdtfl w16du wp14">
   <w:body>
     <w:p>
-      <w:r>
-        <w:drawing>
-          <wp:inline distT="0" distB="0" distL="0" distR="0" wp14:anchorId="496E8EA3" wp14:editId="4E9FAC5E">
-            <wp:extent cx="891540" cy="502920"/>
-            <wp:effectExtent l="0" t="0" r="3810" b="0"/>
-            <wp:docPr id="1614039215" name="Imagen 14" descr="Conceptos básicos sobre la IA"/>
-            <wp:cNvGraphicFramePr>
-              <a:graphicFrameLocks xmlns:a="http://schemas.openxmlformats.org/drawingml/2006/main" noChangeAspect="1"/>
-            </wp:cNvGraphicFramePr>
-            <a:graphic xmlns:a="http://schemas.openxmlformats.org/drawingml/2006/main">
-              <a:graphicData uri="http://schemas.openxmlformats.org/drawingml/2006/picture">
-                <pic:pic xmlns:pic="http://schemas.openxmlformats.org/drawingml/2006/picture">
-                  <pic:nvPicPr>
-                    <pic:cNvPr id="0" name="Picture 36" descr="Conceptos básicos sobre la IA"/>
-                    <pic:cNvPicPr>
-                      <a:picLocks noChangeAspect="1" noChangeArrowheads="1"/>
-                    </pic:cNvPicPr>
-                  </pic:nvPicPr>
-                  <pic:blipFill>
-                    <a:blip r:embed="rId5">
-                      <a:extLst>
-                        <a:ext uri="{28A0092B-C50C-407E-A947-70E740481C1C}">
-                          <a14:useLocalDpi xmlns:a14="http://schemas.microsoft.com/office/drawing/2010/main" val="0"/>
-                        </a:ext>
-                      </a:extLst>
-                    </a:blip>
-                    <a:srcRect/>
-                    <a:stretch>
-                      <a:fillRect/>
-                    </a:stretch>
-                  </pic:blipFill>
-                  <pic:spPr bwMode="auto">
-                    <a:xfrm>
-                      <a:off x="0" y="0"/>
-                      <a:ext cx="891540" cy="502920"/>
-                    </a:xfrm>
-                    <a:prstGeom prst="rect">
-                      <a:avLst/>
-                    </a:prstGeom>
-                    <a:noFill/>
-                    <a:ln>
-                      <a:noFill/>
-                    </a:ln>
-                  </pic:spPr>
-                </pic:pic>
-              </a:graphicData>
-            </a:graphic>
-          </wp:inline>
-        </w:drawing>
-      </w:r>
-    </w:p>
-    <w:p>
       <w:pPr>
         <w:rPr>
           <w:b/>
           <w:bCs/>
-        </w:rPr>
-      </w:pPr>
-      <w:hyperlink r:id="rId6" w:history="1">
-        <w:r>
-          <w:rPr>
-            <w:rStyle w:val="Hipervnculo"/>
-            <w:b/>
-            <w:bCs/>
-          </w:rPr>
-          <w:t>Conceptos básicos sobre la IA</w:t>
-        </w:r>
-      </w:hyperlink>
-    </w:p>
-    <w:p>
-      <w:r>
-        <w:t>CURSO 1, 3 horas</w:t>
-      </w:r>
-    </w:p>
-    <w:p>
-      <w:r>
-        <w:t>CURSO 1•3 horas</w:t>
+          <w:noProof/>
+        </w:rPr>
+      </w:pPr>
+      <w:r>
+        <w:rPr>
+          <w:rFonts w:ascii="Segoe UI Emoji" w:hAnsi="Segoe UI Emoji" w:cs="Segoe UI Emoji"/>
+          <w:b/>
+          <w:bCs/>
+          <w:noProof/>
+        </w:rPr>
+        <w:t>🔷</w:t>
+      </w:r>
+      <w:r>
+        <w:rPr>
+          <w:b/>
+          <w:bCs/>
+          <w:noProof/>
+        </w:rPr>
+        <w:t xml:space="preserve"> Estructura del curso (final)</w:t>
+      </w:r>
+    </w:p>
+    <w:p>
+      <w:pPr>
+        <w:rPr>
+          <w:b/>
+          <w:bCs/>
+          <w:noProof/>
+        </w:rPr>
+      </w:pPr>
+      <w:r>
+        <w:rPr>
+          <w:rFonts w:ascii="Segoe UI Emoji" w:hAnsi="Segoe UI Emoji" w:cs="Segoe UI Emoji"/>
+          <w:b/>
+          <w:bCs/>
+          <w:noProof/>
+        </w:rPr>
+        <w:t>🧠</w:t>
+      </w:r>
+      <w:r>
+        <w:rPr>
+          <w:b/>
+          <w:bCs/>
+          <w:noProof/>
+        </w:rPr>
+        <w:t xml:space="preserve"> MÓDULO 1. Fundamentos de Inteligencia Artificial (3 horas)</w:t>
+      </w:r>
+    </w:p>
+    <w:p>
+      <w:pPr>
+        <w:rPr>
+          <w:noProof/>
+        </w:rPr>
+      </w:pPr>
+      <w:r>
+        <w:rPr>
+          <w:rFonts w:ascii="Segoe UI Emoji" w:hAnsi="Segoe UI Emoji" w:cs="Segoe UI Emoji"/>
+          <w:noProof/>
+        </w:rPr>
+        <w:t>🎯</w:t>
+      </w:r>
+      <w:r>
+        <w:rPr>
+          <w:noProof/>
+        </w:rPr>
+        <w:t xml:space="preserve"> </w:t>
+      </w:r>
+      <w:r>
+        <w:rPr>
+          <w:i/>
+          <w:iCs/>
+          <w:noProof/>
+        </w:rPr>
+        <w:t>Objetivo:</w:t>
+      </w:r>
+      <w:r>
+        <w:rPr>
+          <w:noProof/>
+        </w:rPr>
+        <w:t xml:space="preserve"> Entender qué es la IA, cómo funciona y cómo aprovecharla correctamente.</w:t>
+      </w:r>
+    </w:p>
+    <w:p>
+      <w:pPr>
+        <w:rPr>
+          <w:b/>
+          <w:bCs/>
+          <w:noProof/>
+        </w:rPr>
+      </w:pPr>
+      <w:r>
+        <w:rPr>
+          <w:b/>
+          <w:bCs/>
+          <w:noProof/>
+        </w:rPr>
+        <w:t>Contenido:</w:t>
       </w:r>
     </w:p>
     <w:p>
       <w:pPr>
         <w:numPr>
           <w:ilvl w:val="0"/>
-          <w:numId w:val="1"/>
+          <w:numId w:val="8"/>
         </w:numPr>
-      </w:pPr>
+        <w:rPr>
+          <w:noProof/>
+        </w:rPr>
+      </w:pPr>
+      <w:r>
+        <w:rPr>
+          <w:noProof/>
+        </w:rPr>
+        <w:t xml:space="preserve">Qué es la IA hoy (real vs expectativa) </w:t>
+      </w:r>
     </w:p>
     <w:p>
       <w:pPr>
         <w:numPr>
           <w:ilvl w:val="0"/>
-          <w:numId w:val="1"/>
+          <w:numId w:val="8"/>
         </w:numPr>
-      </w:pPr>
+        <w:rPr>
+          <w:noProof/>
+        </w:rPr>
+      </w:pPr>
+      <w:r>
+        <w:rPr>
+          <w:noProof/>
+        </w:rPr>
+        <w:t xml:space="preserve">Tipos de IA (enfocado a negocio: predictiva vs generativa) </w:t>
+      </w:r>
     </w:p>
     <w:p>
       <w:pPr>
         <w:numPr>
           <w:ilvl w:val="0"/>
-          <w:numId w:val="1"/>
+          <w:numId w:val="8"/>
         </w:numPr>
-      </w:pPr>
+        <w:rPr>
+          <w:noProof/>
+        </w:rPr>
+      </w:pPr>
+      <w:r>
+        <w:rPr>
+          <w:noProof/>
+        </w:rPr>
+        <w:t xml:space="preserve">Cómo “piensa” la IA (input → procesamiento → output) </w:t>
+      </w:r>
     </w:p>
     <w:p>
       <w:pPr>
         <w:numPr>
           <w:ilvl w:val="0"/>
-          <w:numId w:val="1"/>
+          <w:numId w:val="8"/>
         </w:numPr>
-      </w:pPr>
-    </w:p>
-    <w:p>
-      <w:r>
-        <w:drawing>
-          <wp:inline distT="0" distB="0" distL="0" distR="0" wp14:anchorId="3162D3C4" wp14:editId="3B9B4F5E">
-            <wp:extent cx="891540" cy="502920"/>
-            <wp:effectExtent l="0" t="0" r="3810" b="0"/>
-            <wp:docPr id="1116689154" name="Imagen 13" descr="IA para la generación de ideas y la planificación"/>
-            <wp:cNvGraphicFramePr>
-              <a:graphicFrameLocks xmlns:a="http://schemas.openxmlformats.org/drawingml/2006/main" noChangeAspect="1"/>
-            </wp:cNvGraphicFramePr>
-            <a:graphic xmlns:a="http://schemas.openxmlformats.org/drawingml/2006/main">
-              <a:graphicData uri="http://schemas.openxmlformats.org/drawingml/2006/picture">
-                <pic:pic xmlns:pic="http://schemas.openxmlformats.org/drawingml/2006/picture">
-                  <pic:nvPicPr>
-                    <pic:cNvPr id="0" name="Picture 37" descr="IA para la generación de ideas y la planificación"/>
-                    <pic:cNvPicPr>
-                      <a:picLocks noChangeAspect="1" noChangeArrowheads="1"/>
-                    </pic:cNvPicPr>
-                  </pic:nvPicPr>
-                  <pic:blipFill>
-                    <a:blip r:embed="rId7">
-                      <a:extLst>
-                        <a:ext uri="{28A0092B-C50C-407E-A947-70E740481C1C}">
-                          <a14:useLocalDpi xmlns:a14="http://schemas.microsoft.com/office/drawing/2010/main" val="0"/>
-                        </a:ext>
-                      </a:extLst>
-                    </a:blip>
-                    <a:srcRect/>
-                    <a:stretch>
-                      <a:fillRect/>
-                    </a:stretch>
-                  </pic:blipFill>
-                  <pic:spPr bwMode="auto">
-                    <a:xfrm>
-                      <a:off x="0" y="0"/>
-                      <a:ext cx="891540" cy="502920"/>
-                    </a:xfrm>
-                    <a:prstGeom prst="rect">
-                      <a:avLst/>
-                    </a:prstGeom>
-                    <a:noFill/>
-                    <a:ln>
-                      <a:noFill/>
-                    </a:ln>
-                  </pic:spPr>
-                </pic:pic>
-              </a:graphicData>
-            </a:graphic>
-          </wp:inline>
-        </w:drawing>
+        <w:rPr>
+          <w:noProof/>
+        </w:rPr>
+      </w:pPr>
+      <w:r>
+        <w:rPr>
+          <w:noProof/>
+        </w:rPr>
+        <w:t xml:space="preserve">Concepto clave: la IA depende de los datos </w:t>
+      </w:r>
+    </w:p>
+    <w:p>
+      <w:pPr>
+        <w:numPr>
+          <w:ilvl w:val="0"/>
+          <w:numId w:val="8"/>
+        </w:numPr>
+        <w:rPr>
+          <w:noProof/>
+        </w:rPr>
+      </w:pPr>
+      <w:r>
+        <w:rPr>
+          <w:noProof/>
+        </w:rPr>
+        <w:t xml:space="preserve">Introducción a prompts (cómo pedir bien) </w:t>
       </w:r>
     </w:p>
     <w:p>
@@ -171,111 +195,204 @@
         <w:rPr>
           <w:b/>
           <w:bCs/>
-        </w:rPr>
-      </w:pPr>
-      <w:hyperlink r:id="rId8" w:history="1">
-        <w:r>
-          <w:rPr>
-            <w:rStyle w:val="Hipervnculo"/>
-            <w:b/>
-            <w:bCs/>
-          </w:rPr>
-          <w:t>IA para la generación de ideas y la planificación</w:t>
-        </w:r>
-      </w:hyperlink>
-    </w:p>
-    <w:p>
-      <w:r>
-        <w:t>CURSO 2, 1 hora</w:t>
-      </w:r>
-    </w:p>
-    <w:p>
-      <w:r>
-        <w:t>CURSO 2•1 hora</w:t>
+          <w:noProof/>
+        </w:rPr>
+      </w:pPr>
+      <w:r>
+        <w:rPr>
+          <w:b/>
+          <w:bCs/>
+          <w:noProof/>
+        </w:rPr>
+        <w:t>Insight clave:</w:t>
+      </w:r>
+    </w:p>
+    <w:p>
+      <w:pPr>
+        <w:rPr>
+          <w:noProof/>
+        </w:rPr>
+      </w:pPr>
+      <w:r>
+        <w:rPr>
+          <w:rFonts w:ascii="Segoe UI Emoji" w:hAnsi="Segoe UI Emoji" w:cs="Segoe UI Emoji"/>
+          <w:noProof/>
+        </w:rPr>
+        <w:t>👉</w:t>
+      </w:r>
+      <w:r>
+        <w:rPr>
+          <w:noProof/>
+        </w:rPr>
+        <w:t xml:space="preserve"> </w:t>
+      </w:r>
+      <w:r>
+        <w:rPr>
+          <w:i/>
+          <w:iCs/>
+          <w:noProof/>
+        </w:rPr>
+        <w:t>La IA no piensa, responde en función de cómo le preguntas</w:t>
+      </w:r>
+    </w:p>
+    <w:p>
+      <w:pPr>
+        <w:rPr>
+          <w:noProof/>
+        </w:rPr>
+      </w:pPr>
+      <w:r>
+        <w:rPr>
+          <w:noProof/>
+        </w:rPr>
+        <w:pict w14:anchorId="4FA86F0A">
+          <v:rect id="_x0000_i1055" style="width:0;height:1.5pt" o:hralign="center" o:hrstd="t" o:hr="t" fillcolor="#a0a0a0" stroked="f"/>
+        </w:pict>
+      </w:r>
+    </w:p>
+    <w:p>
+      <w:pPr>
+        <w:rPr>
+          <w:b/>
+          <w:bCs/>
+          <w:noProof/>
+        </w:rPr>
+      </w:pPr>
+      <w:r>
+        <w:rPr>
+          <w:rFonts w:ascii="Segoe UI Emoji" w:hAnsi="Segoe UI Emoji" w:cs="Segoe UI Emoji"/>
+          <w:b/>
+          <w:bCs/>
+          <w:noProof/>
+        </w:rPr>
+        <w:t>💡</w:t>
+      </w:r>
+      <w:r>
+        <w:rPr>
+          <w:b/>
+          <w:bCs/>
+          <w:noProof/>
+        </w:rPr>
+        <w:t xml:space="preserve"> MÓDULO 2. IA para generación de ideas (1.5 horas)</w:t>
+      </w:r>
+    </w:p>
+    <w:p>
+      <w:pPr>
+        <w:rPr>
+          <w:noProof/>
+        </w:rPr>
+      </w:pPr>
+      <w:r>
+        <w:rPr>
+          <w:rFonts w:ascii="Segoe UI Emoji" w:hAnsi="Segoe UI Emoji" w:cs="Segoe UI Emoji"/>
+          <w:noProof/>
+        </w:rPr>
+        <w:t>🎯</w:t>
+      </w:r>
+      <w:r>
+        <w:rPr>
+          <w:noProof/>
+        </w:rPr>
+        <w:t xml:space="preserve"> </w:t>
+      </w:r>
+      <w:r>
+        <w:rPr>
+          <w:i/>
+          <w:iCs/>
+          <w:noProof/>
+        </w:rPr>
+        <w:t>Objetivo:</w:t>
+      </w:r>
+      <w:r>
+        <w:rPr>
+          <w:noProof/>
+        </w:rPr>
+        <w:t xml:space="preserve"> Usar IA como herramienta de creatividad y planeación.</w:t>
+      </w:r>
+    </w:p>
+    <w:p>
+      <w:pPr>
+        <w:rPr>
+          <w:b/>
+          <w:bCs/>
+          <w:noProof/>
+        </w:rPr>
+      </w:pPr>
+      <w:r>
+        <w:rPr>
+          <w:b/>
+          <w:bCs/>
+          <w:noProof/>
+        </w:rPr>
+        <w:t>Contenido:</w:t>
       </w:r>
     </w:p>
     <w:p>
       <w:pPr>
         <w:numPr>
           <w:ilvl w:val="0"/>
-          <w:numId w:val="2"/>
+          <w:numId w:val="9"/>
         </w:numPr>
-      </w:pPr>
+        <w:rPr>
+          <w:noProof/>
+        </w:rPr>
+      </w:pPr>
+      <w:r>
+        <w:rPr>
+          <w:noProof/>
+        </w:rPr>
+        <w:t xml:space="preserve">Generación de ideas (negocio, contenido, proyectos) </w:t>
+      </w:r>
     </w:p>
     <w:p>
       <w:pPr>
         <w:numPr>
           <w:ilvl w:val="0"/>
-          <w:numId w:val="2"/>
+          <w:numId w:val="9"/>
         </w:numPr>
-      </w:pPr>
+        <w:rPr>
+          <w:noProof/>
+        </w:rPr>
+      </w:pPr>
+      <w:r>
+        <w:rPr>
+          <w:noProof/>
+        </w:rPr>
+        <w:t xml:space="preserve">Brainstorming estructurado con IA </w:t>
+      </w:r>
     </w:p>
     <w:p>
       <w:pPr>
         <w:numPr>
           <w:ilvl w:val="0"/>
-          <w:numId w:val="2"/>
+          <w:numId w:val="9"/>
         </w:numPr>
-      </w:pPr>
+        <w:rPr>
+          <w:noProof/>
+        </w:rPr>
+      </w:pPr>
+      <w:r>
+        <w:rPr>
+          <w:noProof/>
+        </w:rPr>
+        <w:t xml:space="preserve">Planeación de tareas y proyectos </w:t>
+      </w:r>
     </w:p>
     <w:p>
       <w:pPr>
         <w:numPr>
           <w:ilvl w:val="0"/>
-          <w:numId w:val="2"/>
+          <w:numId w:val="9"/>
         </w:numPr>
-      </w:pPr>
-    </w:p>
-    <w:p>
-      <w:r>
-        <w:drawing>
-          <wp:inline distT="0" distB="0" distL="0" distR="0" wp14:anchorId="3762C3CC" wp14:editId="2CB0E111">
-            <wp:extent cx="891540" cy="502920"/>
-            <wp:effectExtent l="0" t="0" r="3810" b="0"/>
-            <wp:docPr id="1524058401" name="Imagen 12" descr="IA para la investigación y la recopilación de información útil"/>
-            <wp:cNvGraphicFramePr>
-              <a:graphicFrameLocks xmlns:a="http://schemas.openxmlformats.org/drawingml/2006/main" noChangeAspect="1"/>
-            </wp:cNvGraphicFramePr>
-            <a:graphic xmlns:a="http://schemas.openxmlformats.org/drawingml/2006/main">
-              <a:graphicData uri="http://schemas.openxmlformats.org/drawingml/2006/picture">
-                <pic:pic xmlns:pic="http://schemas.openxmlformats.org/drawingml/2006/picture">
-                  <pic:nvPicPr>
-                    <pic:cNvPr id="0" name="Picture 38" descr="IA para la investigación y la recopilación de información útil"/>
-                    <pic:cNvPicPr>
-                      <a:picLocks noChangeAspect="1" noChangeArrowheads="1"/>
-                    </pic:cNvPicPr>
-                  </pic:nvPicPr>
-                  <pic:blipFill>
-                    <a:blip r:embed="rId9">
-                      <a:extLst>
-                        <a:ext uri="{28A0092B-C50C-407E-A947-70E740481C1C}">
-                          <a14:useLocalDpi xmlns:a14="http://schemas.microsoft.com/office/drawing/2010/main" val="0"/>
-                        </a:ext>
-                      </a:extLst>
-                    </a:blip>
-                    <a:srcRect/>
-                    <a:stretch>
-                      <a:fillRect/>
-                    </a:stretch>
-                  </pic:blipFill>
-                  <pic:spPr bwMode="auto">
-                    <a:xfrm>
-                      <a:off x="0" y="0"/>
-                      <a:ext cx="891540" cy="502920"/>
-                    </a:xfrm>
-                    <a:prstGeom prst="rect">
-                      <a:avLst/>
-                    </a:prstGeom>
-                    <a:noFill/>
-                    <a:ln>
-                      <a:noFill/>
-                    </a:ln>
-                  </pic:spPr>
-                </pic:pic>
-              </a:graphicData>
-            </a:graphic>
-          </wp:inline>
-        </w:drawing>
+        <w:rPr>
+          <w:noProof/>
+        </w:rPr>
+      </w:pPr>
+      <w:r>
+        <w:rPr>
+          <w:noProof/>
+        </w:rPr>
+        <w:t xml:space="preserve">Organización de ideas </w:t>
       </w:r>
     </w:p>
     <w:p>
@@ -283,112 +400,197 @@
         <w:rPr>
           <w:b/>
           <w:bCs/>
-        </w:rPr>
-      </w:pPr>
-      <w:hyperlink r:id="rId10" w:history="1">
-        <w:r>
-          <w:rPr>
-            <w:rStyle w:val="Hipervnculo"/>
-            <w:b/>
-            <w:bCs/>
-          </w:rPr>
-          <w:t>IA para la investigación y la recopilación de información útil</w:t>
-        </w:r>
-      </w:hyperlink>
-    </w:p>
-    <w:p>
-      <w:r>
-        <w:t>CURSO 3, 1 hora</w:t>
-      </w:r>
-    </w:p>
-    <w:p>
-      <w:r>
-        <w:t>CURSO 3•1 hora</w:t>
+          <w:noProof/>
+        </w:rPr>
+      </w:pPr>
+      <w:r>
+        <w:rPr>
+          <w:b/>
+          <w:bCs/>
+          <w:noProof/>
+        </w:rPr>
+        <w:t>Aplicación:</w:t>
+      </w:r>
+    </w:p>
+    <w:p>
+      <w:pPr>
+        <w:rPr>
+          <w:noProof/>
+        </w:rPr>
+      </w:pPr>
+      <w:r>
+        <w:rPr>
+          <w:rFonts w:ascii="Segoe UI Emoji" w:hAnsi="Segoe UI Emoji" w:cs="Segoe UI Emoji"/>
+          <w:noProof/>
+        </w:rPr>
+        <w:t>👉</w:t>
+      </w:r>
+      <w:r>
+        <w:rPr>
+          <w:noProof/>
+        </w:rPr>
+        <w:t xml:space="preserve"> Generar una idea de proyecto y estructurarla en pasos accionables</w:t>
+      </w:r>
+    </w:p>
+    <w:p>
+      <w:pPr>
+        <w:rPr>
+          <w:noProof/>
+        </w:rPr>
+      </w:pPr>
+      <w:r>
+        <w:rPr>
+          <w:noProof/>
+        </w:rPr>
+        <w:pict w14:anchorId="0BB8C3A1">
+          <v:rect id="_x0000_i1056" style="width:0;height:1.5pt" o:hralign="center" o:hrstd="t" o:hr="t" fillcolor="#a0a0a0" stroked="f"/>
+        </w:pict>
+      </w:r>
+    </w:p>
+    <w:p>
+      <w:pPr>
+        <w:rPr>
+          <w:b/>
+          <w:bCs/>
+          <w:noProof/>
+        </w:rPr>
+      </w:pPr>
+      <w:r>
+        <w:rPr>
+          <w:rFonts w:ascii="Segoe UI Emoji" w:hAnsi="Segoe UI Emoji" w:cs="Segoe UI Emoji"/>
+          <w:b/>
+          <w:bCs/>
+          <w:noProof/>
+        </w:rPr>
+        <w:t>🔍</w:t>
+      </w:r>
+      <w:r>
+        <w:rPr>
+          <w:b/>
+          <w:bCs/>
+          <w:noProof/>
+        </w:rPr>
+        <w:t xml:space="preserve"> MÓDULO 3. IA para investigación (1 hora)</w:t>
+      </w:r>
+    </w:p>
+    <w:p>
+      <w:pPr>
+        <w:rPr>
+          <w:noProof/>
+        </w:rPr>
+      </w:pPr>
+      <w:r>
+        <w:rPr>
+          <w:rFonts w:ascii="Segoe UI Emoji" w:hAnsi="Segoe UI Emoji" w:cs="Segoe UI Emoji"/>
+          <w:noProof/>
+        </w:rPr>
+        <w:t>🎯</w:t>
+      </w:r>
+      <w:r>
+        <w:rPr>
+          <w:noProof/>
+        </w:rPr>
+        <w:t xml:space="preserve"> </w:t>
+      </w:r>
+      <w:r>
+        <w:rPr>
+          <w:i/>
+          <w:iCs/>
+          <w:noProof/>
+        </w:rPr>
+        <w:t>Objetivo:</w:t>
+      </w:r>
+      <w:r>
+        <w:rPr>
+          <w:noProof/>
+        </w:rPr>
+        <w:t xml:space="preserve"> Aprender a usar IA para buscar, analizar y sintetizar información.</w:t>
+      </w:r>
+    </w:p>
+    <w:p>
+      <w:pPr>
+        <w:rPr>
+          <w:b/>
+          <w:bCs/>
+          <w:noProof/>
+        </w:rPr>
+      </w:pPr>
+      <w:r>
+        <w:rPr>
+          <w:b/>
+          <w:bCs/>
+          <w:noProof/>
+        </w:rPr>
+        <w:t>Contenido:</w:t>
       </w:r>
     </w:p>
     <w:p>
       <w:pPr>
         <w:numPr>
           <w:ilvl w:val="0"/>
-          <w:numId w:val="3"/>
+          <w:numId w:val="10"/>
         </w:numPr>
-      </w:pPr>
+        <w:rPr>
+          <w:noProof/>
+        </w:rPr>
+      </w:pPr>
+      <w:r>
+        <w:rPr>
+          <w:noProof/>
+        </w:rPr>
+        <w:t xml:space="preserve">Búsqueda inteligente (más allá de Google) </w:t>
+      </w:r>
     </w:p>
     <w:p>
       <w:pPr>
         <w:numPr>
           <w:ilvl w:val="0"/>
-          <w:numId w:val="3"/>
+          <w:numId w:val="10"/>
         </w:numPr>
-      </w:pPr>
+        <w:rPr>
+          <w:noProof/>
+        </w:rPr>
+      </w:pPr>
+      <w:r>
+        <w:rPr>
+          <w:noProof/>
+        </w:rPr>
+        <w:t xml:space="preserve">Resúmenes y síntesis </w:t>
+      </w:r>
     </w:p>
     <w:p>
       <w:pPr>
         <w:numPr>
           <w:ilvl w:val="0"/>
-          <w:numId w:val="3"/>
+          <w:numId w:val="10"/>
         </w:numPr>
-      </w:pPr>
+        <w:rPr>
+          <w:noProof/>
+        </w:rPr>
+      </w:pPr>
+      <w:r>
+        <w:rPr>
+          <w:noProof/>
+        </w:rPr>
+        <w:t xml:space="preserve">Comparación de fuentes </w:t>
+      </w:r>
     </w:p>
     <w:p>
       <w:pPr>
         <w:numPr>
           <w:ilvl w:val="0"/>
-          <w:numId w:val="3"/>
+          <w:numId w:val="10"/>
         </w:numPr>
-      </w:pPr>
-    </w:p>
-    <w:p>
-      <w:r>
+        <w:rPr>
+          <w:noProof/>
+        </w:rPr>
+      </w:pPr>
+      <w:r>
+        <w:rPr>
+          <w:noProof/>
+        </w:rPr>
         <w:lastRenderedPageBreak/>
-        <w:drawing>
-          <wp:inline distT="0" distB="0" distL="0" distR="0" wp14:anchorId="62FE286C" wp14:editId="2A963247">
-            <wp:extent cx="891540" cy="502920"/>
-            <wp:effectExtent l="0" t="0" r="3810" b="0"/>
-            <wp:docPr id="1457917343" name="Imagen 11" descr="IA para la escritura y la comunicación"/>
-            <wp:cNvGraphicFramePr>
-              <a:graphicFrameLocks xmlns:a="http://schemas.openxmlformats.org/drawingml/2006/main" noChangeAspect="1"/>
-            </wp:cNvGraphicFramePr>
-            <a:graphic xmlns:a="http://schemas.openxmlformats.org/drawingml/2006/main">
-              <a:graphicData uri="http://schemas.openxmlformats.org/drawingml/2006/picture">
-                <pic:pic xmlns:pic="http://schemas.openxmlformats.org/drawingml/2006/picture">
-                  <pic:nvPicPr>
-                    <pic:cNvPr id="0" name="Picture 39" descr="IA para la escritura y la comunicación"/>
-                    <pic:cNvPicPr>
-                      <a:picLocks noChangeAspect="1" noChangeArrowheads="1"/>
-                    </pic:cNvPicPr>
-                  </pic:nvPicPr>
-                  <pic:blipFill>
-                    <a:blip r:embed="rId11">
-                      <a:extLst>
-                        <a:ext uri="{28A0092B-C50C-407E-A947-70E740481C1C}">
-                          <a14:useLocalDpi xmlns:a14="http://schemas.microsoft.com/office/drawing/2010/main" val="0"/>
-                        </a:ext>
-                      </a:extLst>
-                    </a:blip>
-                    <a:srcRect/>
-                    <a:stretch>
-                      <a:fillRect/>
-                    </a:stretch>
-                  </pic:blipFill>
-                  <pic:spPr bwMode="auto">
-                    <a:xfrm>
-                      <a:off x="0" y="0"/>
-                      <a:ext cx="891540" cy="502920"/>
-                    </a:xfrm>
-                    <a:prstGeom prst="rect">
-                      <a:avLst/>
-                    </a:prstGeom>
-                    <a:noFill/>
-                    <a:ln>
-                      <a:noFill/>
-                    </a:ln>
-                  </pic:spPr>
-                </pic:pic>
-              </a:graphicData>
-            </a:graphic>
-          </wp:inline>
-        </w:drawing>
+        <w:t xml:space="preserve">Validación de información (evitar errores de IA) </w:t>
       </w:r>
     </w:p>
     <w:p>
@@ -396,111 +598,204 @@
         <w:rPr>
           <w:b/>
           <w:bCs/>
-        </w:rPr>
-      </w:pPr>
-      <w:hyperlink r:id="rId12" w:history="1">
-        <w:r>
-          <w:rPr>
-            <w:rStyle w:val="Hipervnculo"/>
-            <w:b/>
-            <w:bCs/>
-          </w:rPr>
-          <w:t>IA para la escritura y la comunicación</w:t>
-        </w:r>
-      </w:hyperlink>
-    </w:p>
-    <w:p>
-      <w:r>
-        <w:t>CURSO 4, 1 hora</w:t>
-      </w:r>
-    </w:p>
-    <w:p>
-      <w:r>
-        <w:t>CURSO 4•1 hora</w:t>
+          <w:noProof/>
+        </w:rPr>
+      </w:pPr>
+      <w:r>
+        <w:rPr>
+          <w:b/>
+          <w:bCs/>
+          <w:noProof/>
+        </w:rPr>
+        <w:t>Insight clave:</w:t>
+      </w:r>
+    </w:p>
+    <w:p>
+      <w:pPr>
+        <w:rPr>
+          <w:noProof/>
+        </w:rPr>
+      </w:pPr>
+      <w:r>
+        <w:rPr>
+          <w:rFonts w:ascii="Segoe UI Emoji" w:hAnsi="Segoe UI Emoji" w:cs="Segoe UI Emoji"/>
+          <w:noProof/>
+        </w:rPr>
+        <w:t>👉</w:t>
+      </w:r>
+      <w:r>
+        <w:rPr>
+          <w:noProof/>
+        </w:rPr>
+        <w:t xml:space="preserve"> </w:t>
+      </w:r>
+      <w:r>
+        <w:rPr>
+          <w:i/>
+          <w:iCs/>
+          <w:noProof/>
+        </w:rPr>
+        <w:t>La IA acelera la investigación, pero no sustituye el criterio</w:t>
+      </w:r>
+    </w:p>
+    <w:p>
+      <w:pPr>
+        <w:rPr>
+          <w:noProof/>
+        </w:rPr>
+      </w:pPr>
+      <w:r>
+        <w:rPr>
+          <w:noProof/>
+        </w:rPr>
+        <w:pict w14:anchorId="4A35A7AB">
+          <v:rect id="_x0000_i1057" style="width:0;height:1.5pt" o:hralign="center" o:hrstd="t" o:hr="t" fillcolor="#a0a0a0" stroked="f"/>
+        </w:pict>
+      </w:r>
+    </w:p>
+    <w:p>
+      <w:pPr>
+        <w:rPr>
+          <w:b/>
+          <w:bCs/>
+          <w:noProof/>
+        </w:rPr>
+      </w:pPr>
+      <w:r>
+        <w:rPr>
+          <w:rFonts w:ascii="Segoe UI Emoji" w:hAnsi="Segoe UI Emoji" w:cs="Segoe UI Emoji"/>
+          <w:b/>
+          <w:bCs/>
+          <w:noProof/>
+        </w:rPr>
+        <w:t>✍️</w:t>
+      </w:r>
+      <w:r>
+        <w:rPr>
+          <w:b/>
+          <w:bCs/>
+          <w:noProof/>
+        </w:rPr>
+        <w:t xml:space="preserve"> MÓDULO 4. IA para escritura y comunicación (1.5 horas)</w:t>
+      </w:r>
+    </w:p>
+    <w:p>
+      <w:pPr>
+        <w:rPr>
+          <w:noProof/>
+        </w:rPr>
+      </w:pPr>
+      <w:r>
+        <w:rPr>
+          <w:rFonts w:ascii="Segoe UI Emoji" w:hAnsi="Segoe UI Emoji" w:cs="Segoe UI Emoji"/>
+          <w:noProof/>
+        </w:rPr>
+        <w:t>🎯</w:t>
+      </w:r>
+      <w:r>
+        <w:rPr>
+          <w:noProof/>
+        </w:rPr>
+        <w:t xml:space="preserve"> </w:t>
+      </w:r>
+      <w:r>
+        <w:rPr>
+          <w:i/>
+          <w:iCs/>
+          <w:noProof/>
+        </w:rPr>
+        <w:t>Objetivo:</w:t>
+      </w:r>
+      <w:r>
+        <w:rPr>
+          <w:noProof/>
+        </w:rPr>
+        <w:t xml:space="preserve"> Mejorar la comunicación profesional usando IA.</w:t>
+      </w:r>
+    </w:p>
+    <w:p>
+      <w:pPr>
+        <w:rPr>
+          <w:b/>
+          <w:bCs/>
+          <w:noProof/>
+        </w:rPr>
+      </w:pPr>
+      <w:r>
+        <w:rPr>
+          <w:b/>
+          <w:bCs/>
+          <w:noProof/>
+        </w:rPr>
+        <w:t>Contenido:</w:t>
       </w:r>
     </w:p>
     <w:p>
       <w:pPr>
         <w:numPr>
           <w:ilvl w:val="0"/>
-          <w:numId w:val="4"/>
+          <w:numId w:val="11"/>
         </w:numPr>
-      </w:pPr>
+        <w:rPr>
+          <w:noProof/>
+        </w:rPr>
+      </w:pPr>
+      <w:r>
+        <w:rPr>
+          <w:noProof/>
+        </w:rPr>
+        <w:t xml:space="preserve">Redacción de correos profesionales </w:t>
+      </w:r>
     </w:p>
     <w:p>
       <w:pPr>
         <w:numPr>
           <w:ilvl w:val="0"/>
-          <w:numId w:val="4"/>
+          <w:numId w:val="11"/>
         </w:numPr>
-      </w:pPr>
+        <w:rPr>
+          <w:noProof/>
+        </w:rPr>
+      </w:pPr>
+      <w:r>
+        <w:rPr>
+          <w:noProof/>
+        </w:rPr>
+        <w:t xml:space="preserve">Creación de reportes </w:t>
+      </w:r>
     </w:p>
     <w:p>
       <w:pPr>
         <w:numPr>
           <w:ilvl w:val="0"/>
-          <w:numId w:val="4"/>
+          <w:numId w:val="11"/>
         </w:numPr>
-      </w:pPr>
+        <w:rPr>
+          <w:noProof/>
+        </w:rPr>
+      </w:pPr>
+      <w:r>
+        <w:rPr>
+          <w:noProof/>
+        </w:rPr>
+        <w:t xml:space="preserve">Adaptación de tono (formal, ejecutivo, casual) </w:t>
+      </w:r>
     </w:p>
     <w:p>
       <w:pPr>
         <w:numPr>
           <w:ilvl w:val="0"/>
-          <w:numId w:val="4"/>
+          <w:numId w:val="11"/>
         </w:numPr>
-      </w:pPr>
-    </w:p>
-    <w:p>
-      <w:r>
-        <w:drawing>
-          <wp:inline distT="0" distB="0" distL="0" distR="0" wp14:anchorId="4B61A3BB" wp14:editId="31F6B5FC">
-            <wp:extent cx="891540" cy="502920"/>
-            <wp:effectExtent l="0" t="0" r="3810" b="0"/>
-            <wp:docPr id="1058403730" name="Imagen 10" descr="IA para la creación de contenido"/>
-            <wp:cNvGraphicFramePr>
-              <a:graphicFrameLocks xmlns:a="http://schemas.openxmlformats.org/drawingml/2006/main" noChangeAspect="1"/>
-            </wp:cNvGraphicFramePr>
-            <a:graphic xmlns:a="http://schemas.openxmlformats.org/drawingml/2006/main">
-              <a:graphicData uri="http://schemas.openxmlformats.org/drawingml/2006/picture">
-                <pic:pic xmlns:pic="http://schemas.openxmlformats.org/drawingml/2006/picture">
-                  <pic:nvPicPr>
-                    <pic:cNvPr id="0" name="Picture 40" descr="IA para la creación de contenido"/>
-                    <pic:cNvPicPr>
-                      <a:picLocks noChangeAspect="1" noChangeArrowheads="1"/>
-                    </pic:cNvPicPr>
-                  </pic:nvPicPr>
-                  <pic:blipFill>
-                    <a:blip r:embed="rId13">
-                      <a:extLst>
-                        <a:ext uri="{28A0092B-C50C-407E-A947-70E740481C1C}">
-                          <a14:useLocalDpi xmlns:a14="http://schemas.microsoft.com/office/drawing/2010/main" val="0"/>
-                        </a:ext>
-                      </a:extLst>
-                    </a:blip>
-                    <a:srcRect/>
-                    <a:stretch>
-                      <a:fillRect/>
-                    </a:stretch>
-                  </pic:blipFill>
-                  <pic:spPr bwMode="auto">
-                    <a:xfrm>
-                      <a:off x="0" y="0"/>
-                      <a:ext cx="891540" cy="502920"/>
-                    </a:xfrm>
-                    <a:prstGeom prst="rect">
-                      <a:avLst/>
-                    </a:prstGeom>
-                    <a:noFill/>
-                    <a:ln>
-                      <a:noFill/>
-                    </a:ln>
-                  </pic:spPr>
-                </pic:pic>
-              </a:graphicData>
-            </a:graphic>
-          </wp:inline>
-        </w:drawing>
+        <w:rPr>
+          <w:noProof/>
+        </w:rPr>
+      </w:pPr>
+      <w:r>
+        <w:rPr>
+          <w:noProof/>
+        </w:rPr>
+        <w:t xml:space="preserve">Claridad y estructura en textos </w:t>
       </w:r>
     </w:p>
     <w:p>
@@ -508,111 +803,193 @@
         <w:rPr>
           <w:b/>
           <w:bCs/>
-        </w:rPr>
-      </w:pPr>
-      <w:hyperlink r:id="rId14" w:history="1">
-        <w:r>
-          <w:rPr>
-            <w:rStyle w:val="Hipervnculo"/>
-            <w:b/>
-            <w:bCs/>
-          </w:rPr>
-          <w:t>IA para la creación de contenido</w:t>
-        </w:r>
-      </w:hyperlink>
-    </w:p>
-    <w:p>
-      <w:r>
-        <w:t>CURSO 5, 2 horas</w:t>
-      </w:r>
-    </w:p>
-    <w:p>
-      <w:r>
-        <w:t>CURSO 5•2 horas</w:t>
+          <w:noProof/>
+        </w:rPr>
+      </w:pPr>
+      <w:r>
+        <w:rPr>
+          <w:b/>
+          <w:bCs/>
+          <w:noProof/>
+        </w:rPr>
+        <w:t>Aplicación:</w:t>
+      </w:r>
+    </w:p>
+    <w:p>
+      <w:pPr>
+        <w:rPr>
+          <w:noProof/>
+        </w:rPr>
+      </w:pPr>
+      <w:r>
+        <w:rPr>
+          <w:rFonts w:ascii="Segoe UI Emoji" w:hAnsi="Segoe UI Emoji" w:cs="Segoe UI Emoji"/>
+          <w:noProof/>
+        </w:rPr>
+        <w:t>👉</w:t>
+      </w:r>
+      <w:r>
+        <w:rPr>
+          <w:noProof/>
+        </w:rPr>
+        <w:t xml:space="preserve"> Transformar un texto básico en uno profesional usando IA</w:t>
+      </w:r>
+    </w:p>
+    <w:p>
+      <w:pPr>
+        <w:rPr>
+          <w:noProof/>
+        </w:rPr>
+      </w:pPr>
+      <w:r>
+        <w:rPr>
+          <w:noProof/>
+        </w:rPr>
+        <w:pict w14:anchorId="076E1D19">
+          <v:rect id="_x0000_i1058" style="width:0;height:1.5pt" o:hralign="center" o:hrstd="t" o:hr="t" fillcolor="#a0a0a0" stroked="f"/>
+        </w:pict>
+      </w:r>
+    </w:p>
+    <w:p>
+      <w:pPr>
+        <w:rPr>
+          <w:b/>
+          <w:bCs/>
+          <w:noProof/>
+        </w:rPr>
+      </w:pPr>
+      <w:r>
+        <w:rPr>
+          <w:rFonts w:ascii="Segoe UI Emoji" w:hAnsi="Segoe UI Emoji" w:cs="Segoe UI Emoji"/>
+          <w:b/>
+          <w:bCs/>
+          <w:noProof/>
+        </w:rPr>
+        <w:t>🔷</w:t>
+      </w:r>
+      <w:r>
+        <w:rPr>
+          <w:b/>
+          <w:bCs/>
+          <w:noProof/>
+        </w:rPr>
+        <w:t xml:space="preserve"> Lógica del curso (esto es lo importante)</w:t>
+      </w:r>
+    </w:p>
+    <w:p>
+      <w:pPr>
+        <w:rPr>
+          <w:noProof/>
+        </w:rPr>
+      </w:pPr>
+      <w:r>
+        <w:rPr>
+          <w:noProof/>
+        </w:rPr>
+        <w:t>Este flujo está bien armado porque sigue esta progresión:</w:t>
       </w:r>
     </w:p>
     <w:p>
       <w:pPr>
         <w:numPr>
           <w:ilvl w:val="0"/>
-          <w:numId w:val="5"/>
+          <w:numId w:val="12"/>
         </w:numPr>
-      </w:pPr>
+        <w:rPr>
+          <w:noProof/>
+        </w:rPr>
+      </w:pPr>
+      <w:r>
+        <w:rPr>
+          <w:noProof/>
+        </w:rPr>
+        <w:t xml:space="preserve">Entiendes la IA </w:t>
+      </w:r>
     </w:p>
     <w:p>
       <w:pPr>
         <w:numPr>
           <w:ilvl w:val="0"/>
-          <w:numId w:val="5"/>
+          <w:numId w:val="12"/>
         </w:numPr>
-      </w:pPr>
+        <w:rPr>
+          <w:noProof/>
+        </w:rPr>
+      </w:pPr>
+      <w:r>
+        <w:rPr>
+          <w:noProof/>
+        </w:rPr>
+        <w:t xml:space="preserve">La usas para pensar </w:t>
+      </w:r>
     </w:p>
     <w:p>
       <w:pPr>
         <w:numPr>
           <w:ilvl w:val="0"/>
-          <w:numId w:val="5"/>
+          <w:numId w:val="12"/>
         </w:numPr>
-      </w:pPr>
+        <w:rPr>
+          <w:noProof/>
+        </w:rPr>
+      </w:pPr>
+      <w:r>
+        <w:rPr>
+          <w:noProof/>
+        </w:rPr>
+        <w:t xml:space="preserve">La usas para investigar </w:t>
+      </w:r>
     </w:p>
     <w:p>
       <w:pPr>
         <w:numPr>
           <w:ilvl w:val="0"/>
-          <w:numId w:val="5"/>
+          <w:numId w:val="12"/>
         </w:numPr>
-      </w:pPr>
-    </w:p>
-    <w:p>
-      <w:r>
-        <w:drawing>
-          <wp:inline distT="0" distB="0" distL="0" distR="0" wp14:anchorId="7BD3175E" wp14:editId="51098FC0">
-            <wp:extent cx="891540" cy="502920"/>
-            <wp:effectExtent l="0" t="0" r="3810" b="0"/>
-            <wp:docPr id="1517647197" name="Imagen 9" descr="IA para el análisis de datos"/>
-            <wp:cNvGraphicFramePr>
-              <a:graphicFrameLocks xmlns:a="http://schemas.openxmlformats.org/drawingml/2006/main" noChangeAspect="1"/>
-            </wp:cNvGraphicFramePr>
-            <a:graphic xmlns:a="http://schemas.openxmlformats.org/drawingml/2006/main">
-              <a:graphicData uri="http://schemas.openxmlformats.org/drawingml/2006/picture">
-                <pic:pic xmlns:pic="http://schemas.openxmlformats.org/drawingml/2006/picture">
-                  <pic:nvPicPr>
-                    <pic:cNvPr id="0" name="Picture 41" descr="IA para el análisis de datos"/>
-                    <pic:cNvPicPr>
-                      <a:picLocks noChangeAspect="1" noChangeArrowheads="1"/>
-                    </pic:cNvPicPr>
-                  </pic:nvPicPr>
-                  <pic:blipFill>
-                    <a:blip r:embed="rId15">
-                      <a:extLst>
-                        <a:ext uri="{28A0092B-C50C-407E-A947-70E740481C1C}">
-                          <a14:useLocalDpi xmlns:a14="http://schemas.microsoft.com/office/drawing/2010/main" val="0"/>
-                        </a:ext>
-                      </a:extLst>
-                    </a:blip>
-                    <a:srcRect/>
-                    <a:stretch>
-                      <a:fillRect/>
-                    </a:stretch>
-                  </pic:blipFill>
-                  <pic:spPr bwMode="auto">
-                    <a:xfrm>
-                      <a:off x="0" y="0"/>
-                      <a:ext cx="891540" cy="502920"/>
-                    </a:xfrm>
-                    <a:prstGeom prst="rect">
-                      <a:avLst/>
-                    </a:prstGeom>
-                    <a:noFill/>
-                    <a:ln>
-                      <a:noFill/>
-                    </a:ln>
-                  </pic:spPr>
-                </pic:pic>
-              </a:graphicData>
-            </a:graphic>
-          </wp:inline>
-        </w:drawing>
+        <w:rPr>
+          <w:noProof/>
+        </w:rPr>
+      </w:pPr>
+      <w:r>
+        <w:rPr>
+          <w:noProof/>
+        </w:rPr>
+        <w:t xml:space="preserve">La usas para comunicar </w:t>
+      </w:r>
+    </w:p>
+    <w:p>
+      <w:pPr>
+        <w:rPr>
+          <w:noProof/>
+        </w:rPr>
+      </w:pPr>
+      <w:r>
+        <w:rPr>
+          <w:rFonts w:ascii="Segoe UI Emoji" w:hAnsi="Segoe UI Emoji" w:cs="Segoe UI Emoji"/>
+          <w:noProof/>
+        </w:rPr>
+        <w:t>👉</w:t>
+      </w:r>
+      <w:r>
+        <w:rPr>
+          <w:noProof/>
+        </w:rPr>
+        <w:t xml:space="preserve"> Es exactamente como se usa en el trabajo real</w:t>
+      </w:r>
+    </w:p>
+    <w:p>
+      <w:pPr>
+        <w:rPr>
+          <w:noProof/>
+        </w:rPr>
+      </w:pPr>
+      <w:r>
+        <w:rPr>
+          <w:noProof/>
+        </w:rPr>
+        <w:pict w14:anchorId="265EF09F">
+          <v:rect id="_x0000_i1059" style="width:0;height:1.5pt" o:hralign="center" o:hrstd="t" o:hr="t" fillcolor="#a0a0a0" stroked="f"/>
+        </w:pict>
       </w:r>
     </w:p>
     <w:p>
@@ -620,192 +997,106 @@
         <w:rPr>
           <w:b/>
           <w:bCs/>
-        </w:rPr>
-      </w:pPr>
-      <w:hyperlink r:id="rId16" w:history="1">
-        <w:r>
-          <w:rPr>
-            <w:rStyle w:val="Hipervnculo"/>
-            <w:b/>
-            <w:bCs/>
-          </w:rPr>
-          <w:t>IA para el análisis de datos</w:t>
-        </w:r>
-      </w:hyperlink>
-    </w:p>
-    <w:p>
-      <w:r>
-        <w:t>CURSO 6, 1 hora</w:t>
-      </w:r>
-    </w:p>
-    <w:p>
-      <w:r>
-        <w:t>CURSO 6•1 hora</w:t>
+          <w:noProof/>
+        </w:rPr>
+      </w:pPr>
+      <w:r>
+        <w:rPr>
+          <w:rFonts w:ascii="Segoe UI Emoji" w:hAnsi="Segoe UI Emoji" w:cs="Segoe UI Emoji"/>
+          <w:b/>
+          <w:bCs/>
+          <w:noProof/>
+        </w:rPr>
+        <w:t>🔷</w:t>
+      </w:r>
+      <w:r>
+        <w:rPr>
+          <w:b/>
+          <w:bCs/>
+          <w:noProof/>
+        </w:rPr>
+        <w:t xml:space="preserve"> Resultado final del alumno</w:t>
+      </w:r>
+    </w:p>
+    <w:p>
+      <w:pPr>
+        <w:rPr>
+          <w:noProof/>
+        </w:rPr>
+      </w:pPr>
+      <w:r>
+        <w:rPr>
+          <w:noProof/>
+        </w:rPr>
+        <w:t>Al terminar el curso, la persona podrá:</w:t>
       </w:r>
     </w:p>
     <w:p>
       <w:pPr>
         <w:numPr>
           <w:ilvl w:val="0"/>
-          <w:numId w:val="6"/>
+          <w:numId w:val="13"/>
         </w:numPr>
-      </w:pPr>
+        <w:rPr>
+          <w:noProof/>
+        </w:rPr>
+      </w:pPr>
+      <w:r>
+        <w:rPr>
+          <w:noProof/>
+        </w:rPr>
+        <w:t xml:space="preserve">Entender cómo funciona la IA (sin tecnicismos) </w:t>
+      </w:r>
     </w:p>
     <w:p>
       <w:pPr>
         <w:numPr>
           <w:ilvl w:val="0"/>
-          <w:numId w:val="6"/>
+          <w:numId w:val="13"/>
         </w:numPr>
-      </w:pPr>
+        <w:rPr>
+          <w:noProof/>
+        </w:rPr>
+      </w:pPr>
+      <w:r>
+        <w:rPr>
+          <w:noProof/>
+        </w:rPr>
+        <w:t xml:space="preserve">Generar ideas y estructurarlas </w:t>
+      </w:r>
     </w:p>
     <w:p>
       <w:pPr>
         <w:numPr>
           <w:ilvl w:val="0"/>
-          <w:numId w:val="6"/>
+          <w:numId w:val="13"/>
         </w:numPr>
-      </w:pPr>
+        <w:rPr>
+          <w:noProof/>
+        </w:rPr>
+      </w:pPr>
+      <w:r>
+        <w:rPr>
+          <w:noProof/>
+        </w:rPr>
+        <w:t xml:space="preserve">Investigar más rápido y mejor </w:t>
+      </w:r>
     </w:p>
     <w:p>
       <w:pPr>
         <w:numPr>
           <w:ilvl w:val="0"/>
-          <w:numId w:val="6"/>
+          <w:numId w:val="13"/>
         </w:numPr>
-      </w:pPr>
-    </w:p>
-    <w:p>
-      <w:r>
-        <w:lastRenderedPageBreak/>
-        <w:drawing>
-          <wp:inline distT="0" distB="0" distL="0" distR="0" wp14:anchorId="6C347A91" wp14:editId="6E550643">
-            <wp:extent cx="891540" cy="502920"/>
-            <wp:effectExtent l="0" t="0" r="3810" b="0"/>
-            <wp:docPr id="381016791" name="Imagen 8" descr="IA para la creación de apps"/>
-            <wp:cNvGraphicFramePr>
-              <a:graphicFrameLocks xmlns:a="http://schemas.openxmlformats.org/drawingml/2006/main" noChangeAspect="1"/>
-            </wp:cNvGraphicFramePr>
-            <a:graphic xmlns:a="http://schemas.openxmlformats.org/drawingml/2006/main">
-              <a:graphicData uri="http://schemas.openxmlformats.org/drawingml/2006/picture">
-                <pic:pic xmlns:pic="http://schemas.openxmlformats.org/drawingml/2006/picture">
-                  <pic:nvPicPr>
-                    <pic:cNvPr id="0" name="Picture 42" descr="IA para la creación de apps"/>
-                    <pic:cNvPicPr>
-                      <a:picLocks noChangeAspect="1" noChangeArrowheads="1"/>
-                    </pic:cNvPicPr>
-                  </pic:nvPicPr>
-                  <pic:blipFill>
-                    <a:blip r:embed="rId17">
-                      <a:extLst>
-                        <a:ext uri="{28A0092B-C50C-407E-A947-70E740481C1C}">
-                          <a14:useLocalDpi xmlns:a14="http://schemas.microsoft.com/office/drawing/2010/main" val="0"/>
-                        </a:ext>
-                      </a:extLst>
-                    </a:blip>
-                    <a:srcRect/>
-                    <a:stretch>
-                      <a:fillRect/>
-                    </a:stretch>
-                  </pic:blipFill>
-                  <pic:spPr bwMode="auto">
-                    <a:xfrm>
-                      <a:off x="0" y="0"/>
-                      <a:ext cx="891540" cy="502920"/>
-                    </a:xfrm>
-                    <a:prstGeom prst="rect">
-                      <a:avLst/>
-                    </a:prstGeom>
-                    <a:noFill/>
-                    <a:ln>
-                      <a:noFill/>
-                    </a:ln>
-                  </pic:spPr>
-                </pic:pic>
-              </a:graphicData>
-            </a:graphic>
-          </wp:inline>
-        </w:drawing>
-      </w:r>
-    </w:p>
-    <w:p>
-      <w:pPr>
-        <w:rPr>
-          <w:b/>
-          <w:bCs/>
-        </w:rPr>
-      </w:pPr>
-      <w:hyperlink r:id="rId18" w:history="1">
-        <w:r>
-          <w:rPr>
-            <w:rStyle w:val="Hipervnculo"/>
-            <w:b/>
-            <w:bCs/>
-          </w:rPr>
-          <w:t>IA para la creación de apps</w:t>
-        </w:r>
-      </w:hyperlink>
-    </w:p>
-    <w:p>
-      <w:r>
-        <w:t>CURSO 7, 2 horas</w:t>
-      </w:r>
-    </w:p>
-    <w:p>
-      <w:r>
-        <w:t>CURSO 7•2 horas</w:t>
-      </w:r>
-    </w:p>
-    <w:p>
-      <w:pPr>
-        <w:numPr>
-          <w:ilvl w:val="0"/>
-          <w:numId w:val="7"/>
-        </w:numPr>
-      </w:pPr>
-    </w:p>
-    <w:p>
-      <w:pPr>
-        <w:numPr>
-          <w:ilvl w:val="0"/>
-          <w:numId w:val="7"/>
-        </w:numPr>
-      </w:pPr>
-    </w:p>
-    <w:p>
-      <w:pPr>
-        <w:numPr>
-          <w:ilvl w:val="0"/>
-          <w:numId w:val="7"/>
-        </w:numPr>
-      </w:pPr>
-    </w:p>
-    <w:p>
-      <w:pPr>
-        <w:numPr>
-          <w:ilvl w:val="0"/>
-          <w:numId w:val="7"/>
-        </w:numPr>
-      </w:pPr>
-    </w:p>
-    <w:p>
-      <w:pPr>
-        <w:rPr>
-          <w:b/>
-          <w:bCs/>
-        </w:rPr>
-      </w:pPr>
-      <w:r>
-        <w:rPr>
-          <w:b/>
-          <w:bCs/>
-        </w:rPr>
-        <w:t>Obtén un certificado profesional</w:t>
-      </w:r>
-    </w:p>
-    <w:p>
-      <w:r>
-        <w:t>Agregue esta credencial a su perfil de LinkedIn, currículum o CV. Compártala en redes sociales y en su evaluac</w:t>
+        <w:rPr>
+          <w:noProof/>
+        </w:rPr>
+      </w:pPr>
+      <w:r>
+        <w:rPr>
+          <w:noProof/>
+        </w:rPr>
+        <w:t>Comunicar información de forma clara y profesional</w:t>
       </w:r>
     </w:p>
     <w:p/>
@@ -971,6 +1262,155 @@
     </w:lvl>
   </w:abstractNum>
   <w:abstractNum w:abstractNumId="1" w15:restartNumberingAfterBreak="0">
+    <w:nsid w:val="0F3222AE"/>
+    <w:multiLevelType w:val="multilevel"/>
+    <w:tmpl w:val="3394FE0E"/>
+    <w:lvl w:ilvl="0">
+      <w:start w:val="1"/>
+      <w:numFmt w:val="bullet"/>
+      <w:lvlText w:val=""/>
+      <w:lvlJc w:val="left"/>
+      <w:pPr>
+        <w:tabs>
+          <w:tab w:val="num" w:pos="720"/>
+        </w:tabs>
+        <w:ind w:left="720" w:hanging="360"/>
+      </w:pPr>
+      <w:rPr>
+        <w:rFonts w:ascii="Symbol" w:hAnsi="Symbol" w:hint="default"/>
+        <w:sz w:val="20"/>
+      </w:rPr>
+    </w:lvl>
+    <w:lvl w:ilvl="1" w:tentative="1">
+      <w:start w:val="1"/>
+      <w:numFmt w:val="bullet"/>
+      <w:lvlText w:val="o"/>
+      <w:lvlJc w:val="left"/>
+      <w:pPr>
+        <w:tabs>
+          <w:tab w:val="num" w:pos="1440"/>
+        </w:tabs>
+        <w:ind w:left="1440" w:hanging="360"/>
+      </w:pPr>
+      <w:rPr>
+        <w:rFonts w:ascii="Courier New" w:hAnsi="Courier New" w:hint="default"/>
+        <w:sz w:val="20"/>
+      </w:rPr>
+    </w:lvl>
+    <w:lvl w:ilvl="2" w:tentative="1">
+      <w:start w:val="1"/>
+      <w:numFmt w:val="bullet"/>
+      <w:lvlText w:val=""/>
+      <w:lvlJc w:val="left"/>
+      <w:pPr>
+        <w:tabs>
+          <w:tab w:val="num" w:pos="2160"/>
+        </w:tabs>
+        <w:ind w:left="2160" w:hanging="360"/>
+      </w:pPr>
+      <w:rPr>
+        <w:rFonts w:ascii="Wingdings" w:hAnsi="Wingdings" w:hint="default"/>
+        <w:sz w:val="20"/>
+      </w:rPr>
+    </w:lvl>
+    <w:lvl w:ilvl="3" w:tentative="1">
+      <w:start w:val="1"/>
+      <w:numFmt w:val="bullet"/>
+      <w:lvlText w:val=""/>
+      <w:lvlJc w:val="left"/>
+      <w:pPr>
+        <w:tabs>
+          <w:tab w:val="num" w:pos="2880"/>
+        </w:tabs>
+        <w:ind w:left="2880" w:hanging="360"/>
+      </w:pPr>
+      <w:rPr>
+        <w:rFonts w:ascii="Wingdings" w:hAnsi="Wingdings" w:hint="default"/>
+        <w:sz w:val="20"/>
+      </w:rPr>
+    </w:lvl>
+    <w:lvl w:ilvl="4" w:tentative="1">
+      <w:start w:val="1"/>
+      <w:numFmt w:val="bullet"/>
+      <w:lvlText w:val=""/>
+      <w:lvlJc w:val="left"/>
+      <w:pPr>
+        <w:tabs>
+          <w:tab w:val="num" w:pos="3600"/>
+        </w:tabs>
+        <w:ind w:left="3600" w:hanging="360"/>
+      </w:pPr>
+      <w:rPr>
+        <w:rFonts w:ascii="Wingdings" w:hAnsi="Wingdings" w:hint="default"/>
+        <w:sz w:val="20"/>
+      </w:rPr>
+    </w:lvl>
+    <w:lvl w:ilvl="5" w:tentative="1">
+      <w:start w:val="1"/>
+      <w:numFmt w:val="bullet"/>
+      <w:lvlText w:val=""/>
+      <w:lvlJc w:val="left"/>
+      <w:pPr>
+        <w:tabs>
+          <w:tab w:val="num" w:pos="4320"/>
+        </w:tabs>
+        <w:ind w:left="4320" w:hanging="360"/>
+      </w:pPr>
+      <w:rPr>
+        <w:rFonts w:ascii="Wingdings" w:hAnsi="Wingdings" w:hint="default"/>
+        <w:sz w:val="20"/>
+      </w:rPr>
+    </w:lvl>
+    <w:lvl w:ilvl="6" w:tentative="1">
+      <w:start w:val="1"/>
+      <w:numFmt w:val="bullet"/>
+      <w:lvlText w:val=""/>
+      <w:lvlJc w:val="left"/>
+      <w:pPr>
+        <w:tabs>
+          <w:tab w:val="num" w:pos="5040"/>
+        </w:tabs>
+        <w:ind w:left="5040" w:hanging="360"/>
+      </w:pPr>
+      <w:rPr>
+        <w:rFonts w:ascii="Wingdings" w:hAnsi="Wingdings" w:hint="default"/>
+        <w:sz w:val="20"/>
+      </w:rPr>
+    </w:lvl>
+    <w:lvl w:ilvl="7" w:tentative="1">
+      <w:start w:val="1"/>
+      <w:numFmt w:val="bullet"/>
+      <w:lvlText w:val=""/>
+      <w:lvlJc w:val="left"/>
+      <w:pPr>
+        <w:tabs>
+          <w:tab w:val="num" w:pos="5760"/>
+        </w:tabs>
+        <w:ind w:left="5760" w:hanging="360"/>
+      </w:pPr>
+      <w:rPr>
+        <w:rFonts w:ascii="Wingdings" w:hAnsi="Wingdings" w:hint="default"/>
+        <w:sz w:val="20"/>
+      </w:rPr>
+    </w:lvl>
+    <w:lvl w:ilvl="8" w:tentative="1">
+      <w:start w:val="1"/>
+      <w:numFmt w:val="bullet"/>
+      <w:lvlText w:val=""/>
+      <w:lvlJc w:val="left"/>
+      <w:pPr>
+        <w:tabs>
+          <w:tab w:val="num" w:pos="6480"/>
+        </w:tabs>
+        <w:ind w:left="6480" w:hanging="360"/>
+      </w:pPr>
+      <w:rPr>
+        <w:rFonts w:ascii="Wingdings" w:hAnsi="Wingdings" w:hint="default"/>
+        <w:sz w:val="20"/>
+      </w:rPr>
+    </w:lvl>
+  </w:abstractNum>
+  <w:abstractNum w:abstractNumId="2" w15:restartNumberingAfterBreak="0">
     <w:nsid w:val="13C04E62"/>
     <w:multiLevelType w:val="multilevel"/>
     <w:tmpl w:val="79FA0E28"/>
@@ -1119,7 +1559,7 @@
       </w:rPr>
     </w:lvl>
   </w:abstractNum>
-  <w:abstractNum w:abstractNumId="2" w15:restartNumberingAfterBreak="0">
+  <w:abstractNum w:abstractNumId="3" w15:restartNumberingAfterBreak="0">
     <w:nsid w:val="1E321DFA"/>
     <w:multiLevelType w:val="multilevel"/>
     <w:tmpl w:val="7402E048"/>
@@ -1268,7 +1708,156 @@
       </w:rPr>
     </w:lvl>
   </w:abstractNum>
-  <w:abstractNum w:abstractNumId="3" w15:restartNumberingAfterBreak="0">
+  <w:abstractNum w:abstractNumId="4" w15:restartNumberingAfterBreak="0">
+    <w:nsid w:val="21835871"/>
+    <w:multiLevelType w:val="multilevel"/>
+    <w:tmpl w:val="76DC53CA"/>
+    <w:lvl w:ilvl="0">
+      <w:start w:val="1"/>
+      <w:numFmt w:val="bullet"/>
+      <w:lvlText w:val=""/>
+      <w:lvlJc w:val="left"/>
+      <w:pPr>
+        <w:tabs>
+          <w:tab w:val="num" w:pos="720"/>
+        </w:tabs>
+        <w:ind w:left="720" w:hanging="360"/>
+      </w:pPr>
+      <w:rPr>
+        <w:rFonts w:ascii="Symbol" w:hAnsi="Symbol" w:hint="default"/>
+        <w:sz w:val="20"/>
+      </w:rPr>
+    </w:lvl>
+    <w:lvl w:ilvl="1" w:tentative="1">
+      <w:start w:val="1"/>
+      <w:numFmt w:val="bullet"/>
+      <w:lvlText w:val="o"/>
+      <w:lvlJc w:val="left"/>
+      <w:pPr>
+        <w:tabs>
+          <w:tab w:val="num" w:pos="1440"/>
+        </w:tabs>
+        <w:ind w:left="1440" w:hanging="360"/>
+      </w:pPr>
+      <w:rPr>
+        <w:rFonts w:ascii="Courier New" w:hAnsi="Courier New" w:hint="default"/>
+        <w:sz w:val="20"/>
+      </w:rPr>
+    </w:lvl>
+    <w:lvl w:ilvl="2" w:tentative="1">
+      <w:start w:val="1"/>
+      <w:numFmt w:val="bullet"/>
+      <w:lvlText w:val=""/>
+      <w:lvlJc w:val="left"/>
+      <w:pPr>
+        <w:tabs>
+          <w:tab w:val="num" w:pos="2160"/>
+        </w:tabs>
+        <w:ind w:left="2160" w:hanging="360"/>
+      </w:pPr>
+      <w:rPr>
+        <w:rFonts w:ascii="Wingdings" w:hAnsi="Wingdings" w:hint="default"/>
+        <w:sz w:val="20"/>
+      </w:rPr>
+    </w:lvl>
+    <w:lvl w:ilvl="3" w:tentative="1">
+      <w:start w:val="1"/>
+      <w:numFmt w:val="bullet"/>
+      <w:lvlText w:val=""/>
+      <w:lvlJc w:val="left"/>
+      <w:pPr>
+        <w:tabs>
+          <w:tab w:val="num" w:pos="2880"/>
+        </w:tabs>
+        <w:ind w:left="2880" w:hanging="360"/>
+      </w:pPr>
+      <w:rPr>
+        <w:rFonts w:ascii="Wingdings" w:hAnsi="Wingdings" w:hint="default"/>
+        <w:sz w:val="20"/>
+      </w:rPr>
+    </w:lvl>
+    <w:lvl w:ilvl="4" w:tentative="1">
+      <w:start w:val="1"/>
+      <w:numFmt w:val="bullet"/>
+      <w:lvlText w:val=""/>
+      <w:lvlJc w:val="left"/>
+      <w:pPr>
+        <w:tabs>
+          <w:tab w:val="num" w:pos="3600"/>
+        </w:tabs>
+        <w:ind w:left="3600" w:hanging="360"/>
+      </w:pPr>
+      <w:rPr>
+        <w:rFonts w:ascii="Wingdings" w:hAnsi="Wingdings" w:hint="default"/>
+        <w:sz w:val="20"/>
+      </w:rPr>
+    </w:lvl>
+    <w:lvl w:ilvl="5" w:tentative="1">
+      <w:start w:val="1"/>
+      <w:numFmt w:val="bullet"/>
+      <w:lvlText w:val=""/>
+      <w:lvlJc w:val="left"/>
+      <w:pPr>
+        <w:tabs>
+          <w:tab w:val="num" w:pos="4320"/>
+        </w:tabs>
+        <w:ind w:left="4320" w:hanging="360"/>
+      </w:pPr>
+      <w:rPr>
+        <w:rFonts w:ascii="Wingdings" w:hAnsi="Wingdings" w:hint="default"/>
+        <w:sz w:val="20"/>
+      </w:rPr>
+    </w:lvl>
+    <w:lvl w:ilvl="6" w:tentative="1">
+      <w:start w:val="1"/>
+      <w:numFmt w:val="bullet"/>
+      <w:lvlText w:val=""/>
+      <w:lvlJc w:val="left"/>
+      <w:pPr>
+        <w:tabs>
+          <w:tab w:val="num" w:pos="5040"/>
+        </w:tabs>
+        <w:ind w:left="5040" w:hanging="360"/>
+      </w:pPr>
+      <w:rPr>
+        <w:rFonts w:ascii="Wingdings" w:hAnsi="Wingdings" w:hint="default"/>
+        <w:sz w:val="20"/>
+      </w:rPr>
+    </w:lvl>
+    <w:lvl w:ilvl="7" w:tentative="1">
+      <w:start w:val="1"/>
+      <w:numFmt w:val="bullet"/>
+      <w:lvlText w:val=""/>
+      <w:lvlJc w:val="left"/>
+      <w:pPr>
+        <w:tabs>
+          <w:tab w:val="num" w:pos="5760"/>
+        </w:tabs>
+        <w:ind w:left="5760" w:hanging="360"/>
+      </w:pPr>
+      <w:rPr>
+        <w:rFonts w:ascii="Wingdings" w:hAnsi="Wingdings" w:hint="default"/>
+        <w:sz w:val="20"/>
+      </w:rPr>
+    </w:lvl>
+    <w:lvl w:ilvl="8" w:tentative="1">
+      <w:start w:val="1"/>
+      <w:numFmt w:val="bullet"/>
+      <w:lvlText w:val=""/>
+      <w:lvlJc w:val="left"/>
+      <w:pPr>
+        <w:tabs>
+          <w:tab w:val="num" w:pos="6480"/>
+        </w:tabs>
+        <w:ind w:left="6480" w:hanging="360"/>
+      </w:pPr>
+      <w:rPr>
+        <w:rFonts w:ascii="Wingdings" w:hAnsi="Wingdings" w:hint="default"/>
+        <w:sz w:val="20"/>
+      </w:rPr>
+    </w:lvl>
+  </w:abstractNum>
+  <w:abstractNum w:abstractNumId="5" w15:restartNumberingAfterBreak="0">
     <w:nsid w:val="252110C6"/>
     <w:multiLevelType w:val="multilevel"/>
     <w:tmpl w:val="79F04AF6"/>
@@ -1417,7 +2006,7 @@
       </w:rPr>
     </w:lvl>
   </w:abstractNum>
-  <w:abstractNum w:abstractNumId="4" w15:restartNumberingAfterBreak="0">
+  <w:abstractNum w:abstractNumId="6" w15:restartNumberingAfterBreak="0">
     <w:nsid w:val="278F5080"/>
     <w:multiLevelType w:val="multilevel"/>
     <w:tmpl w:val="022E029E"/>
@@ -1566,7 +2155,7 @@
       </w:rPr>
     </w:lvl>
   </w:abstractNum>
-  <w:abstractNum w:abstractNumId="5" w15:restartNumberingAfterBreak="0">
+  <w:abstractNum w:abstractNumId="7" w15:restartNumberingAfterBreak="0">
     <w:nsid w:val="31CE66F3"/>
     <w:multiLevelType w:val="multilevel"/>
     <w:tmpl w:val="846232AE"/>
@@ -1715,7 +2304,305 @@
       </w:rPr>
     </w:lvl>
   </w:abstractNum>
-  <w:abstractNum w:abstractNumId="6" w15:restartNumberingAfterBreak="0">
+  <w:abstractNum w:abstractNumId="8" w15:restartNumberingAfterBreak="0">
+    <w:nsid w:val="38210531"/>
+    <w:multiLevelType w:val="multilevel"/>
+    <w:tmpl w:val="CBB217F8"/>
+    <w:lvl w:ilvl="0">
+      <w:start w:val="1"/>
+      <w:numFmt w:val="bullet"/>
+      <w:lvlText w:val=""/>
+      <w:lvlJc w:val="left"/>
+      <w:pPr>
+        <w:tabs>
+          <w:tab w:val="num" w:pos="720"/>
+        </w:tabs>
+        <w:ind w:left="720" w:hanging="360"/>
+      </w:pPr>
+      <w:rPr>
+        <w:rFonts w:ascii="Symbol" w:hAnsi="Symbol" w:hint="default"/>
+        <w:sz w:val="20"/>
+      </w:rPr>
+    </w:lvl>
+    <w:lvl w:ilvl="1" w:tentative="1">
+      <w:start w:val="1"/>
+      <w:numFmt w:val="bullet"/>
+      <w:lvlText w:val="o"/>
+      <w:lvlJc w:val="left"/>
+      <w:pPr>
+        <w:tabs>
+          <w:tab w:val="num" w:pos="1440"/>
+        </w:tabs>
+        <w:ind w:left="1440" w:hanging="360"/>
+      </w:pPr>
+      <w:rPr>
+        <w:rFonts w:ascii="Courier New" w:hAnsi="Courier New" w:hint="default"/>
+        <w:sz w:val="20"/>
+      </w:rPr>
+    </w:lvl>
+    <w:lvl w:ilvl="2" w:tentative="1">
+      <w:start w:val="1"/>
+      <w:numFmt w:val="bullet"/>
+      <w:lvlText w:val=""/>
+      <w:lvlJc w:val="left"/>
+      <w:pPr>
+        <w:tabs>
+          <w:tab w:val="num" w:pos="2160"/>
+        </w:tabs>
+        <w:ind w:left="2160" w:hanging="360"/>
+      </w:pPr>
+      <w:rPr>
+        <w:rFonts w:ascii="Wingdings" w:hAnsi="Wingdings" w:hint="default"/>
+        <w:sz w:val="20"/>
+      </w:rPr>
+    </w:lvl>
+    <w:lvl w:ilvl="3" w:tentative="1">
+      <w:start w:val="1"/>
+      <w:numFmt w:val="bullet"/>
+      <w:lvlText w:val=""/>
+      <w:lvlJc w:val="left"/>
+      <w:pPr>
+        <w:tabs>
+          <w:tab w:val="num" w:pos="2880"/>
+        </w:tabs>
+        <w:ind w:left="2880" w:hanging="360"/>
+      </w:pPr>
+      <w:rPr>
+        <w:rFonts w:ascii="Wingdings" w:hAnsi="Wingdings" w:hint="default"/>
+        <w:sz w:val="20"/>
+      </w:rPr>
+    </w:lvl>
+    <w:lvl w:ilvl="4" w:tentative="1">
+      <w:start w:val="1"/>
+      <w:numFmt w:val="bullet"/>
+      <w:lvlText w:val=""/>
+      <w:lvlJc w:val="left"/>
+      <w:pPr>
+        <w:tabs>
+          <w:tab w:val="num" w:pos="3600"/>
+        </w:tabs>
+        <w:ind w:left="3600" w:hanging="360"/>
+      </w:pPr>
+      <w:rPr>
+        <w:rFonts w:ascii="Wingdings" w:hAnsi="Wingdings" w:hint="default"/>
+        <w:sz w:val="20"/>
+      </w:rPr>
+    </w:lvl>
+    <w:lvl w:ilvl="5" w:tentative="1">
+      <w:start w:val="1"/>
+      <w:numFmt w:val="bullet"/>
+      <w:lvlText w:val=""/>
+      <w:lvlJc w:val="left"/>
+      <w:pPr>
+        <w:tabs>
+          <w:tab w:val="num" w:pos="4320"/>
+        </w:tabs>
+        <w:ind w:left="4320" w:hanging="360"/>
+      </w:pPr>
+      <w:rPr>
+        <w:rFonts w:ascii="Wingdings" w:hAnsi="Wingdings" w:hint="default"/>
+        <w:sz w:val="20"/>
+      </w:rPr>
+    </w:lvl>
+    <w:lvl w:ilvl="6" w:tentative="1">
+      <w:start w:val="1"/>
+      <w:numFmt w:val="bullet"/>
+      <w:lvlText w:val=""/>
+      <w:lvlJc w:val="left"/>
+      <w:pPr>
+        <w:tabs>
+          <w:tab w:val="num" w:pos="5040"/>
+        </w:tabs>
+        <w:ind w:left="5040" w:hanging="360"/>
+      </w:pPr>
+      <w:rPr>
+        <w:rFonts w:ascii="Wingdings" w:hAnsi="Wingdings" w:hint="default"/>
+        <w:sz w:val="20"/>
+      </w:rPr>
+    </w:lvl>
+    <w:lvl w:ilvl="7" w:tentative="1">
+      <w:start w:val="1"/>
+      <w:numFmt w:val="bullet"/>
+      <w:lvlText w:val=""/>
+      <w:lvlJc w:val="left"/>
+      <w:pPr>
+        <w:tabs>
+          <w:tab w:val="num" w:pos="5760"/>
+        </w:tabs>
+        <w:ind w:left="5760" w:hanging="360"/>
+      </w:pPr>
+      <w:rPr>
+        <w:rFonts w:ascii="Wingdings" w:hAnsi="Wingdings" w:hint="default"/>
+        <w:sz w:val="20"/>
+      </w:rPr>
+    </w:lvl>
+    <w:lvl w:ilvl="8" w:tentative="1">
+      <w:start w:val="1"/>
+      <w:numFmt w:val="bullet"/>
+      <w:lvlText w:val=""/>
+      <w:lvlJc w:val="left"/>
+      <w:pPr>
+        <w:tabs>
+          <w:tab w:val="num" w:pos="6480"/>
+        </w:tabs>
+        <w:ind w:left="6480" w:hanging="360"/>
+      </w:pPr>
+      <w:rPr>
+        <w:rFonts w:ascii="Wingdings" w:hAnsi="Wingdings" w:hint="default"/>
+        <w:sz w:val="20"/>
+      </w:rPr>
+    </w:lvl>
+  </w:abstractNum>
+  <w:abstractNum w:abstractNumId="9" w15:restartNumberingAfterBreak="0">
+    <w:nsid w:val="569606C5"/>
+    <w:multiLevelType w:val="multilevel"/>
+    <w:tmpl w:val="BCAEFB2C"/>
+    <w:lvl w:ilvl="0">
+      <w:start w:val="1"/>
+      <w:numFmt w:val="bullet"/>
+      <w:lvlText w:val=""/>
+      <w:lvlJc w:val="left"/>
+      <w:pPr>
+        <w:tabs>
+          <w:tab w:val="num" w:pos="720"/>
+        </w:tabs>
+        <w:ind w:left="720" w:hanging="360"/>
+      </w:pPr>
+      <w:rPr>
+        <w:rFonts w:ascii="Symbol" w:hAnsi="Symbol" w:hint="default"/>
+        <w:sz w:val="20"/>
+      </w:rPr>
+    </w:lvl>
+    <w:lvl w:ilvl="1" w:tentative="1">
+      <w:start w:val="1"/>
+      <w:numFmt w:val="bullet"/>
+      <w:lvlText w:val="o"/>
+      <w:lvlJc w:val="left"/>
+      <w:pPr>
+        <w:tabs>
+          <w:tab w:val="num" w:pos="1440"/>
+        </w:tabs>
+        <w:ind w:left="1440" w:hanging="360"/>
+      </w:pPr>
+      <w:rPr>
+        <w:rFonts w:ascii="Courier New" w:hAnsi="Courier New" w:hint="default"/>
+        <w:sz w:val="20"/>
+      </w:rPr>
+    </w:lvl>
+    <w:lvl w:ilvl="2" w:tentative="1">
+      <w:start w:val="1"/>
+      <w:numFmt w:val="bullet"/>
+      <w:lvlText w:val=""/>
+      <w:lvlJc w:val="left"/>
+      <w:pPr>
+        <w:tabs>
+          <w:tab w:val="num" w:pos="2160"/>
+        </w:tabs>
+        <w:ind w:left="2160" w:hanging="360"/>
+      </w:pPr>
+      <w:rPr>
+        <w:rFonts w:ascii="Wingdings" w:hAnsi="Wingdings" w:hint="default"/>
+        <w:sz w:val="20"/>
+      </w:rPr>
+    </w:lvl>
+    <w:lvl w:ilvl="3" w:tentative="1">
+      <w:start w:val="1"/>
+      <w:numFmt w:val="bullet"/>
+      <w:lvlText w:val=""/>
+      <w:lvlJc w:val="left"/>
+      <w:pPr>
+        <w:tabs>
+          <w:tab w:val="num" w:pos="2880"/>
+        </w:tabs>
+        <w:ind w:left="2880" w:hanging="360"/>
+      </w:pPr>
+      <w:rPr>
+        <w:rFonts w:ascii="Wingdings" w:hAnsi="Wingdings" w:hint="default"/>
+        <w:sz w:val="20"/>
+      </w:rPr>
+    </w:lvl>
+    <w:lvl w:ilvl="4" w:tentative="1">
+      <w:start w:val="1"/>
+      <w:numFmt w:val="bullet"/>
+      <w:lvlText w:val=""/>
+      <w:lvlJc w:val="left"/>
+      <w:pPr>
+        <w:tabs>
+          <w:tab w:val="num" w:pos="3600"/>
+        </w:tabs>
+        <w:ind w:left="3600" w:hanging="360"/>
+      </w:pPr>
+      <w:rPr>
+        <w:rFonts w:ascii="Wingdings" w:hAnsi="Wingdings" w:hint="default"/>
+        <w:sz w:val="20"/>
+      </w:rPr>
+    </w:lvl>
+    <w:lvl w:ilvl="5" w:tentative="1">
+      <w:start w:val="1"/>
+      <w:numFmt w:val="bullet"/>
+      <w:lvlText w:val=""/>
+      <w:lvlJc w:val="left"/>
+      <w:pPr>
+        <w:tabs>
+          <w:tab w:val="num" w:pos="4320"/>
+        </w:tabs>
+        <w:ind w:left="4320" w:hanging="360"/>
+      </w:pPr>
+      <w:rPr>
+        <w:rFonts w:ascii="Wingdings" w:hAnsi="Wingdings" w:hint="default"/>
+        <w:sz w:val="20"/>
+      </w:rPr>
+    </w:lvl>
+    <w:lvl w:ilvl="6" w:tentative="1">
+      <w:start w:val="1"/>
+      <w:numFmt w:val="bullet"/>
+      <w:lvlText w:val=""/>
+      <w:lvlJc w:val="left"/>
+      <w:pPr>
+        <w:tabs>
+          <w:tab w:val="num" w:pos="5040"/>
+        </w:tabs>
+        <w:ind w:left="5040" w:hanging="360"/>
+      </w:pPr>
+      <w:rPr>
+        <w:rFonts w:ascii="Wingdings" w:hAnsi="Wingdings" w:hint="default"/>
+        <w:sz w:val="20"/>
+      </w:rPr>
+    </w:lvl>
+    <w:lvl w:ilvl="7" w:tentative="1">
+      <w:start w:val="1"/>
+      <w:numFmt w:val="bullet"/>
+      <w:lvlText w:val=""/>
+      <w:lvlJc w:val="left"/>
+      <w:pPr>
+        <w:tabs>
+          <w:tab w:val="num" w:pos="5760"/>
+        </w:tabs>
+        <w:ind w:left="5760" w:hanging="360"/>
+      </w:pPr>
+      <w:rPr>
+        <w:rFonts w:ascii="Wingdings" w:hAnsi="Wingdings" w:hint="default"/>
+        <w:sz w:val="20"/>
+      </w:rPr>
+    </w:lvl>
+    <w:lvl w:ilvl="8" w:tentative="1">
+      <w:start w:val="1"/>
+      <w:numFmt w:val="bullet"/>
+      <w:lvlText w:val=""/>
+      <w:lvlJc w:val="left"/>
+      <w:pPr>
+        <w:tabs>
+          <w:tab w:val="num" w:pos="6480"/>
+        </w:tabs>
+        <w:ind w:left="6480" w:hanging="360"/>
+      </w:pPr>
+      <w:rPr>
+        <w:rFonts w:ascii="Wingdings" w:hAnsi="Wingdings" w:hint="default"/>
+        <w:sz w:val="20"/>
+      </w:rPr>
+    </w:lvl>
+  </w:abstractNum>
+  <w:abstractNum w:abstractNumId="10" w15:restartNumberingAfterBreak="0">
     <w:nsid w:val="723403CD"/>
     <w:multiLevelType w:val="multilevel"/>
     <w:tmpl w:val="200A67F6"/>
@@ -1864,26 +2751,306 @@
       </w:rPr>
     </w:lvl>
   </w:abstractNum>
+  <w:abstractNum w:abstractNumId="11" w15:restartNumberingAfterBreak="0">
+    <w:nsid w:val="775E30D5"/>
+    <w:multiLevelType w:val="multilevel"/>
+    <w:tmpl w:val="4DBA2758"/>
+    <w:lvl w:ilvl="0">
+      <w:start w:val="1"/>
+      <w:numFmt w:val="bullet"/>
+      <w:lvlText w:val=""/>
+      <w:lvlJc w:val="left"/>
+      <w:pPr>
+        <w:tabs>
+          <w:tab w:val="num" w:pos="720"/>
+        </w:tabs>
+        <w:ind w:left="720" w:hanging="360"/>
+      </w:pPr>
+      <w:rPr>
+        <w:rFonts w:ascii="Symbol" w:hAnsi="Symbol" w:hint="default"/>
+        <w:sz w:val="20"/>
+      </w:rPr>
+    </w:lvl>
+    <w:lvl w:ilvl="1" w:tentative="1">
+      <w:start w:val="1"/>
+      <w:numFmt w:val="bullet"/>
+      <w:lvlText w:val="o"/>
+      <w:lvlJc w:val="left"/>
+      <w:pPr>
+        <w:tabs>
+          <w:tab w:val="num" w:pos="1440"/>
+        </w:tabs>
+        <w:ind w:left="1440" w:hanging="360"/>
+      </w:pPr>
+      <w:rPr>
+        <w:rFonts w:ascii="Courier New" w:hAnsi="Courier New" w:hint="default"/>
+        <w:sz w:val="20"/>
+      </w:rPr>
+    </w:lvl>
+    <w:lvl w:ilvl="2" w:tentative="1">
+      <w:start w:val="1"/>
+      <w:numFmt w:val="bullet"/>
+      <w:lvlText w:val=""/>
+      <w:lvlJc w:val="left"/>
+      <w:pPr>
+        <w:tabs>
+          <w:tab w:val="num" w:pos="2160"/>
+        </w:tabs>
+        <w:ind w:left="2160" w:hanging="360"/>
+      </w:pPr>
+      <w:rPr>
+        <w:rFonts w:ascii="Wingdings" w:hAnsi="Wingdings" w:hint="default"/>
+        <w:sz w:val="20"/>
+      </w:rPr>
+    </w:lvl>
+    <w:lvl w:ilvl="3" w:tentative="1">
+      <w:start w:val="1"/>
+      <w:numFmt w:val="bullet"/>
+      <w:lvlText w:val=""/>
+      <w:lvlJc w:val="left"/>
+      <w:pPr>
+        <w:tabs>
+          <w:tab w:val="num" w:pos="2880"/>
+        </w:tabs>
+        <w:ind w:left="2880" w:hanging="360"/>
+      </w:pPr>
+      <w:rPr>
+        <w:rFonts w:ascii="Wingdings" w:hAnsi="Wingdings" w:hint="default"/>
+        <w:sz w:val="20"/>
+      </w:rPr>
+    </w:lvl>
+    <w:lvl w:ilvl="4" w:tentative="1">
+      <w:start w:val="1"/>
+      <w:numFmt w:val="bullet"/>
+      <w:lvlText w:val=""/>
+      <w:lvlJc w:val="left"/>
+      <w:pPr>
+        <w:tabs>
+          <w:tab w:val="num" w:pos="3600"/>
+        </w:tabs>
+        <w:ind w:left="3600" w:hanging="360"/>
+      </w:pPr>
+      <w:rPr>
+        <w:rFonts w:ascii="Wingdings" w:hAnsi="Wingdings" w:hint="default"/>
+        <w:sz w:val="20"/>
+      </w:rPr>
+    </w:lvl>
+    <w:lvl w:ilvl="5" w:tentative="1">
+      <w:start w:val="1"/>
+      <w:numFmt w:val="bullet"/>
+      <w:lvlText w:val=""/>
+      <w:lvlJc w:val="left"/>
+      <w:pPr>
+        <w:tabs>
+          <w:tab w:val="num" w:pos="4320"/>
+        </w:tabs>
+        <w:ind w:left="4320" w:hanging="360"/>
+      </w:pPr>
+      <w:rPr>
+        <w:rFonts w:ascii="Wingdings" w:hAnsi="Wingdings" w:hint="default"/>
+        <w:sz w:val="20"/>
+      </w:rPr>
+    </w:lvl>
+    <w:lvl w:ilvl="6" w:tentative="1">
+      <w:start w:val="1"/>
+      <w:numFmt w:val="bullet"/>
+      <w:lvlText w:val=""/>
+      <w:lvlJc w:val="left"/>
+      <w:pPr>
+        <w:tabs>
+          <w:tab w:val="num" w:pos="5040"/>
+        </w:tabs>
+        <w:ind w:left="5040" w:hanging="360"/>
+      </w:pPr>
+      <w:rPr>
+        <w:rFonts w:ascii="Wingdings" w:hAnsi="Wingdings" w:hint="default"/>
+        <w:sz w:val="20"/>
+      </w:rPr>
+    </w:lvl>
+    <w:lvl w:ilvl="7" w:tentative="1">
+      <w:start w:val="1"/>
+      <w:numFmt w:val="bullet"/>
+      <w:lvlText w:val=""/>
+      <w:lvlJc w:val="left"/>
+      <w:pPr>
+        <w:tabs>
+          <w:tab w:val="num" w:pos="5760"/>
+        </w:tabs>
+        <w:ind w:left="5760" w:hanging="360"/>
+      </w:pPr>
+      <w:rPr>
+        <w:rFonts w:ascii="Wingdings" w:hAnsi="Wingdings" w:hint="default"/>
+        <w:sz w:val="20"/>
+      </w:rPr>
+    </w:lvl>
+    <w:lvl w:ilvl="8" w:tentative="1">
+      <w:start w:val="1"/>
+      <w:numFmt w:val="bullet"/>
+      <w:lvlText w:val=""/>
+      <w:lvlJc w:val="left"/>
+      <w:pPr>
+        <w:tabs>
+          <w:tab w:val="num" w:pos="6480"/>
+        </w:tabs>
+        <w:ind w:left="6480" w:hanging="360"/>
+      </w:pPr>
+      <w:rPr>
+        <w:rFonts w:ascii="Wingdings" w:hAnsi="Wingdings" w:hint="default"/>
+        <w:sz w:val="20"/>
+      </w:rPr>
+    </w:lvl>
+  </w:abstractNum>
+  <w:abstractNum w:abstractNumId="12" w15:restartNumberingAfterBreak="0">
+    <w:nsid w:val="7816487A"/>
+    <w:multiLevelType w:val="multilevel"/>
+    <w:tmpl w:val="89FACAEC"/>
+    <w:lvl w:ilvl="0">
+      <w:start w:val="1"/>
+      <w:numFmt w:val="decimal"/>
+      <w:lvlText w:val="%1."/>
+      <w:lvlJc w:val="left"/>
+      <w:pPr>
+        <w:tabs>
+          <w:tab w:val="num" w:pos="720"/>
+        </w:tabs>
+        <w:ind w:left="720" w:hanging="360"/>
+      </w:pPr>
+    </w:lvl>
+    <w:lvl w:ilvl="1" w:tentative="1">
+      <w:start w:val="1"/>
+      <w:numFmt w:val="decimal"/>
+      <w:lvlText w:val="%2."/>
+      <w:lvlJc w:val="left"/>
+      <w:pPr>
+        <w:tabs>
+          <w:tab w:val="num" w:pos="1440"/>
+        </w:tabs>
+        <w:ind w:left="1440" w:hanging="360"/>
+      </w:pPr>
+    </w:lvl>
+    <w:lvl w:ilvl="2" w:tentative="1">
+      <w:start w:val="1"/>
+      <w:numFmt w:val="decimal"/>
+      <w:lvlText w:val="%3."/>
+      <w:lvlJc w:val="left"/>
+      <w:pPr>
+        <w:tabs>
+          <w:tab w:val="num" w:pos="2160"/>
+        </w:tabs>
+        <w:ind w:left="2160" w:hanging="360"/>
+      </w:pPr>
+    </w:lvl>
+    <w:lvl w:ilvl="3" w:tentative="1">
+      <w:start w:val="1"/>
+      <w:numFmt w:val="decimal"/>
+      <w:lvlText w:val="%4."/>
+      <w:lvlJc w:val="left"/>
+      <w:pPr>
+        <w:tabs>
+          <w:tab w:val="num" w:pos="2880"/>
+        </w:tabs>
+        <w:ind w:left="2880" w:hanging="360"/>
+      </w:pPr>
+    </w:lvl>
+    <w:lvl w:ilvl="4" w:tentative="1">
+      <w:start w:val="1"/>
+      <w:numFmt w:val="decimal"/>
+      <w:lvlText w:val="%5."/>
+      <w:lvlJc w:val="left"/>
+      <w:pPr>
+        <w:tabs>
+          <w:tab w:val="num" w:pos="3600"/>
+        </w:tabs>
+        <w:ind w:left="3600" w:hanging="360"/>
+      </w:pPr>
+    </w:lvl>
+    <w:lvl w:ilvl="5" w:tentative="1">
+      <w:start w:val="1"/>
+      <w:numFmt w:val="decimal"/>
+      <w:lvlText w:val="%6."/>
+      <w:lvlJc w:val="left"/>
+      <w:pPr>
+        <w:tabs>
+          <w:tab w:val="num" w:pos="4320"/>
+        </w:tabs>
+        <w:ind w:left="4320" w:hanging="360"/>
+      </w:pPr>
+    </w:lvl>
+    <w:lvl w:ilvl="6" w:tentative="1">
+      <w:start w:val="1"/>
+      <w:numFmt w:val="decimal"/>
+      <w:lvlText w:val="%7."/>
+      <w:lvlJc w:val="left"/>
+      <w:pPr>
+        <w:tabs>
+          <w:tab w:val="num" w:pos="5040"/>
+        </w:tabs>
+        <w:ind w:left="5040" w:hanging="360"/>
+      </w:pPr>
+    </w:lvl>
+    <w:lvl w:ilvl="7" w:tentative="1">
+      <w:start w:val="1"/>
+      <w:numFmt w:val="decimal"/>
+      <w:lvlText w:val="%8."/>
+      <w:lvlJc w:val="left"/>
+      <w:pPr>
+        <w:tabs>
+          <w:tab w:val="num" w:pos="5760"/>
+        </w:tabs>
+        <w:ind w:left="5760" w:hanging="360"/>
+      </w:pPr>
+    </w:lvl>
+    <w:lvl w:ilvl="8" w:tentative="1">
+      <w:start w:val="1"/>
+      <w:numFmt w:val="decimal"/>
+      <w:lvlText w:val="%9."/>
+      <w:lvlJc w:val="left"/>
+      <w:pPr>
+        <w:tabs>
+          <w:tab w:val="num" w:pos="6480"/>
+        </w:tabs>
+        <w:ind w:left="6480" w:hanging="360"/>
+      </w:pPr>
+    </w:lvl>
+  </w:abstractNum>
   <w:num w:numId="1" w16cid:durableId="245306766">
-    <w:abstractNumId w:val="3"/>
+    <w:abstractNumId w:val="5"/>
   </w:num>
   <w:num w:numId="2" w16cid:durableId="1780877735">
-    <w:abstractNumId w:val="2"/>
+    <w:abstractNumId w:val="3"/>
   </w:num>
   <w:num w:numId="3" w16cid:durableId="1594778854">
     <w:abstractNumId w:val="0"/>
   </w:num>
   <w:num w:numId="4" w16cid:durableId="824248998">
+    <w:abstractNumId w:val="2"/>
+  </w:num>
+  <w:num w:numId="5" w16cid:durableId="1841039846">
+    <w:abstractNumId w:val="6"/>
+  </w:num>
+  <w:num w:numId="6" w16cid:durableId="1623151442">
+    <w:abstractNumId w:val="10"/>
+  </w:num>
+  <w:num w:numId="7" w16cid:durableId="1350453807">
+    <w:abstractNumId w:val="7"/>
+  </w:num>
+  <w:num w:numId="8" w16cid:durableId="1872108918">
+    <w:abstractNumId w:val="4"/>
+  </w:num>
+  <w:num w:numId="9" w16cid:durableId="1823039714">
+    <w:abstractNumId w:val="11"/>
+  </w:num>
+  <w:num w:numId="10" w16cid:durableId="2146044492">
     <w:abstractNumId w:val="1"/>
   </w:num>
-  <w:num w:numId="5" w16cid:durableId="1841039846">
-    <w:abstractNumId w:val="4"/>
+  <w:num w:numId="11" w16cid:durableId="2127891712">
+    <w:abstractNumId w:val="8"/>
   </w:num>
-  <w:num w:numId="6" w16cid:durableId="1623151442">
-    <w:abstractNumId w:val="6"/>
+  <w:num w:numId="12" w16cid:durableId="673993848">
+    <w:abstractNumId w:val="12"/>
   </w:num>
-  <w:num w:numId="7" w16cid:durableId="1350453807">
-    <w:abstractNumId w:val="5"/>
+  <w:num w:numId="13" w16cid:durableId="902443946">
+    <w:abstractNumId w:val="9"/>
   </w:num>
 </w:numbering>
 </file>

</xml_diff>

<commit_message>
chore: Lanzamiento Oficial Plataforma v1.0 - Full Admin, Resend Sync & Security Hardening
</commit_message>
<xml_diff>
--- a/Curso Conceptos básicos sobre la IA.docx
+++ b/Curso Conceptos básicos sobre la IA.docx
@@ -164,7 +164,25 @@
           <w:b/>
           <w:bCs/>
         </w:rPr>
-        <w:t>¿Sabías que?: La IA puede generar respuestas con una estructura gramatical impecable aunque el dato sea falso. Esto sucede porque el sistema prioriza la coherencia lingüística (que la frase suene bien) sobre la veracidad factual (que la información sea cierta).</w:t>
+        <w:t xml:space="preserve">¿Sabías que?: La IA puede generar respuestas con una estructura gramatical </w:t>
+      </w:r>
+      <w:proofErr w:type="gramStart"/>
+      <w:r>
+        <w:rPr>
+          <w:rFonts w:ascii="Segoe UI Emoji" w:hAnsi="Segoe UI Emoji" w:cs="Segoe UI Emoji"/>
+          <w:b/>
+          <w:bCs/>
+        </w:rPr>
+        <w:t>impecable</w:t>
+      </w:r>
+      <w:proofErr w:type="gramEnd"/>
+      <w:r>
+        <w:rPr>
+          <w:rFonts w:ascii="Segoe UI Emoji" w:hAnsi="Segoe UI Emoji" w:cs="Segoe UI Emoji"/>
+          <w:b/>
+          <w:bCs/>
+        </w:rPr>
+        <w:t xml:space="preserve"> aunque el dato sea falso. Esto sucede porque el sistema prioriza la coherencia lingüística (que la frase suene bien) sobre la veracidad factual (que la información sea cierta).</w:t>
       </w:r>
     </w:p>
     <w:p>
@@ -216,7 +234,7 @@
           <w:bCs/>
         </w:rPr>
         <w:pict w14:anchorId="3AFB2C71">
-          <v:rect id="_x0000_i1229" style="width:0;height:1.5pt" o:hralign="center" o:hrstd="t" o:hr="t" fillcolor="#a0a0a0" stroked="f"/>
+          <v:rect id="_x0000_i1025" style="width:0;height:1.5pt" o:hralign="center" o:hrstd="t" o:hr="t" fillcolor="#a0a0a0" stroked="f"/>
         </w:pict>
       </w:r>
     </w:p>
@@ -251,7 +269,25 @@
           <w:b/>
           <w:bCs/>
         </w:rPr>
-        <w:t>Subtítulo: Los mecanismos técnicos detrás de los LLMs: Arquitectura, tokens y entrenamiento.</w:t>
+        <w:t xml:space="preserve">Subtítulo: Los mecanismos técnicos detrás de los </w:t>
+      </w:r>
+      <w:proofErr w:type="spellStart"/>
+      <w:r>
+        <w:rPr>
+          <w:rFonts w:ascii="Segoe UI Emoji" w:hAnsi="Segoe UI Emoji" w:cs="Segoe UI Emoji"/>
+          <w:b/>
+          <w:bCs/>
+        </w:rPr>
+        <w:t>LLMs</w:t>
+      </w:r>
+      <w:proofErr w:type="spellEnd"/>
+      <w:r>
+        <w:rPr>
+          <w:rFonts w:ascii="Segoe UI Emoji" w:hAnsi="Segoe UI Emoji" w:cs="Segoe UI Emoji"/>
+          <w:b/>
+          <w:bCs/>
+        </w:rPr>
+        <w:t>: Arquitectura, tokens y entrenamiento.</w:t>
       </w:r>
     </w:p>
     <w:p>
@@ -300,13 +336,23 @@
           <w:bCs/>
         </w:rPr>
       </w:pPr>
-      <w:r>
-        <w:rPr>
-          <w:rFonts w:ascii="Segoe UI Emoji" w:hAnsi="Segoe UI Emoji" w:cs="Segoe UI Emoji"/>
-          <w:b/>
-          <w:bCs/>
-        </w:rPr>
-        <w:t>Tokenización: El proceso de fragmentar palabras en unidades numéricas.</w:t>
+      <w:proofErr w:type="spellStart"/>
+      <w:r>
+        <w:rPr>
+          <w:rFonts w:ascii="Segoe UI Emoji" w:hAnsi="Segoe UI Emoji" w:cs="Segoe UI Emoji"/>
+          <w:b/>
+          <w:bCs/>
+        </w:rPr>
+        <w:t>Tokenización</w:t>
+      </w:r>
+      <w:proofErr w:type="spellEnd"/>
+      <w:r>
+        <w:rPr>
+          <w:rFonts w:ascii="Segoe UI Emoji" w:hAnsi="Segoe UI Emoji" w:cs="Segoe UI Emoji"/>
+          <w:b/>
+          <w:bCs/>
+        </w:rPr>
+        <w:t>: El proceso de fragmentar palabras en unidades numéricas.</w:t>
       </w:r>
     </w:p>
     <w:p>
@@ -366,41 +412,131 @@
           <w:b/>
           <w:bCs/>
         </w:rPr>
-        <w:t>¿Sabías que?: Un modelo como GPT-4 no lee palabras completas, sino "tokens". Por ejemplo, la palabra "Plattform" podría dividirse en dos o tres fragmentos numéricos que la IA procesa por separado para entender su raíz y contexto.</w:t>
-      </w:r>
-    </w:p>
-    <w:p>
-      <w:pPr>
-        <w:rPr>
-          <w:rFonts w:ascii="Segoe UI Emoji" w:hAnsi="Segoe UI Emoji" w:cs="Segoe UI Emoji"/>
-          <w:b/>
-          <w:bCs/>
-        </w:rPr>
-      </w:pPr>
-      <w:r>
-        <w:rPr>
-          <w:rFonts w:ascii="Segoe UI Emoji" w:hAnsi="Segoe UI Emoji" w:cs="Segoe UI Emoji"/>
-          <w:b/>
-          <w:bCs/>
-        </w:rPr>
-        <w:t>Contenido de la lección: Los Modelos de Lenguaje Extensos (LLMs) operan bajo una arquitectura llamada Transformer. Este sistema permite que la IA preste "atención" a diferentes partes de una oración simultáneamente para comprender el sentido global. Antes de procesar una instrucción, la IA realiza la tokenización, convirtiendo el texto en vectores numéricos. Estos vectores se ubican en un espacio multidimensional donde las palabras con significados similares (como "perro" y "canino") se encuentran físicamente cerca.</w:t>
-      </w:r>
-    </w:p>
-    <w:p>
-      <w:pPr>
-        <w:rPr>
-          <w:rFonts w:ascii="Segoe UI Emoji" w:hAnsi="Segoe UI Emoji" w:cs="Segoe UI Emoji"/>
-          <w:b/>
-          <w:bCs/>
-        </w:rPr>
-      </w:pPr>
-      <w:r>
-        <w:rPr>
-          <w:rFonts w:ascii="Segoe UI Emoji" w:hAnsi="Segoe UI Emoji" w:cs="Segoe UI Emoji"/>
-          <w:b/>
-          <w:bCs/>
-        </w:rPr>
-        <w:t>Durante su entrenamiento, la IA analizó billones de secuencias de texto para aprender las reglas de sintaxis, tono y lógica del lenguaje humano. Por tanto, cuando le haces una pregunta, la IA no "busca" en una enciclopedia; en su lugar, utiliza su mapa de vectores para construir una respuesta coherente. La calidad de este resultado depende directamente de la claridad de los datos de entrada (el prompt) y de la capacidad del modelo para mantener el hilo conductor dentro de su "ventana de contexto".</w:t>
+        <w:t>¿Sabías que?: Un modelo como GPT-4 no lee palabras completas, sino "tokens". Por ejemplo, la palabra "</w:t>
+      </w:r>
+      <w:proofErr w:type="spellStart"/>
+      <w:r>
+        <w:rPr>
+          <w:rFonts w:ascii="Segoe UI Emoji" w:hAnsi="Segoe UI Emoji" w:cs="Segoe UI Emoji"/>
+          <w:b/>
+          <w:bCs/>
+        </w:rPr>
+        <w:t>Plattform</w:t>
+      </w:r>
+      <w:proofErr w:type="spellEnd"/>
+      <w:r>
+        <w:rPr>
+          <w:rFonts w:ascii="Segoe UI Emoji" w:hAnsi="Segoe UI Emoji" w:cs="Segoe UI Emoji"/>
+          <w:b/>
+          <w:bCs/>
+        </w:rPr>
+        <w:t>" podría dividirse en dos o tres fragmentos numéricos que la IA procesa por separado para entender su raíz y contexto.</w:t>
+      </w:r>
+    </w:p>
+    <w:p>
+      <w:pPr>
+        <w:rPr>
+          <w:rFonts w:ascii="Segoe UI Emoji" w:hAnsi="Segoe UI Emoji" w:cs="Segoe UI Emoji"/>
+          <w:b/>
+          <w:bCs/>
+        </w:rPr>
+      </w:pPr>
+      <w:r>
+        <w:rPr>
+          <w:rFonts w:ascii="Segoe UI Emoji" w:hAnsi="Segoe UI Emoji" w:cs="Segoe UI Emoji"/>
+          <w:b/>
+          <w:bCs/>
+        </w:rPr>
+        <w:t>Contenido de la lección: Los Modelos de Lenguaje Extensos (</w:t>
+      </w:r>
+      <w:proofErr w:type="spellStart"/>
+      <w:r>
+        <w:rPr>
+          <w:rFonts w:ascii="Segoe UI Emoji" w:hAnsi="Segoe UI Emoji" w:cs="Segoe UI Emoji"/>
+          <w:b/>
+          <w:bCs/>
+        </w:rPr>
+        <w:t>LLMs</w:t>
+      </w:r>
+      <w:proofErr w:type="spellEnd"/>
+      <w:r>
+        <w:rPr>
+          <w:rFonts w:ascii="Segoe UI Emoji" w:hAnsi="Segoe UI Emoji" w:cs="Segoe UI Emoji"/>
+          <w:b/>
+          <w:bCs/>
+        </w:rPr>
+        <w:t xml:space="preserve">) operan bajo una arquitectura llamada </w:t>
+      </w:r>
+      <w:proofErr w:type="spellStart"/>
+      <w:r>
+        <w:rPr>
+          <w:rFonts w:ascii="Segoe UI Emoji" w:hAnsi="Segoe UI Emoji" w:cs="Segoe UI Emoji"/>
+          <w:b/>
+          <w:bCs/>
+        </w:rPr>
+        <w:t>Transformer</w:t>
+      </w:r>
+      <w:proofErr w:type="spellEnd"/>
+      <w:r>
+        <w:rPr>
+          <w:rFonts w:ascii="Segoe UI Emoji" w:hAnsi="Segoe UI Emoji" w:cs="Segoe UI Emoji"/>
+          <w:b/>
+          <w:bCs/>
+        </w:rPr>
+        <w:t xml:space="preserve">. Este sistema permite que la IA preste "atención" a diferentes partes de una oración simultáneamente para comprender el sentido global. Antes de procesar una instrucción, la IA realiza la </w:t>
+      </w:r>
+      <w:proofErr w:type="spellStart"/>
+      <w:r>
+        <w:rPr>
+          <w:rFonts w:ascii="Segoe UI Emoji" w:hAnsi="Segoe UI Emoji" w:cs="Segoe UI Emoji"/>
+          <w:b/>
+          <w:bCs/>
+        </w:rPr>
+        <w:t>tokenización</w:t>
+      </w:r>
+      <w:proofErr w:type="spellEnd"/>
+      <w:r>
+        <w:rPr>
+          <w:rFonts w:ascii="Segoe UI Emoji" w:hAnsi="Segoe UI Emoji" w:cs="Segoe UI Emoji"/>
+          <w:b/>
+          <w:bCs/>
+        </w:rPr>
+        <w:t>, convirtiendo el texto en vectores numéricos. Estos vectores se ubican en un espacio multidimensional donde las palabras con significados similares (como "perro" y "canino") se encuentran físicamente cerca.</w:t>
+      </w:r>
+    </w:p>
+    <w:p>
+      <w:pPr>
+        <w:rPr>
+          <w:rFonts w:ascii="Segoe UI Emoji" w:hAnsi="Segoe UI Emoji" w:cs="Segoe UI Emoji"/>
+          <w:b/>
+          <w:bCs/>
+        </w:rPr>
+      </w:pPr>
+      <w:r>
+        <w:rPr>
+          <w:rFonts w:ascii="Segoe UI Emoji" w:hAnsi="Segoe UI Emoji" w:cs="Segoe UI Emoji"/>
+          <w:b/>
+          <w:bCs/>
+        </w:rPr>
+        <w:t xml:space="preserve">Durante su entrenamiento, la IA analizó billones de secuencias de texto para aprender las reglas de sintaxis, tono y lógica del lenguaje humano. Por tanto, cuando le haces una pregunta, la IA no "busca" en una enciclopedia; en su lugar, utiliza su mapa de vectores para construir una respuesta coherente. La calidad de este resultado depende directamente de la claridad de los datos de entrada (el </w:t>
+      </w:r>
+      <w:proofErr w:type="spellStart"/>
+      <w:r>
+        <w:rPr>
+          <w:rFonts w:ascii="Segoe UI Emoji" w:hAnsi="Segoe UI Emoji" w:cs="Segoe UI Emoji"/>
+          <w:b/>
+          <w:bCs/>
+        </w:rPr>
+        <w:t>prompt</w:t>
+      </w:r>
+      <w:proofErr w:type="spellEnd"/>
+      <w:r>
+        <w:rPr>
+          <w:rFonts w:ascii="Segoe UI Emoji" w:hAnsi="Segoe UI Emoji" w:cs="Segoe UI Emoji"/>
+          <w:b/>
+          <w:bCs/>
+        </w:rPr>
+        <w:t>) y de la capacidad del modelo para mantener el hilo conductor dentro de su "ventana de contexto".</w:t>
       </w:r>
     </w:p>
     <w:p>
@@ -418,7 +554,7 @@
           <w:bCs/>
         </w:rPr>
         <w:pict w14:anchorId="50E4C005">
-          <v:rect id="_x0000_i1230" style="width:0;height:1.5pt" o:hralign="center" o:hrstd="t" o:hr="t" fillcolor="#a0a0a0" stroked="f"/>
+          <v:rect id="_x0000_i1026" style="width:0;height:1.5pt" o:hralign="center" o:hrstd="t" o:hr="t" fillcolor="#a0a0a0" stroked="f"/>
         </w:pict>
       </w:r>
     </w:p>
@@ -436,8 +572,18 @@
           <w:b/>
           <w:bCs/>
         </w:rPr>
-        <w:t>🔹 LECCIÓN 3: Introducción a Prompts</w:t>
-      </w:r>
+        <w:t xml:space="preserve">🔹 LECCIÓN 3: Introducción a </w:t>
+      </w:r>
+      <w:proofErr w:type="spellStart"/>
+      <w:r>
+        <w:rPr>
+          <w:rFonts w:ascii="Segoe UI Emoji" w:hAnsi="Segoe UI Emoji" w:cs="Segoe UI Emoji"/>
+          <w:b/>
+          <w:bCs/>
+        </w:rPr>
+        <w:t>Prompts</w:t>
+      </w:r>
+      <w:proofErr w:type="spellEnd"/>
     </w:p>
     <w:p>
       <w:pPr>
@@ -586,6 +732,7 @@
         </w:rPr>
         <w:t xml:space="preserve">Contenido de la lección: Un </w:t>
       </w:r>
+      <w:proofErr w:type="spellStart"/>
       <w:r>
         <w:rPr>
           <w:rFonts w:ascii="Segoe UI Emoji" w:hAnsi="Segoe UI Emoji" w:cs="Segoe UI Emoji"/>
@@ -596,13 +743,32 @@
         </w:rPr>
         <w:t>prompt</w:t>
       </w:r>
-      <w:r>
-        <w:rPr>
-          <w:rFonts w:ascii="Segoe UI Emoji" w:hAnsi="Segoe UI Emoji" w:cs="Segoe UI Emoji"/>
-          <w:b/>
-          <w:bCs/>
-        </w:rPr>
-        <w:t xml:space="preserve"> no es una simple pregunta, es una instrucción técnica. Para obtener resultados profesionales, debemos abandonar el lenguaje coloquial vago y adoptar una estructura de ingeniería. Un prompt efectivo debe contener:</w:t>
+      <w:proofErr w:type="spellEnd"/>
+      <w:r>
+        <w:rPr>
+          <w:rFonts w:ascii="Segoe UI Emoji" w:hAnsi="Segoe UI Emoji" w:cs="Segoe UI Emoji"/>
+          <w:b/>
+          <w:bCs/>
+        </w:rPr>
+        <w:t xml:space="preserve"> no es una simple pregunta, es una instrucción técnica. Para obtener resultados profesionales, debemos abandonar el lenguaje coloquial vago y adoptar una estructura de ingeniería. Un </w:t>
+      </w:r>
+      <w:proofErr w:type="spellStart"/>
+      <w:r>
+        <w:rPr>
+          <w:rFonts w:ascii="Segoe UI Emoji" w:hAnsi="Segoe UI Emoji" w:cs="Segoe UI Emoji"/>
+          <w:b/>
+          <w:bCs/>
+        </w:rPr>
+        <w:t>prompt</w:t>
+      </w:r>
+      <w:proofErr w:type="spellEnd"/>
+      <w:r>
+        <w:rPr>
+          <w:rFonts w:ascii="Segoe UI Emoji" w:hAnsi="Segoe UI Emoji" w:cs="Segoe UI Emoji"/>
+          <w:b/>
+          <w:bCs/>
+        </w:rPr>
+        <w:t xml:space="preserve"> efectivo debe contener:</w:t>
       </w:r>
     </w:p>
     <w:p>
@@ -722,7 +888,7 @@
           <w:bCs/>
         </w:rPr>
         <w:pict w14:anchorId="72A758E7">
-          <v:rect id="_x0000_i1231" style="width:0;height:1.5pt" o:hralign="center" o:hrstd="t" o:hr="t" fillcolor="#a0a0a0" stroked="f"/>
+          <v:rect id="_x0000_i1027" style="width:0;height:1.5pt" o:hralign="center" o:hrstd="t" o:hr="t" fillcolor="#a0a0a0" stroked="f"/>
         </w:pict>
       </w:r>
     </w:p>
@@ -812,7 +978,25 @@
           <w:b/>
           <w:bCs/>
         </w:rPr>
-        <w:t>Métodos de Cross-check (verificación cruzada) entre modelos.</w:t>
+        <w:t>Métodos de Cross-</w:t>
+      </w:r>
+      <w:proofErr w:type="spellStart"/>
+      <w:r>
+        <w:rPr>
+          <w:rFonts w:ascii="Segoe UI Emoji" w:hAnsi="Segoe UI Emoji" w:cs="Segoe UI Emoji"/>
+          <w:b/>
+          <w:bCs/>
+        </w:rPr>
+        <w:t>check</w:t>
+      </w:r>
+      <w:proofErr w:type="spellEnd"/>
+      <w:r>
+        <w:rPr>
+          <w:rFonts w:ascii="Segoe UI Emoji" w:hAnsi="Segoe UI Emoji" w:cs="Segoe UI Emoji"/>
+          <w:b/>
+          <w:bCs/>
+        </w:rPr>
+        <w:t xml:space="preserve"> (verificación cruzada) entre modelos.</w:t>
       </w:r>
     </w:p>
     <w:p>
@@ -833,7 +1017,43 @@
           <w:b/>
           <w:bCs/>
         </w:rPr>
-        <w:t>La técnica de "Cadena de Pensamiento" (Chain of Thought).</w:t>
+        <w:t xml:space="preserve">La técnica de "Cadena de Pensamiento" (Chain </w:t>
+      </w:r>
+      <w:proofErr w:type="spellStart"/>
+      <w:r>
+        <w:rPr>
+          <w:rFonts w:ascii="Segoe UI Emoji" w:hAnsi="Segoe UI Emoji" w:cs="Segoe UI Emoji"/>
+          <w:b/>
+          <w:bCs/>
+        </w:rPr>
+        <w:t>of</w:t>
+      </w:r>
+      <w:proofErr w:type="spellEnd"/>
+      <w:r>
+        <w:rPr>
+          <w:rFonts w:ascii="Segoe UI Emoji" w:hAnsi="Segoe UI Emoji" w:cs="Segoe UI Emoji"/>
+          <w:b/>
+          <w:bCs/>
+        </w:rPr>
+        <w:t xml:space="preserve"> </w:t>
+      </w:r>
+      <w:proofErr w:type="spellStart"/>
+      <w:r>
+        <w:rPr>
+          <w:rFonts w:ascii="Segoe UI Emoji" w:hAnsi="Segoe UI Emoji" w:cs="Segoe UI Emoji"/>
+          <w:b/>
+          <w:bCs/>
+        </w:rPr>
+        <w:t>Thought</w:t>
+      </w:r>
+      <w:proofErr w:type="spellEnd"/>
+      <w:r>
+        <w:rPr>
+          <w:rFonts w:ascii="Segoe UI Emoji" w:hAnsi="Segoe UI Emoji" w:cs="Segoe UI Emoji"/>
+          <w:b/>
+          <w:bCs/>
+        </w:rPr>
+        <w:t>).</w:t>
       </w:r>
     </w:p>
     <w:p>
@@ -941,7 +1161,7 @@
           <w:bCs/>
         </w:rPr>
         <w:pict w14:anchorId="190A9500">
-          <v:rect id="_x0000_i1232" style="width:0;height:1.5pt" o:hralign="center" o:hrstd="t" o:hr="t" fillcolor="#a0a0a0" stroked="f"/>
+          <v:rect id="_x0000_i1028" style="width:0;height:1.5pt" o:hralign="center" o:hrstd="t" o:hr="t" fillcolor="#a0a0a0" stroked="f"/>
         </w:pict>
       </w:r>
     </w:p>
@@ -998,7 +1218,25 @@
           <w:bCs/>
         </w:rPr>
         <w:lastRenderedPageBreak/>
-        <w:t>Redacta un prompt pidiendo una explicación de "Física Cuántica" para un niño de 8 años.</w:t>
+        <w:t xml:space="preserve">Redacta un </w:t>
+      </w:r>
+      <w:proofErr w:type="spellStart"/>
+      <w:r>
+        <w:rPr>
+          <w:rFonts w:ascii="Segoe UI Emoji" w:hAnsi="Segoe UI Emoji" w:cs="Segoe UI Emoji"/>
+          <w:b/>
+          <w:bCs/>
+        </w:rPr>
+        <w:t>prompt</w:t>
+      </w:r>
+      <w:proofErr w:type="spellEnd"/>
+      <w:r>
+        <w:rPr>
+          <w:rFonts w:ascii="Segoe UI Emoji" w:hAnsi="Segoe UI Emoji" w:cs="Segoe UI Emoji"/>
+          <w:b/>
+          <w:bCs/>
+        </w:rPr>
+        <w:t xml:space="preserve"> pidiendo una explicación de "Física Cuántica" para un niño de 8 años.</w:t>
       </w:r>
     </w:p>
     <w:p>
@@ -1093,7 +1331,7 @@
           <w:bCs/>
         </w:rPr>
         <w:pict w14:anchorId="4602D6E0">
-          <v:rect id="_x0000_i1233" style="width:0;height:1.5pt" o:hralign="center" o:hrstd="t" o:hr="t" fillcolor="#a0a0a0" stroked="f"/>
+          <v:rect id="_x0000_i1029" style="width:0;height:1.5pt" o:hralign="center" o:hrstd="t" o:hr="t" fillcolor="#a0a0a0" stroked="f"/>
         </w:pict>
       </w:r>
     </w:p>
@@ -1112,7 +1350,7 @@
           <w:bCs/>
         </w:rPr>
         <w:pict w14:anchorId="75FA19DA">
-          <v:rect id="_x0000_i1234" style="width:0;height:1.5pt" o:hralign="center" o:hrstd="t" o:hr="t" fillcolor="#a0a0a0" stroked="f"/>
+          <v:rect id="_x0000_i1030" style="width:0;height:1.5pt" o:hralign="center" o:hrstd="t" o:hr="t" fillcolor="#a0a0a0" stroked="f"/>
         </w:pict>
       </w:r>
     </w:p>
@@ -1147,7 +1385,25 @@
           <w:b/>
           <w:bCs/>
         </w:rPr>
-        <w:t>🔹 LECCIÓN 1: Brainstorming con IA</w:t>
+        <w:t xml:space="preserve">🔹 LECCIÓN 1: </w:t>
+      </w:r>
+      <w:proofErr w:type="spellStart"/>
+      <w:r>
+        <w:rPr>
+          <w:rFonts w:ascii="Segoe UI Emoji" w:hAnsi="Segoe UI Emoji" w:cs="Segoe UI Emoji"/>
+          <w:b/>
+          <w:bCs/>
+        </w:rPr>
+        <w:t>Brainstorming</w:t>
+      </w:r>
+      <w:proofErr w:type="spellEnd"/>
+      <w:r>
+        <w:rPr>
+          <w:rFonts w:ascii="Segoe UI Emoji" w:hAnsi="Segoe UI Emoji" w:cs="Segoe UI Emoji"/>
+          <w:b/>
+          <w:bCs/>
+        </w:rPr>
+        <w:t xml:space="preserve"> con IA</w:t>
       </w:r>
     </w:p>
     <w:p>
@@ -1316,7 +1572,25 @@
           <w:b/>
           <w:bCs/>
         </w:rPr>
-        <w:t>Contenido de la lección: El brainstorming asistido por inteligencia artificial permite mitigar la fricción inicial del proceso creativo. El sistema utiliza modelos probabilísticos para explorar rutas de acción que el sesgo cognitivo humano suele omitir por hábito o limitación de perspectiva. El valor de este proceso no reside en que la IA "piense" de forma autónoma, sino en su capacidad para actuar como un catalizador de posibilidades.</w:t>
+        <w:t xml:space="preserve">Contenido de la lección: El </w:t>
+      </w:r>
+      <w:proofErr w:type="spellStart"/>
+      <w:r>
+        <w:rPr>
+          <w:rFonts w:ascii="Segoe UI Emoji" w:hAnsi="Segoe UI Emoji" w:cs="Segoe UI Emoji"/>
+          <w:b/>
+          <w:bCs/>
+        </w:rPr>
+        <w:t>brainstorming</w:t>
+      </w:r>
+      <w:proofErr w:type="spellEnd"/>
+      <w:r>
+        <w:rPr>
+          <w:rFonts w:ascii="Segoe UI Emoji" w:hAnsi="Segoe UI Emoji" w:cs="Segoe UI Emoji"/>
+          <w:b/>
+          <w:bCs/>
+        </w:rPr>
+        <w:t xml:space="preserve"> asistido por inteligencia artificial permite mitigar la fricción inicial del proceso creativo. El sistema utiliza modelos probabilísticos para explorar rutas de acción que el sesgo cognitivo humano suele omitir por hábito o limitación de perspectiva. El valor de este proceso no reside en que la IA "piense" de forma autónoma, sino en su capacidad para actuar como un catalizador de posibilidades.</w:t>
       </w:r>
     </w:p>
     <w:p>
@@ -1378,7 +1652,7 @@
           <w:bCs/>
         </w:rPr>
         <w:pict w14:anchorId="16BEAF2B">
-          <v:rect id="_x0000_i1235" style="width:0;height:1.5pt" o:hralign="center" o:hrstd="t" o:hr="t" fillcolor="#a0a0a0" stroked="f"/>
+          <v:rect id="_x0000_i1031" style="width:0;height:1.5pt" o:hralign="center" o:hrstd="t" o:hr="t" fillcolor="#a0a0a0" stroked="f"/>
         </w:pict>
       </w:r>
     </w:p>
@@ -1413,7 +1687,25 @@
           <w:b/>
           <w:bCs/>
         </w:rPr>
-        <w:t>Subtítulo: De la idea abstracta a la arquitectura lógica: Metodología WBS y hitos.</w:t>
+        <w:t xml:space="preserve">Subtítulo: De la idea abstracta a la arquitectura lógica: Metodología WBS </w:t>
+      </w:r>
+      <w:proofErr w:type="spellStart"/>
+      <w:r>
+        <w:rPr>
+          <w:rFonts w:ascii="Segoe UI Emoji" w:hAnsi="Segoe UI Emoji" w:cs="Segoe UI Emoji"/>
+          <w:b/>
+          <w:bCs/>
+        </w:rPr>
+        <w:t>y</w:t>
+      </w:r>
+      <w:proofErr w:type="spellEnd"/>
+      <w:r>
+        <w:rPr>
+          <w:rFonts w:ascii="Segoe UI Emoji" w:hAnsi="Segoe UI Emoji" w:cs="Segoe UI Emoji"/>
+          <w:b/>
+          <w:bCs/>
+        </w:rPr>
+        <w:t xml:space="preserve"> hitos.</w:t>
       </w:r>
     </w:p>
     <w:p>
@@ -1468,7 +1760,25 @@
           <w:b/>
           <w:bCs/>
         </w:rPr>
-        <w:t>Identificación de Milestones (hitos clave) del proyecto.</w:t>
+        <w:t xml:space="preserve">Identificación de </w:t>
+      </w:r>
+      <w:proofErr w:type="spellStart"/>
+      <w:r>
+        <w:rPr>
+          <w:rFonts w:ascii="Segoe UI Emoji" w:hAnsi="Segoe UI Emoji" w:cs="Segoe UI Emoji"/>
+          <w:b/>
+          <w:bCs/>
+        </w:rPr>
+        <w:t>Milestones</w:t>
+      </w:r>
+      <w:proofErr w:type="spellEnd"/>
+      <w:r>
+        <w:rPr>
+          <w:rFonts w:ascii="Segoe UI Emoji" w:hAnsi="Segoe UI Emoji" w:cs="Segoe UI Emoji"/>
+          <w:b/>
+          <w:bCs/>
+        </w:rPr>
+        <w:t xml:space="preserve"> (hitos clave) del proyecto.</w:t>
       </w:r>
     </w:p>
     <w:p>
@@ -1489,7 +1799,43 @@
           <w:b/>
           <w:bCs/>
         </w:rPr>
-        <w:t>Metodología WBS (Work Breakdown Structure): Desglose jerárquico de tareas.</w:t>
+        <w:t xml:space="preserve">Metodología WBS (Work </w:t>
+      </w:r>
+      <w:proofErr w:type="spellStart"/>
+      <w:r>
+        <w:rPr>
+          <w:rFonts w:ascii="Segoe UI Emoji" w:hAnsi="Segoe UI Emoji" w:cs="Segoe UI Emoji"/>
+          <w:b/>
+          <w:bCs/>
+        </w:rPr>
+        <w:t>Breakdown</w:t>
+      </w:r>
+      <w:proofErr w:type="spellEnd"/>
+      <w:r>
+        <w:rPr>
+          <w:rFonts w:ascii="Segoe UI Emoji" w:hAnsi="Segoe UI Emoji" w:cs="Segoe UI Emoji"/>
+          <w:b/>
+          <w:bCs/>
+        </w:rPr>
+        <w:t xml:space="preserve"> </w:t>
+      </w:r>
+      <w:proofErr w:type="spellStart"/>
+      <w:r>
+        <w:rPr>
+          <w:rFonts w:ascii="Segoe UI Emoji" w:hAnsi="Segoe UI Emoji" w:cs="Segoe UI Emoji"/>
+          <w:b/>
+          <w:bCs/>
+        </w:rPr>
+        <w:t>Structure</w:t>
+      </w:r>
+      <w:proofErr w:type="spellEnd"/>
+      <w:r>
+        <w:rPr>
+          <w:rFonts w:ascii="Segoe UI Emoji" w:hAnsi="Segoe UI Emoji" w:cs="Segoe UI Emoji"/>
+          <w:b/>
+          <w:bCs/>
+        </w:rPr>
+        <w:t>): Desglose jerárquico de tareas.</w:t>
       </w:r>
     </w:p>
     <w:p>
@@ -1548,7 +1894,25 @@
           <w:b/>
           <w:bCs/>
         </w:rPr>
-        <w:t>¿Sabías que?: Una IA configurada correctamente puede desglosar un proyecto complejo de meses en micro-tareas específicas en segundos, garantizando que no se omitan pasos técnicos fundamentales ni dependencias críticas en la fase de planificación inicial.</w:t>
+        <w:t xml:space="preserve">¿Sabías que?: Una IA configurada correctamente puede desglosar un proyecto complejo de meses en </w:t>
+      </w:r>
+      <w:proofErr w:type="spellStart"/>
+      <w:r>
+        <w:rPr>
+          <w:rFonts w:ascii="Segoe UI Emoji" w:hAnsi="Segoe UI Emoji" w:cs="Segoe UI Emoji"/>
+          <w:b/>
+          <w:bCs/>
+        </w:rPr>
+        <w:t>micro-tareas</w:t>
+      </w:r>
+      <w:proofErr w:type="spellEnd"/>
+      <w:r>
+        <w:rPr>
+          <w:rFonts w:ascii="Segoe UI Emoji" w:hAnsi="Segoe UI Emoji" w:cs="Segoe UI Emoji"/>
+          <w:b/>
+          <w:bCs/>
+        </w:rPr>
+        <w:t xml:space="preserve"> específicas en segundos, garantizando que no se omitan pasos técnicos fundamentales ni dependencias críticas en la fase de planificación inicial.</w:t>
       </w:r>
     </w:p>
     <w:p>
@@ -1582,7 +1946,25 @@
           <w:b/>
           <w:bCs/>
         </w:rPr>
-        <w:t>Este mapeo automatizado reduce drásticamente el margen de error administrativo y la incertidumbre operativa. Al alimentar al modelo con el contexto de tu equipo, herramientas y plazos, el plan resultante deja de ser una lista de deseos para convertirse en una arquitectura técnica que define el "qué", el "cómo" y el "cuándo". Esto permite que el líder del proyecto se concentre en la supervisión de calidad y la gestión de imprevistos complejos, en lugar de agotar recursos en la micro-organización logística inicial.</w:t>
+        <w:t xml:space="preserve">Este mapeo automatizado reduce drásticamente el margen de error administrativo y la incertidumbre operativa. Al alimentar al modelo con el contexto de tu equipo, herramientas y plazos, el plan resultante deja de ser una lista de deseos para convertirse en una arquitectura técnica que define el "qué", el "cómo" y el "cuándo". Esto permite que el líder del proyecto se concentre en la supervisión de calidad y la gestión de imprevistos complejos, en lugar de agotar recursos en la </w:t>
+      </w:r>
+      <w:proofErr w:type="spellStart"/>
+      <w:r>
+        <w:rPr>
+          <w:rFonts w:ascii="Segoe UI Emoji" w:hAnsi="Segoe UI Emoji" w:cs="Segoe UI Emoji"/>
+          <w:b/>
+          <w:bCs/>
+        </w:rPr>
+        <w:t>micro-organización</w:t>
+      </w:r>
+      <w:proofErr w:type="spellEnd"/>
+      <w:r>
+        <w:rPr>
+          <w:rFonts w:ascii="Segoe UI Emoji" w:hAnsi="Segoe UI Emoji" w:cs="Segoe UI Emoji"/>
+          <w:b/>
+          <w:bCs/>
+        </w:rPr>
+        <w:t xml:space="preserve"> logística inicial.</w:t>
       </w:r>
     </w:p>
     <w:p>
@@ -1600,7 +1982,7 @@
           <w:bCs/>
         </w:rPr>
         <w:pict w14:anchorId="2C52B88C">
-          <v:rect id="_x0000_i1236" style="width:0;height:1.5pt" o:hralign="center" o:hrstd="t" o:hr="t" fillcolor="#a0a0a0" stroked="f"/>
+          <v:rect id="_x0000_i1032" style="width:0;height:1.5pt" o:hralign="center" o:hrstd="t" o:hr="t" fillcolor="#a0a0a0" stroked="f"/>
         </w:pict>
       </w:r>
     </w:p>
@@ -1635,7 +2017,25 @@
           <w:b/>
           <w:bCs/>
         </w:rPr>
-        <w:t>Subtítulo: Definición de KPIs, análisis de riesgos y alineación de objetivos a largo plazo.</w:t>
+        <w:t xml:space="preserve">Subtítulo: Definición de </w:t>
+      </w:r>
+      <w:proofErr w:type="spellStart"/>
+      <w:r>
+        <w:rPr>
+          <w:rFonts w:ascii="Segoe UI Emoji" w:hAnsi="Segoe UI Emoji" w:cs="Segoe UI Emoji"/>
+          <w:b/>
+          <w:bCs/>
+        </w:rPr>
+        <w:t>KPIs</w:t>
+      </w:r>
+      <w:proofErr w:type="spellEnd"/>
+      <w:r>
+        <w:rPr>
+          <w:rFonts w:ascii="Segoe UI Emoji" w:hAnsi="Segoe UI Emoji" w:cs="Segoe UI Emoji"/>
+          <w:b/>
+          <w:bCs/>
+        </w:rPr>
+        <w:t>, análisis de riesgos y alineación de objetivos a largo plazo.</w:t>
       </w:r>
     </w:p>
     <w:p>
@@ -1712,7 +2112,25 @@
           <w:bCs/>
         </w:rPr>
         <w:lastRenderedPageBreak/>
-        <w:t>Establecimiento de KPIs (indicadores de éxito) cuantificables y exactos.</w:t>
+        <w:t xml:space="preserve">Establecimiento de </w:t>
+      </w:r>
+      <w:proofErr w:type="spellStart"/>
+      <w:r>
+        <w:rPr>
+          <w:rFonts w:ascii="Segoe UI Emoji" w:hAnsi="Segoe UI Emoji" w:cs="Segoe UI Emoji"/>
+          <w:b/>
+          <w:bCs/>
+        </w:rPr>
+        <w:t>KPIs</w:t>
+      </w:r>
+      <w:proofErr w:type="spellEnd"/>
+      <w:r>
+        <w:rPr>
+          <w:rFonts w:ascii="Segoe UI Emoji" w:hAnsi="Segoe UI Emoji" w:cs="Segoe UI Emoji"/>
+          <w:b/>
+          <w:bCs/>
+        </w:rPr>
+        <w:t xml:space="preserve"> (indicadores de éxito) cuantificables y exactos.</w:t>
       </w:r>
     </w:p>
     <w:p>
@@ -1733,7 +2151,25 @@
           <w:b/>
           <w:bCs/>
         </w:rPr>
-        <w:t>Técnica de Red Teaming: Simulación de fallas para fortalecer el plan.</w:t>
+        <w:t xml:space="preserve">Técnica de Red </w:t>
+      </w:r>
+      <w:proofErr w:type="spellStart"/>
+      <w:r>
+        <w:rPr>
+          <w:rFonts w:ascii="Segoe UI Emoji" w:hAnsi="Segoe UI Emoji" w:cs="Segoe UI Emoji"/>
+          <w:b/>
+          <w:bCs/>
+        </w:rPr>
+        <w:t>Teaming</w:t>
+      </w:r>
+      <w:proofErr w:type="spellEnd"/>
+      <w:r>
+        <w:rPr>
+          <w:rFonts w:ascii="Segoe UI Emoji" w:hAnsi="Segoe UI Emoji" w:cs="Segoe UI Emoji"/>
+          <w:b/>
+          <w:bCs/>
+        </w:rPr>
+        <w:t>: Simulación de fallas para fortalecer el plan.</w:t>
       </w:r>
     </w:p>
     <w:p>
@@ -1788,24 +2224,60 @@
           <w:b/>
           <w:bCs/>
         </w:rPr>
-        <w:t>Contenido de la lección: La planeación estratégica con IA consiste en proyectar resultados mediante el manejo de variables controladas. Un uso avanzado y altamente recomendado es el Red Teaming: consiste en entregar tu plan terminado a la IA e instruirla para que actúe como un consultor implacable que identifique 5 razones técnicas por las que el plan podría fallar.</w:t>
-      </w:r>
-    </w:p>
-    <w:p>
-      <w:pPr>
-        <w:rPr>
-          <w:rFonts w:ascii="Segoe UI Emoji" w:hAnsi="Segoe UI Emoji" w:cs="Segoe UI Emoji"/>
-          <w:b/>
-          <w:bCs/>
-        </w:rPr>
-      </w:pPr>
-      <w:r>
-        <w:rPr>
-          <w:rFonts w:ascii="Segoe UI Emoji" w:hAnsi="Segoe UI Emoji" w:cs="Segoe UI Emoji"/>
-          <w:b/>
-          <w:bCs/>
-        </w:rPr>
-        <w:t>Este ejercicio ayuda a detectar puntos ciegos y debilidades lógicas antes de asignar recursos financieros o humanos reales. Además, la IA asiste en la definición de KPIs exactos para cada fase, asegurando que el éxito no sea una percepción subjetiva, sino un dato medible. La estrategia resultante es más resiliente y está mejor preparada para enfrentar contingencias, ya que los riesgos han sido mapeados, analizados y mitigados desde la fase de diseño técnico, garantizando una ejecución alineada con los objetivos de negocio.</w:t>
+        <w:t xml:space="preserve">Contenido de la lección: La planeación estratégica con IA consiste en proyectar resultados mediante el manejo de variables controladas. Un uso avanzado y altamente recomendado es el Red </w:t>
+      </w:r>
+      <w:proofErr w:type="spellStart"/>
+      <w:r>
+        <w:rPr>
+          <w:rFonts w:ascii="Segoe UI Emoji" w:hAnsi="Segoe UI Emoji" w:cs="Segoe UI Emoji"/>
+          <w:b/>
+          <w:bCs/>
+        </w:rPr>
+        <w:t>Teaming</w:t>
+      </w:r>
+      <w:proofErr w:type="spellEnd"/>
+      <w:r>
+        <w:rPr>
+          <w:rFonts w:ascii="Segoe UI Emoji" w:hAnsi="Segoe UI Emoji" w:cs="Segoe UI Emoji"/>
+          <w:b/>
+          <w:bCs/>
+        </w:rPr>
+        <w:t>: consiste en entregar tu plan terminado a la IA e instruirla para que actúe como un consultor implacable que identifique 5 razones técnicas por las que el plan podría fallar.</w:t>
+      </w:r>
+    </w:p>
+    <w:p>
+      <w:pPr>
+        <w:rPr>
+          <w:rFonts w:ascii="Segoe UI Emoji" w:hAnsi="Segoe UI Emoji" w:cs="Segoe UI Emoji"/>
+          <w:b/>
+          <w:bCs/>
+        </w:rPr>
+      </w:pPr>
+      <w:r>
+        <w:rPr>
+          <w:rFonts w:ascii="Segoe UI Emoji" w:hAnsi="Segoe UI Emoji" w:cs="Segoe UI Emoji"/>
+          <w:b/>
+          <w:bCs/>
+        </w:rPr>
+        <w:t xml:space="preserve">Este ejercicio ayuda a detectar puntos ciegos y debilidades lógicas antes de asignar recursos financieros o humanos reales. Además, la IA asiste en la definición de </w:t>
+      </w:r>
+      <w:proofErr w:type="spellStart"/>
+      <w:r>
+        <w:rPr>
+          <w:rFonts w:ascii="Segoe UI Emoji" w:hAnsi="Segoe UI Emoji" w:cs="Segoe UI Emoji"/>
+          <w:b/>
+          <w:bCs/>
+        </w:rPr>
+        <w:t>KPIs</w:t>
+      </w:r>
+      <w:proofErr w:type="spellEnd"/>
+      <w:r>
+        <w:rPr>
+          <w:rFonts w:ascii="Segoe UI Emoji" w:hAnsi="Segoe UI Emoji" w:cs="Segoe UI Emoji"/>
+          <w:b/>
+          <w:bCs/>
+        </w:rPr>
+        <w:t xml:space="preserve"> exactos para cada fase, asegurando que el éxito no sea una percepción subjetiva, sino un dato medible. La estrategia resultante es más resiliente y está mejor preparada para enfrentar contingencias, ya que los riesgos han sido mapeados, analizados y mitigados desde la fase de diseño técnico, garantizando una ejecución alineada con los objetivos de negocio.</w:t>
       </w:r>
     </w:p>
     <w:p>
@@ -1823,7 +2295,7 @@
           <w:bCs/>
         </w:rPr>
         <w:pict w14:anchorId="7C7EA7F9">
-          <v:rect id="_x0000_i1237" style="width:0;height:1.5pt" o:hralign="center" o:hrstd="t" o:hr="t" fillcolor="#a0a0a0" stroked="f"/>
+          <v:rect id="_x0000_i1033" style="width:0;height:1.5pt" o:hralign="center" o:hrstd="t" o:hr="t" fillcolor="#a0a0a0" stroked="f"/>
         </w:pict>
       </w:r>
     </w:p>
@@ -2046,7 +2518,7 @@
           <w:bCs/>
         </w:rPr>
         <w:pict w14:anchorId="21FF08D9">
-          <v:rect id="_x0000_i1238" style="width:0;height:1.5pt" o:hralign="center" o:hrstd="t" o:hr="t" fillcolor="#a0a0a0" stroked="f"/>
+          <v:rect id="_x0000_i1034" style="width:0;height:1.5pt" o:hralign="center" o:hrstd="t" o:hr="t" fillcolor="#a0a0a0" stroked="f"/>
         </w:pict>
       </w:r>
     </w:p>
@@ -2102,7 +2574,25 @@
           <w:b/>
           <w:bCs/>
         </w:rPr>
-        <w:t xml:space="preserve">Define un micro-proyecto (ej. </w:t>
+        <w:t xml:space="preserve">Define un </w:t>
+      </w:r>
+      <w:proofErr w:type="spellStart"/>
+      <w:r>
+        <w:rPr>
+          <w:rFonts w:ascii="Segoe UI Emoji" w:hAnsi="Segoe UI Emoji" w:cs="Segoe UI Emoji"/>
+          <w:b/>
+          <w:bCs/>
+        </w:rPr>
+        <w:t>micro-proyecto</w:t>
+      </w:r>
+      <w:proofErr w:type="spellEnd"/>
+      <w:r>
+        <w:rPr>
+          <w:rFonts w:ascii="Segoe UI Emoji" w:hAnsi="Segoe UI Emoji" w:cs="Segoe UI Emoji"/>
+          <w:b/>
+          <w:bCs/>
+        </w:rPr>
+        <w:t xml:space="preserve"> (ej. </w:t>
       </w:r>
       <w:r>
         <w:rPr>
@@ -2218,7 +2708,7 @@
           <w:bCs/>
         </w:rPr>
         <w:pict w14:anchorId="50033D61">
-          <v:rect id="_x0000_i1239" style="width:0;height:1.5pt" o:hralign="center" o:hrstd="t" o:hr="t" fillcolor="#a0a0a0" stroked="f"/>
+          <v:rect id="_x0000_i1035" style="width:0;height:1.5pt" o:hralign="center" o:hrstd="t" o:hr="t" fillcolor="#a0a0a0" stroked="f"/>
         </w:pict>
       </w:r>
     </w:p>
@@ -2237,7 +2727,7 @@
           <w:bCs/>
         </w:rPr>
         <w:pict w14:anchorId="27569632">
-          <v:rect id="_x0000_i1240" style="width:0;height:1.5pt" o:hralign="center" o:hrstd="t" o:hr="t" fillcolor="#a0a0a0" stroked="f"/>
+          <v:rect id="_x0000_i1036" style="width:0;height:1.5pt" o:hralign="center" o:hrstd="t" o:hr="t" fillcolor="#a0a0a0" stroked="f"/>
         </w:pict>
       </w:r>
     </w:p>
@@ -2289,7 +2779,25 @@
           <w:b/>
           <w:bCs/>
         </w:rPr>
-        <w:t>Subtítulo: Optimización de recolección de datos y distinción entre motores tradicionales y LLMs.</w:t>
+        <w:t xml:space="preserve">Subtítulo: Optimización de recolección de datos y distinción entre motores tradicionales y </w:t>
+      </w:r>
+      <w:proofErr w:type="spellStart"/>
+      <w:r>
+        <w:rPr>
+          <w:rFonts w:ascii="Segoe UI Emoji" w:hAnsi="Segoe UI Emoji" w:cs="Segoe UI Emoji"/>
+          <w:b/>
+          <w:bCs/>
+        </w:rPr>
+        <w:t>LLMs</w:t>
+      </w:r>
+      <w:proofErr w:type="spellEnd"/>
+      <w:r>
+        <w:rPr>
+          <w:rFonts w:ascii="Segoe UI Emoji" w:hAnsi="Segoe UI Emoji" w:cs="Segoe UI Emoji"/>
+          <w:b/>
+          <w:bCs/>
+        </w:rPr>
+        <w:t>.</w:t>
       </w:r>
     </w:p>
     <w:p>
@@ -2495,7 +3003,7 @@
           <w:bCs/>
         </w:rPr>
         <w:pict w14:anchorId="3FCCBB7B">
-          <v:rect id="_x0000_i1241" style="width:0;height:1.5pt" o:hralign="center" o:hrstd="t" o:hr="t" fillcolor="#a0a0a0" stroked="f"/>
+          <v:rect id="_x0000_i1037" style="width:0;height:1.5pt" o:hralign="center" o:hrstd="t" o:hr="t" fillcolor="#a0a0a0" stroked="f"/>
         </w:pict>
       </w:r>
     </w:p>
@@ -2650,6 +3158,7 @@
         </w:rPr>
         <w:t xml:space="preserve">Generación de </w:t>
       </w:r>
+      <w:proofErr w:type="spellStart"/>
       <w:r>
         <w:rPr>
           <w:rFonts w:ascii="Segoe UI Emoji" w:hAnsi="Segoe UI Emoji" w:cs="Segoe UI Emoji"/>
@@ -2658,7 +3167,18 @@
           <w:i/>
           <w:iCs/>
         </w:rPr>
-        <w:t>Bullet Points</w:t>
+        <w:t>Bullet</w:t>
+      </w:r>
+      <w:proofErr w:type="spellEnd"/>
+      <w:r>
+        <w:rPr>
+          <w:rFonts w:ascii="Segoe UI Emoji" w:hAnsi="Segoe UI Emoji" w:cs="Segoe UI Emoji"/>
+          <w:b/>
+          <w:bCs/>
+          <w:i/>
+          <w:iCs/>
+        </w:rPr>
+        <w:t xml:space="preserve"> Points</w:t>
       </w:r>
       <w:r>
         <w:rPr>
@@ -2780,7 +3300,7 @@
           <w:bCs/>
         </w:rPr>
         <w:pict w14:anchorId="2C4123D1">
-          <v:rect id="_x0000_i1242" style="width:0;height:1.5pt" o:hralign="center" o:hrstd="t" o:hr="t" fillcolor="#a0a0a0" stroked="f"/>
+          <v:rect id="_x0000_i1038" style="width:0;height:1.5pt" o:hralign="center" o:hrstd="t" o:hr="t" fillcolor="#a0a0a0" stroked="f"/>
         </w:pict>
       </w:r>
     </w:p>
@@ -3004,6 +3524,7 @@
         </w:rPr>
         <w:t>Este enfoque elimina la subjetividad inherente al juicio humano. La IA genera tablas comparativas donde se visualizan las concesiones (</w:t>
       </w:r>
+      <w:proofErr w:type="spellStart"/>
       <w:r>
         <w:rPr>
           <w:rFonts w:ascii="Segoe UI Emoji" w:hAnsi="Segoe UI Emoji" w:cs="Segoe UI Emoji"/>
@@ -3014,6 +3535,7 @@
         </w:rPr>
         <w:t>trade-offs</w:t>
       </w:r>
+      <w:proofErr w:type="spellEnd"/>
       <w:r>
         <w:rPr>
           <w:rFonts w:ascii="Segoe UI Emoji" w:hAnsi="Segoe UI Emoji" w:cs="Segoe UI Emoji"/>
@@ -3038,7 +3560,7 @@
           <w:bCs/>
         </w:rPr>
         <w:pict w14:anchorId="5A07E35D">
-          <v:rect id="_x0000_i1243" style="width:0;height:1.5pt" o:hralign="center" o:hrstd="t" o:hr="t" fillcolor="#a0a0a0" stroked="f"/>
+          <v:rect id="_x0000_i1039" style="width:0;height:1.5pt" o:hralign="center" o:hrstd="t" o:hr="t" fillcolor="#a0a0a0" stroked="f"/>
         </w:pict>
       </w:r>
     </w:p>
@@ -3261,7 +3783,7 @@
           <w:bCs/>
         </w:rPr>
         <w:pict w14:anchorId="7BAA49D6">
-          <v:rect id="_x0000_i1244" style="width:0;height:1.5pt" o:hralign="center" o:hrstd="t" o:hr="t" fillcolor="#a0a0a0" stroked="f"/>
+          <v:rect id="_x0000_i1040" style="width:0;height:1.5pt" o:hralign="center" o:hrstd="t" o:hr="t" fillcolor="#a0a0a0" stroked="f"/>
         </w:pict>
       </w:r>
     </w:p>
@@ -3398,7 +3920,25 @@
           <w:b/>
           <w:bCs/>
         </w:rPr>
-        <w:t>Redacta una conclusión final basada estrictamente en la información validada.</w:t>
+        <w:t xml:space="preserve">Redacta una </w:t>
+      </w:r>
+      <w:proofErr w:type="gramStart"/>
+      <w:r>
+        <w:rPr>
+          <w:rFonts w:ascii="Segoe UI Emoji" w:hAnsi="Segoe UI Emoji" w:cs="Segoe UI Emoji"/>
+          <w:b/>
+          <w:bCs/>
+        </w:rPr>
+        <w:t>conclusión final</w:t>
+      </w:r>
+      <w:proofErr w:type="gramEnd"/>
+      <w:r>
+        <w:rPr>
+          <w:rFonts w:ascii="Segoe UI Emoji" w:hAnsi="Segoe UI Emoji" w:cs="Segoe UI Emoji"/>
+          <w:b/>
+          <w:bCs/>
+        </w:rPr>
+        <w:t xml:space="preserve"> basada estrictamente en la información validada.</w:t>
       </w:r>
     </w:p>
     <w:p>
@@ -3434,7 +3974,7 @@
         </w:rPr>
         <w:lastRenderedPageBreak/>
         <w:pict w14:anchorId="4EDF9BE4">
-          <v:rect id="_x0000_i1245" style="width:0;height:1.5pt" o:hralign="center" o:hrstd="t" o:hr="t" fillcolor="#a0a0a0" stroked="f"/>
+          <v:rect id="_x0000_i1041" style="width:0;height:1.5pt" o:hralign="center" o:hrstd="t" o:hr="t" fillcolor="#a0a0a0" stroked="f"/>
         </w:pict>
       </w:r>
     </w:p>
@@ -3453,7 +3993,7 @@
           <w:bCs/>
         </w:rPr>
         <w:pict w14:anchorId="736C4B1F">
-          <v:rect id="_x0000_i1246" style="width:0;height:1.5pt" o:hralign="center" o:hrstd="t" o:hr="t" fillcolor="#a0a0a0" stroked="f"/>
+          <v:rect id="_x0000_i1042" style="width:0;height:1.5pt" o:hralign="center" o:hrstd="t" o:hr="t" fillcolor="#a0a0a0" stroked="f"/>
         </w:pict>
       </w:r>
     </w:p>
@@ -3692,7 +4232,7 @@
           <w:bCs/>
         </w:rPr>
         <w:pict w14:anchorId="1C8AE78A">
-          <v:rect id="_x0000_i1247" style="width:0;height:1.5pt" o:hralign="center" o:hrstd="t" o:hr="t" fillcolor="#a0a0a0" stroked="f"/>
+          <v:rect id="_x0000_i1043" style="width:0;height:1.5pt" o:hralign="center" o:hrstd="t" o:hr="t" fillcolor="#a0a0a0" stroked="f"/>
         </w:pict>
       </w:r>
     </w:p>
@@ -3890,7 +4430,29 @@
           <w:i/>
           <w:iCs/>
         </w:rPr>
-        <w:t>"Reescribe este párrafo para un cliente externo, manteniendo el rigor técnico pero utilizando un lenguaje accesible"</w:t>
+        <w:t xml:space="preserve">"Reescribe este párrafo para un cliente externo, manteniendo el rigor </w:t>
+      </w:r>
+      <w:proofErr w:type="gramStart"/>
+      <w:r>
+        <w:rPr>
+          <w:rFonts w:ascii="Segoe UI Emoji" w:hAnsi="Segoe UI Emoji" w:cs="Segoe UI Emoji"/>
+          <w:b/>
+          <w:bCs/>
+          <w:i/>
+          <w:iCs/>
+        </w:rPr>
+        <w:t>técnico</w:t>
+      </w:r>
+      <w:proofErr w:type="gramEnd"/>
+      <w:r>
+        <w:rPr>
+          <w:rFonts w:ascii="Segoe UI Emoji" w:hAnsi="Segoe UI Emoji" w:cs="Segoe UI Emoji"/>
+          <w:b/>
+          <w:bCs/>
+          <w:i/>
+          <w:iCs/>
+        </w:rPr>
+        <w:t xml:space="preserve"> pero utilizando un lenguaje accesible"</w:t>
       </w:r>
       <w:r>
         <w:rPr>
@@ -3933,7 +4495,7 @@
           <w:bCs/>
         </w:rPr>
         <w:pict w14:anchorId="17E1559A">
-          <v:rect id="_x0000_i1248" style="width:0;height:1.5pt" o:hralign="center" o:hrstd="t" o:hr="t" fillcolor="#a0a0a0" stroked="f"/>
+          <v:rect id="_x0000_i1044" style="width:0;height:1.5pt" o:hralign="center" o:hrstd="t" o:hr="t" fillcolor="#a0a0a0" stroked="f"/>
         </w:pict>
       </w:r>
     </w:p>
@@ -4065,7 +4627,25 @@
           <w:b/>
           <w:bCs/>
         </w:rPr>
-        <w:t>Inclusión de CTAs (llamadas a la acción) directas y sin ambigüedad.</w:t>
+        <w:t xml:space="preserve">Inclusión de </w:t>
+      </w:r>
+      <w:proofErr w:type="spellStart"/>
+      <w:r>
+        <w:rPr>
+          <w:rFonts w:ascii="Segoe UI Emoji" w:hAnsi="Segoe UI Emoji" w:cs="Segoe UI Emoji"/>
+          <w:b/>
+          <w:bCs/>
+        </w:rPr>
+        <w:t>CTAs</w:t>
+      </w:r>
+      <w:proofErr w:type="spellEnd"/>
+      <w:r>
+        <w:rPr>
+          <w:rFonts w:ascii="Segoe UI Emoji" w:hAnsi="Segoe UI Emoji" w:cs="Segoe UI Emoji"/>
+          <w:b/>
+          <w:bCs/>
+        </w:rPr>
+        <w:t xml:space="preserve"> (llamadas a la acción) directas y sin ambigüedad.</w:t>
       </w:r>
     </w:p>
     <w:p>
@@ -4164,7 +4744,7 @@
           <w:bCs/>
         </w:rPr>
         <w:pict w14:anchorId="3A9DBED3">
-          <v:rect id="_x0000_i1249" style="width:0;height:1.5pt" o:hralign="center" o:hrstd="t" o:hr="t" fillcolor="#a0a0a0" stroked="f"/>
+          <v:rect id="_x0000_i1045" style="width:0;height:1.5pt" o:hralign="center" o:hrstd="t" o:hr="t" fillcolor="#a0a0a0" stroked="f"/>
         </w:pict>
       </w:r>
     </w:p>
@@ -4404,7 +4984,7 @@
           <w:bCs/>
         </w:rPr>
         <w:pict w14:anchorId="50AE823D">
-          <v:rect id="_x0000_i1250" style="width:0;height:1.5pt" o:hralign="center" o:hrstd="t" o:hr="t" fillcolor="#a0a0a0" stroked="f"/>
+          <v:rect id="_x0000_i1046" style="width:0;height:1.5pt" o:hralign="center" o:hrstd="t" o:hr="t" fillcolor="#a0a0a0" stroked="f"/>
         </w:pict>
       </w:r>
     </w:p>
@@ -4559,7 +5139,7 @@
           <w:bCs/>
         </w:rPr>
         <w:pict w14:anchorId="51C732FA">
-          <v:rect id="_x0000_i1251" style="width:0;height:1.5pt" o:hralign="center" o:hrstd="t" o:hr="t" fillcolor="#a0a0a0" stroked="f"/>
+          <v:rect id="_x0000_i1047" style="width:0;height:1.5pt" o:hralign="center" o:hrstd="t" o:hr="t" fillcolor="#a0a0a0" stroked="f"/>
         </w:pict>
       </w:r>
     </w:p>
@@ -4577,10 +5157,1346 @@
           <w:b/>
           <w:bCs/>
         </w:rPr>
-        <w:t>¿Qué te parece este rediseño, Master Instructor? Cada lección tiene ahora su dato curioso para mantener el enganche y el contenido expandido para justificar el valor del curso. 🦅🏁🚀</w:t>
+        <w:t xml:space="preserve">¿Qué te parece este rediseño, </w:t>
+      </w:r>
+      <w:proofErr w:type="gramStart"/>
+      <w:r>
+        <w:rPr>
+          <w:rFonts w:ascii="Segoe UI Emoji" w:hAnsi="Segoe UI Emoji" w:cs="Segoe UI Emoji"/>
+          <w:b/>
+          <w:bCs/>
+        </w:rPr>
+        <w:t>Master</w:t>
+      </w:r>
+      <w:proofErr w:type="gramEnd"/>
+      <w:r>
+        <w:rPr>
+          <w:rFonts w:ascii="Segoe UI Emoji" w:hAnsi="Segoe UI Emoji" w:cs="Segoe UI Emoji"/>
+          <w:b/>
+          <w:bCs/>
+        </w:rPr>
+        <w:t xml:space="preserve"> Instructor? Cada lección tiene ahora su dato curioso para mantener el enganche y el contenido expandido para justificar el valor del curso. 🦅🏁🚀</w:t>
       </w:r>
     </w:p>
     <w:p/>
+    <w:p/>
+    <w:p/>
+    <w:p/>
+    <w:p/>
+    <w:p/>
+    <w:p/>
+    <w:p/>
+    <w:p/>
+    <w:p/>
+    <w:p/>
+    <w:p/>
+    <w:p/>
+    <w:p/>
+    <w:p/>
+    <w:p/>
+    <w:p/>
+    <w:p/>
+    <w:p/>
+    <w:p/>
+    <w:p/>
+    <w:p>
+      <w:pPr>
+        <w:rPr>
+          <w:b/>
+          <w:bCs/>
+        </w:rPr>
+      </w:pPr>
+      <w:r>
+        <w:rPr>
+          <w:rFonts w:ascii="Segoe UI Emoji" w:hAnsi="Segoe UI Emoji" w:cs="Segoe UI Emoji"/>
+          <w:b/>
+          <w:bCs/>
+        </w:rPr>
+        <w:lastRenderedPageBreak/>
+        <w:t>📝</w:t>
+      </w:r>
+      <w:r>
+        <w:rPr>
+          <w:b/>
+          <w:bCs/>
+        </w:rPr>
+        <w:t xml:space="preserve"> EXAMEN FINAL – FUNDAMENTOS Y APLICACIONES DE IA</w:t>
+      </w:r>
+    </w:p>
+    <w:p>
+      <w:r>
+        <w:pict w14:anchorId="23274FAF">
+          <v:rect id="_x0000_i1168" style="width:0;height:1.5pt" o:hralign="center" o:hrstd="t" o:hr="t" fillcolor="#a0a0a0" stroked="f"/>
+        </w:pict>
+      </w:r>
+    </w:p>
+    <w:p>
+      <w:pPr>
+        <w:rPr>
+          <w:b/>
+          <w:bCs/>
+        </w:rPr>
+      </w:pPr>
+      <w:r>
+        <w:rPr>
+          <w:b/>
+          <w:bCs/>
+        </w:rPr>
+        <w:t>1. ¿Cuál es la característica principal de la IA actual?</w:t>
+      </w:r>
+    </w:p>
+    <w:p>
+      <w:r>
+        <w:t>A) Tiene conciencia y toma decisiones autónomas</w:t>
+      </w:r>
+      <w:r>
+        <w:br/>
+        <w:t>B) Funciona mediante predicción estadística de patrones</w:t>
+      </w:r>
+      <w:r>
+        <w:br/>
+        <w:t>C) Aprende únicamente con supervisión humana directa</w:t>
+      </w:r>
+      <w:r>
+        <w:br/>
+        <w:t>D) Comprende el contexto como un humano</w:t>
+      </w:r>
+    </w:p>
+    <w:p>
+      <w:r>
+        <w:rPr>
+          <w:rFonts w:ascii="Segoe UI Emoji" w:hAnsi="Segoe UI Emoji" w:cs="Segoe UI Emoji"/>
+        </w:rPr>
+        <w:t>✅</w:t>
+      </w:r>
+      <w:r>
+        <w:t xml:space="preserve"> </w:t>
+      </w:r>
+      <w:r>
+        <w:rPr>
+          <w:b/>
+          <w:bCs/>
+        </w:rPr>
+        <w:t>Respuesta correcta: B</w:t>
+      </w:r>
+    </w:p>
+    <w:p>
+      <w:r>
+        <w:pict w14:anchorId="3628C178">
+          <v:rect id="_x0000_i1169" style="width:0;height:1.5pt" o:hralign="center" o:hrstd="t" o:hr="t" fillcolor="#a0a0a0" stroked="f"/>
+        </w:pict>
+      </w:r>
+    </w:p>
+    <w:p>
+      <w:pPr>
+        <w:rPr>
+          <w:b/>
+          <w:bCs/>
+        </w:rPr>
+      </w:pPr>
+      <w:r>
+        <w:rPr>
+          <w:b/>
+          <w:bCs/>
+        </w:rPr>
+        <w:t>2. ¿Qué significa antropomorfizar la IA?</w:t>
+      </w:r>
+    </w:p>
+    <w:p>
+      <w:r>
+        <w:t>A) Mejorar su rendimiento técnico</w:t>
+      </w:r>
+      <w:r>
+        <w:br/>
+        <w:t>B) Convertirla en software empresarial</w:t>
+      </w:r>
+      <w:r>
+        <w:br/>
+        <w:t>C) Atribuirle características humanas</w:t>
+      </w:r>
+      <w:r>
+        <w:br/>
+        <w:t>D) Programarla con emociones</w:t>
+      </w:r>
+    </w:p>
+    <w:p>
+      <w:r>
+        <w:rPr>
+          <w:rFonts w:ascii="Segoe UI Emoji" w:hAnsi="Segoe UI Emoji" w:cs="Segoe UI Emoji"/>
+        </w:rPr>
+        <w:t>✅</w:t>
+      </w:r>
+      <w:r>
+        <w:t xml:space="preserve"> </w:t>
+      </w:r>
+      <w:r>
+        <w:rPr>
+          <w:b/>
+          <w:bCs/>
+        </w:rPr>
+        <w:t>Respuesta correcta: C</w:t>
+      </w:r>
+    </w:p>
+    <w:p>
+      <w:r>
+        <w:pict w14:anchorId="5492EAB7">
+          <v:rect id="_x0000_i1170" style="width:0;height:1.5pt" o:hralign="center" o:hrstd="t" o:hr="t" fillcolor="#a0a0a0" stroked="f"/>
+        </w:pict>
+      </w:r>
+    </w:p>
+    <w:p>
+      <w:pPr>
+        <w:rPr>
+          <w:b/>
+          <w:bCs/>
+        </w:rPr>
+      </w:pPr>
+      <w:r>
+        <w:rPr>
+          <w:b/>
+          <w:bCs/>
+        </w:rPr>
+        <w:t>3. ¿Cuál es la principal diferencia entre IA predictiva y generativa?</w:t>
+      </w:r>
+    </w:p>
+    <w:p>
+      <w:r>
+        <w:t>A) Una usa datos y la otra no</w:t>
+      </w:r>
+      <w:r>
+        <w:br/>
+        <w:t xml:space="preserve">B) Una analiza datos y la otra </w:t>
+      </w:r>
+      <w:proofErr w:type="gramStart"/>
+      <w:r>
+        <w:t>crea contenido</w:t>
+      </w:r>
+      <w:proofErr w:type="gramEnd"/>
+      <w:r>
+        <w:br/>
+        <w:t>C) Una es más rápida que la otra</w:t>
+      </w:r>
+      <w:r>
+        <w:br/>
+        <w:t>D) No hay diferencia real</w:t>
+      </w:r>
+    </w:p>
+    <w:p>
+      <w:r>
+        <w:rPr>
+          <w:rFonts w:ascii="Segoe UI Emoji" w:hAnsi="Segoe UI Emoji" w:cs="Segoe UI Emoji"/>
+        </w:rPr>
+        <w:t>✅</w:t>
+      </w:r>
+      <w:r>
+        <w:t xml:space="preserve"> </w:t>
+      </w:r>
+      <w:r>
+        <w:rPr>
+          <w:b/>
+          <w:bCs/>
+        </w:rPr>
+        <w:t>Respuesta correcta: B</w:t>
+      </w:r>
+    </w:p>
+    <w:p>
+      <w:r>
+        <w:pict w14:anchorId="23434B52">
+          <v:rect id="_x0000_i1171" style="width:0;height:1.5pt" o:hralign="center" o:hrstd="t" o:hr="t" fillcolor="#a0a0a0" stroked="f"/>
+        </w:pict>
+      </w:r>
+    </w:p>
+    <w:p>
+      <w:pPr>
+        <w:rPr>
+          <w:b/>
+          <w:bCs/>
+        </w:rPr>
+      </w:pPr>
+      <w:r>
+        <w:rPr>
+          <w:b/>
+          <w:bCs/>
+        </w:rPr>
+        <w:t>4. ¿Qué es un “token” en modelos de lenguaje?</w:t>
+      </w:r>
+    </w:p>
+    <w:p>
+      <w:r>
+        <w:t>A) Una palabra completa</w:t>
+      </w:r>
+      <w:r>
+        <w:br/>
+        <w:t>B) Un archivo de datos</w:t>
+      </w:r>
+      <w:r>
+        <w:br/>
+        <w:t>C) Una unidad fragmentada de texto procesada por la IA</w:t>
+      </w:r>
+      <w:r>
+        <w:br/>
+        <w:t xml:space="preserve">D) Un tipo de </w:t>
+      </w:r>
+      <w:proofErr w:type="spellStart"/>
+      <w:r>
+        <w:t>prompt</w:t>
+      </w:r>
+      <w:proofErr w:type="spellEnd"/>
+    </w:p>
+    <w:p>
+      <w:r>
+        <w:rPr>
+          <w:rFonts w:ascii="Segoe UI Emoji" w:hAnsi="Segoe UI Emoji" w:cs="Segoe UI Emoji"/>
+        </w:rPr>
+        <w:t>✅</w:t>
+      </w:r>
+      <w:r>
+        <w:t xml:space="preserve"> </w:t>
+      </w:r>
+      <w:r>
+        <w:rPr>
+          <w:b/>
+          <w:bCs/>
+        </w:rPr>
+        <w:t>Respuesta correcta: C</w:t>
+      </w:r>
+    </w:p>
+    <w:p>
+      <w:r>
+        <w:pict w14:anchorId="67AD3E49">
+          <v:rect id="_x0000_i1172" style="width:0;height:1.5pt" o:hralign="center" o:hrstd="t" o:hr="t" fillcolor="#a0a0a0" stroked="f"/>
+        </w:pict>
+      </w:r>
+    </w:p>
+    <w:p>
+      <w:pPr>
+        <w:rPr>
+          <w:b/>
+          <w:bCs/>
+        </w:rPr>
+      </w:pPr>
+      <w:r>
+        <w:rPr>
+          <w:b/>
+          <w:bCs/>
+        </w:rPr>
+        <w:t>5. ¿Qué elemento influye más en la calidad del output de la IA?</w:t>
+      </w:r>
+    </w:p>
+    <w:p>
+      <w:r>
+        <w:t>A) La velocidad del internet</w:t>
+      </w:r>
+      <w:r>
+        <w:br/>
+        <w:t>B) El modelo de computadora</w:t>
+      </w:r>
+      <w:r>
+        <w:br/>
+      </w:r>
+      <w:r>
+        <w:lastRenderedPageBreak/>
+        <w:t xml:space="preserve">C) La calidad del </w:t>
+      </w:r>
+      <w:proofErr w:type="spellStart"/>
+      <w:r>
+        <w:t>prompt</w:t>
+      </w:r>
+      <w:proofErr w:type="spellEnd"/>
+      <w:r>
+        <w:br/>
+        <w:t>D) El idioma</w:t>
+      </w:r>
+    </w:p>
+    <w:p>
+      <w:r>
+        <w:rPr>
+          <w:rFonts w:ascii="Segoe UI Emoji" w:hAnsi="Segoe UI Emoji" w:cs="Segoe UI Emoji"/>
+        </w:rPr>
+        <w:t>✅</w:t>
+      </w:r>
+      <w:r>
+        <w:t xml:space="preserve"> </w:t>
+      </w:r>
+      <w:r>
+        <w:rPr>
+          <w:b/>
+          <w:bCs/>
+        </w:rPr>
+        <w:t>Respuesta correcta: C</w:t>
+      </w:r>
+    </w:p>
+    <w:p>
+      <w:r>
+        <w:pict w14:anchorId="7C3B6AE1">
+          <v:rect id="_x0000_i1173" style="width:0;height:1.5pt" o:hralign="center" o:hrstd="t" o:hr="t" fillcolor="#a0a0a0" stroked="f"/>
+        </w:pict>
+      </w:r>
+    </w:p>
+    <w:p>
+      <w:pPr>
+        <w:rPr>
+          <w:b/>
+          <w:bCs/>
+        </w:rPr>
+      </w:pPr>
+      <w:r>
+        <w:rPr>
+          <w:b/>
+          <w:bCs/>
+        </w:rPr>
+        <w:t xml:space="preserve">6. ¿Cuál NO es un componente de un buen </w:t>
+      </w:r>
+      <w:proofErr w:type="spellStart"/>
+      <w:r>
+        <w:rPr>
+          <w:b/>
+          <w:bCs/>
+        </w:rPr>
+        <w:t>prompt</w:t>
+      </w:r>
+      <w:proofErr w:type="spellEnd"/>
+      <w:r>
+        <w:rPr>
+          <w:b/>
+          <w:bCs/>
+        </w:rPr>
+        <w:t>?</w:t>
+      </w:r>
+    </w:p>
+    <w:p>
+      <w:r>
+        <w:t>A) Contexto</w:t>
+      </w:r>
+      <w:r>
+        <w:br/>
+        <w:t>B) Tarea</w:t>
+      </w:r>
+      <w:r>
+        <w:br/>
+        <w:t xml:space="preserve">C) </w:t>
+      </w:r>
+      <w:proofErr w:type="gramStart"/>
+      <w:r>
+        <w:t>Opinión personal</w:t>
+      </w:r>
+      <w:proofErr w:type="gramEnd"/>
+      <w:r>
+        <w:br/>
+        <w:t>D) Formato</w:t>
+      </w:r>
+    </w:p>
+    <w:p>
+      <w:r>
+        <w:rPr>
+          <w:rFonts w:ascii="Segoe UI Emoji" w:hAnsi="Segoe UI Emoji" w:cs="Segoe UI Emoji"/>
+        </w:rPr>
+        <w:t>✅</w:t>
+      </w:r>
+      <w:r>
+        <w:t xml:space="preserve"> </w:t>
+      </w:r>
+      <w:r>
+        <w:rPr>
+          <w:b/>
+          <w:bCs/>
+        </w:rPr>
+        <w:t>Respuesta correcta: C</w:t>
+      </w:r>
+    </w:p>
+    <w:p>
+      <w:r>
+        <w:pict w14:anchorId="0E803D51">
+          <v:rect id="_x0000_i1174" style="width:0;height:1.5pt" o:hralign="center" o:hrstd="t" o:hr="t" fillcolor="#a0a0a0" stroked="f"/>
+        </w:pict>
+      </w:r>
+    </w:p>
+    <w:p>
+      <w:pPr>
+        <w:rPr>
+          <w:b/>
+          <w:bCs/>
+        </w:rPr>
+      </w:pPr>
+      <w:r>
+        <w:rPr>
+          <w:b/>
+          <w:bCs/>
+        </w:rPr>
+        <w:t>7. ¿Qué es una “alucinación” en IA?</w:t>
+      </w:r>
+    </w:p>
+    <w:p>
+      <w:r>
+        <w:t>A) Un error técnico del sistema</w:t>
+      </w:r>
+      <w:r>
+        <w:br/>
+        <w:t>B) Una respuesta falsa presentada como correcta</w:t>
+      </w:r>
+      <w:r>
+        <w:br/>
+        <w:t>C) Una caída del servidor</w:t>
+      </w:r>
+      <w:r>
+        <w:br/>
+        <w:t>D) Un problema de conexión</w:t>
+      </w:r>
+    </w:p>
+    <w:p>
+      <w:r>
+        <w:rPr>
+          <w:rFonts w:ascii="Segoe UI Emoji" w:hAnsi="Segoe UI Emoji" w:cs="Segoe UI Emoji"/>
+        </w:rPr>
+        <w:t>✅</w:t>
+      </w:r>
+      <w:r>
+        <w:t xml:space="preserve"> </w:t>
+      </w:r>
+      <w:r>
+        <w:rPr>
+          <w:b/>
+          <w:bCs/>
+        </w:rPr>
+        <w:t>Respuesta correcta: B</w:t>
+      </w:r>
+    </w:p>
+    <w:p>
+      <w:r>
+        <w:pict w14:anchorId="68BCFE67">
+          <v:rect id="_x0000_i1175" style="width:0;height:1.5pt" o:hralign="center" o:hrstd="t" o:hr="t" fillcolor="#a0a0a0" stroked="f"/>
+        </w:pict>
+      </w:r>
+    </w:p>
+    <w:p>
+      <w:pPr>
+        <w:rPr>
+          <w:b/>
+          <w:bCs/>
+        </w:rPr>
+      </w:pPr>
+      <w:r>
+        <w:rPr>
+          <w:b/>
+          <w:bCs/>
+        </w:rPr>
+        <w:t>8. ¿Cuál es el principio de “</w:t>
+      </w:r>
+      <w:proofErr w:type="spellStart"/>
+      <w:r>
+        <w:rPr>
+          <w:b/>
+          <w:bCs/>
+        </w:rPr>
+        <w:t>garbage</w:t>
+      </w:r>
+      <w:proofErr w:type="spellEnd"/>
+      <w:r>
+        <w:rPr>
+          <w:b/>
+          <w:bCs/>
+        </w:rPr>
+        <w:t xml:space="preserve"> in, </w:t>
+      </w:r>
+      <w:proofErr w:type="spellStart"/>
+      <w:r>
+        <w:rPr>
+          <w:b/>
+          <w:bCs/>
+        </w:rPr>
+        <w:t>garbage</w:t>
+      </w:r>
+      <w:proofErr w:type="spellEnd"/>
+      <w:r>
+        <w:rPr>
+          <w:b/>
+          <w:bCs/>
+        </w:rPr>
+        <w:t xml:space="preserve"> </w:t>
+      </w:r>
+      <w:proofErr w:type="spellStart"/>
+      <w:r>
+        <w:rPr>
+          <w:b/>
+          <w:bCs/>
+        </w:rPr>
+        <w:t>out</w:t>
+      </w:r>
+      <w:proofErr w:type="spellEnd"/>
+      <w:r>
+        <w:rPr>
+          <w:b/>
+          <w:bCs/>
+        </w:rPr>
+        <w:t>”?</w:t>
+      </w:r>
+    </w:p>
+    <w:p>
+      <w:r>
+        <w:t>A) La IA limpia los datos automáticamente</w:t>
+      </w:r>
+      <w:r>
+        <w:br/>
+        <w:t>B) La calidad del resultado depende de la calidad del input</w:t>
+      </w:r>
+      <w:r>
+        <w:br/>
+        <w:t>C) La IA elimina errores</w:t>
+      </w:r>
+      <w:r>
+        <w:br/>
+        <w:t>D) Los datos no importan</w:t>
+      </w:r>
+    </w:p>
+    <w:p>
+      <w:r>
+        <w:rPr>
+          <w:rFonts w:ascii="Segoe UI Emoji" w:hAnsi="Segoe UI Emoji" w:cs="Segoe UI Emoji"/>
+        </w:rPr>
+        <w:t>✅</w:t>
+      </w:r>
+      <w:r>
+        <w:t xml:space="preserve"> </w:t>
+      </w:r>
+      <w:r>
+        <w:rPr>
+          <w:b/>
+          <w:bCs/>
+        </w:rPr>
+        <w:t>Respuesta correcta: B</w:t>
+      </w:r>
+    </w:p>
+    <w:p>
+      <w:r>
+        <w:pict w14:anchorId="3578952D">
+          <v:rect id="_x0000_i1176" style="width:0;height:1.5pt" o:hralign="center" o:hrstd="t" o:hr="t" fillcolor="#a0a0a0" stroked="f"/>
+        </w:pict>
+      </w:r>
+    </w:p>
+    <w:p>
+      <w:pPr>
+        <w:rPr>
+          <w:b/>
+          <w:bCs/>
+        </w:rPr>
+      </w:pPr>
+      <w:r>
+        <w:rPr>
+          <w:b/>
+          <w:bCs/>
+        </w:rPr>
+        <w:t>9. ¿Cuál es el rol correcto del humano al usar IA?</w:t>
+      </w:r>
+    </w:p>
+    <w:p>
+      <w:r>
+        <w:t>A) Dejar que la IA decida todo</w:t>
+      </w:r>
+      <w:r>
+        <w:br/>
+        <w:t xml:space="preserve">B) Solo ejecutar </w:t>
+      </w:r>
+      <w:proofErr w:type="spellStart"/>
+      <w:r>
+        <w:t>prompts</w:t>
+      </w:r>
+      <w:proofErr w:type="spellEnd"/>
+      <w:r>
+        <w:br/>
+        <w:t>C) Auditar y validar resultados</w:t>
+      </w:r>
+      <w:r>
+        <w:br/>
+        <w:t>D) Evitar usarla</w:t>
+      </w:r>
+    </w:p>
+    <w:p>
+      <w:r>
+        <w:rPr>
+          <w:rFonts w:ascii="Segoe UI Emoji" w:hAnsi="Segoe UI Emoji" w:cs="Segoe UI Emoji"/>
+        </w:rPr>
+        <w:t>✅</w:t>
+      </w:r>
+      <w:r>
+        <w:t xml:space="preserve"> </w:t>
+      </w:r>
+      <w:r>
+        <w:rPr>
+          <w:b/>
+          <w:bCs/>
+        </w:rPr>
+        <w:t>Respuesta correcta: C</w:t>
+      </w:r>
+    </w:p>
+    <w:p>
+      <w:r>
+        <w:pict w14:anchorId="6DFFBE6E">
+          <v:rect id="_x0000_i1177" style="width:0;height:1.5pt" o:hralign="center" o:hrstd="t" o:hr="t" fillcolor="#a0a0a0" stroked="f"/>
+        </w:pict>
+      </w:r>
+    </w:p>
+    <w:p>
+      <w:pPr>
+        <w:rPr>
+          <w:b/>
+          <w:bCs/>
+        </w:rPr>
+      </w:pPr>
+      <w:r>
+        <w:rPr>
+          <w:b/>
+          <w:bCs/>
+        </w:rPr>
+        <w:t xml:space="preserve">10. ¿Para qué se utiliza el </w:t>
+      </w:r>
+      <w:proofErr w:type="spellStart"/>
+      <w:r>
+        <w:rPr>
+          <w:b/>
+          <w:bCs/>
+        </w:rPr>
+        <w:t>brainstorming</w:t>
+      </w:r>
+      <w:proofErr w:type="spellEnd"/>
+      <w:r>
+        <w:rPr>
+          <w:b/>
+          <w:bCs/>
+        </w:rPr>
+        <w:t xml:space="preserve"> con IA?</w:t>
+      </w:r>
+    </w:p>
+    <w:p>
+      <w:r>
+        <w:lastRenderedPageBreak/>
+        <w:t>A) Reducir ideas</w:t>
+      </w:r>
+      <w:r>
+        <w:br/>
+        <w:t>B) Generar múltiples opciones rápidamente</w:t>
+      </w:r>
+      <w:r>
+        <w:br/>
+        <w:t>C) Validar información</w:t>
+      </w:r>
+      <w:r>
+        <w:br/>
+        <w:t>D) Crear código</w:t>
+      </w:r>
+    </w:p>
+    <w:p>
+      <w:r>
+        <w:rPr>
+          <w:rFonts w:ascii="Segoe UI Emoji" w:hAnsi="Segoe UI Emoji" w:cs="Segoe UI Emoji"/>
+        </w:rPr>
+        <w:t>✅</w:t>
+      </w:r>
+      <w:r>
+        <w:t xml:space="preserve"> </w:t>
+      </w:r>
+      <w:r>
+        <w:rPr>
+          <w:b/>
+          <w:bCs/>
+        </w:rPr>
+        <w:t>Respuesta correcta: B</w:t>
+      </w:r>
+    </w:p>
+    <w:p>
+      <w:r>
+        <w:pict w14:anchorId="07396F0F">
+          <v:rect id="_x0000_i1178" style="width:0;height:1.5pt" o:hralign="center" o:hrstd="t" o:hr="t" fillcolor="#a0a0a0" stroked="f"/>
+        </w:pict>
+      </w:r>
+    </w:p>
+    <w:p>
+      <w:pPr>
+        <w:rPr>
+          <w:b/>
+          <w:bCs/>
+        </w:rPr>
+      </w:pPr>
+      <w:r>
+        <w:rPr>
+          <w:b/>
+          <w:bCs/>
+        </w:rPr>
+        <w:t>11. ¿Qué representa la metodología WBS?</w:t>
+      </w:r>
+    </w:p>
+    <w:p>
+      <w:r>
+        <w:t>A) Un sistema de IA</w:t>
+      </w:r>
+      <w:r>
+        <w:br/>
+        <w:t>B) Una técnica de redacción</w:t>
+      </w:r>
+      <w:r>
+        <w:br/>
+        <w:t>C) Un desglose estructurado de tareas</w:t>
+      </w:r>
+      <w:r>
+        <w:br/>
+        <w:t>D) Un modelo de datos</w:t>
+      </w:r>
+    </w:p>
+    <w:p>
+      <w:r>
+        <w:rPr>
+          <w:rFonts w:ascii="Segoe UI Emoji" w:hAnsi="Segoe UI Emoji" w:cs="Segoe UI Emoji"/>
+        </w:rPr>
+        <w:t>✅</w:t>
+      </w:r>
+      <w:r>
+        <w:t xml:space="preserve"> </w:t>
+      </w:r>
+      <w:r>
+        <w:rPr>
+          <w:b/>
+          <w:bCs/>
+        </w:rPr>
+        <w:t>Respuesta correcta: C</w:t>
+      </w:r>
+    </w:p>
+    <w:p>
+      <w:r>
+        <w:pict w14:anchorId="416657E8">
+          <v:rect id="_x0000_i1179" style="width:0;height:1.5pt" o:hralign="center" o:hrstd="t" o:hr="t" fillcolor="#a0a0a0" stroked="f"/>
+        </w:pict>
+      </w:r>
+    </w:p>
+    <w:p>
+      <w:pPr>
+        <w:rPr>
+          <w:b/>
+          <w:bCs/>
+        </w:rPr>
+      </w:pPr>
+      <w:r>
+        <w:rPr>
+          <w:b/>
+          <w:bCs/>
+        </w:rPr>
+        <w:t>12. ¿Qué técnica permite identificar fallas en un plan?</w:t>
+      </w:r>
+    </w:p>
+    <w:p>
+      <w:r>
+        <w:t xml:space="preserve">A) </w:t>
+      </w:r>
+      <w:proofErr w:type="spellStart"/>
+      <w:r>
+        <w:t>Prompt</w:t>
+      </w:r>
+      <w:proofErr w:type="spellEnd"/>
+      <w:r>
+        <w:t xml:space="preserve"> básico</w:t>
+      </w:r>
+      <w:r>
+        <w:br/>
+        <w:t xml:space="preserve">B) Red </w:t>
+      </w:r>
+      <w:proofErr w:type="spellStart"/>
+      <w:r>
+        <w:t>Teaming</w:t>
+      </w:r>
+      <w:proofErr w:type="spellEnd"/>
+      <w:r>
+        <w:br/>
+        <w:t xml:space="preserve">C) </w:t>
+      </w:r>
+      <w:proofErr w:type="spellStart"/>
+      <w:r>
+        <w:t>Tokenización</w:t>
+      </w:r>
+      <w:proofErr w:type="spellEnd"/>
+      <w:r>
+        <w:br/>
+        <w:t>D) Iteración simple</w:t>
+      </w:r>
+    </w:p>
+    <w:p>
+      <w:r>
+        <w:rPr>
+          <w:rFonts w:ascii="Segoe UI Emoji" w:hAnsi="Segoe UI Emoji" w:cs="Segoe UI Emoji"/>
+        </w:rPr>
+        <w:t>✅</w:t>
+      </w:r>
+      <w:r>
+        <w:t xml:space="preserve"> </w:t>
+      </w:r>
+      <w:r>
+        <w:rPr>
+          <w:b/>
+          <w:bCs/>
+        </w:rPr>
+        <w:t>Respuesta correcta: B</w:t>
+      </w:r>
+    </w:p>
+    <w:p>
+      <w:r>
+        <w:pict w14:anchorId="0E4747BC">
+          <v:rect id="_x0000_i1180" style="width:0;height:1.5pt" o:hralign="center" o:hrstd="t" o:hr="t" fillcolor="#a0a0a0" stroked="f"/>
+        </w:pict>
+      </w:r>
+    </w:p>
+    <w:p>
+      <w:pPr>
+        <w:rPr>
+          <w:b/>
+          <w:bCs/>
+        </w:rPr>
+      </w:pPr>
+      <w:r>
+        <w:rPr>
+          <w:b/>
+          <w:bCs/>
+        </w:rPr>
+        <w:t>13. ¿Cuál es la principal ventaja de la IA en investigación?</w:t>
+      </w:r>
+    </w:p>
+    <w:p>
+      <w:r>
+        <w:t>A) Reemplazar fuentes</w:t>
+      </w:r>
+      <w:r>
+        <w:br/>
+        <w:t>B) Generar información perfecta</w:t>
+      </w:r>
+      <w:r>
+        <w:br/>
+        <w:t>C) Procesar grandes volúmenes rápidamente</w:t>
+      </w:r>
+      <w:r>
+        <w:br/>
+        <w:t>D) Eliminar errores</w:t>
+      </w:r>
+    </w:p>
+    <w:p>
+      <w:r>
+        <w:rPr>
+          <w:rFonts w:ascii="Segoe UI Emoji" w:hAnsi="Segoe UI Emoji" w:cs="Segoe UI Emoji"/>
+        </w:rPr>
+        <w:t>✅</w:t>
+      </w:r>
+      <w:r>
+        <w:t xml:space="preserve"> </w:t>
+      </w:r>
+      <w:r>
+        <w:rPr>
+          <w:b/>
+          <w:bCs/>
+        </w:rPr>
+        <w:t>Respuesta correcta: C</w:t>
+      </w:r>
+    </w:p>
+    <w:p>
+      <w:r>
+        <w:pict w14:anchorId="5F97B2B7">
+          <v:rect id="_x0000_i1181" style="width:0;height:1.5pt" o:hralign="center" o:hrstd="t" o:hr="t" fillcolor="#a0a0a0" stroked="f"/>
+        </w:pict>
+      </w:r>
+    </w:p>
+    <w:p>
+      <w:pPr>
+        <w:rPr>
+          <w:b/>
+          <w:bCs/>
+        </w:rPr>
+      </w:pPr>
+      <w:r>
+        <w:rPr>
+          <w:b/>
+          <w:bCs/>
+        </w:rPr>
+        <w:t>14. ¿Qué diferencia hay entre Google y la IA en investigación?</w:t>
+      </w:r>
+    </w:p>
+    <w:p>
+      <w:r>
+        <w:t>A) No hay diferencia</w:t>
+      </w:r>
+      <w:r>
+        <w:br/>
+        <w:t>B) Google crea contenido</w:t>
+      </w:r>
+      <w:r>
+        <w:br/>
+        <w:t>C) La IA procesa información, Google indexa resultados</w:t>
+      </w:r>
+      <w:r>
+        <w:br/>
+        <w:t>D) Google es más inteligente</w:t>
+      </w:r>
+    </w:p>
+    <w:p>
+      <w:r>
+        <w:rPr>
+          <w:rFonts w:ascii="Segoe UI Emoji" w:hAnsi="Segoe UI Emoji" w:cs="Segoe UI Emoji"/>
+        </w:rPr>
+        <w:t>✅</w:t>
+      </w:r>
+      <w:r>
+        <w:t xml:space="preserve"> </w:t>
+      </w:r>
+      <w:r>
+        <w:rPr>
+          <w:b/>
+          <w:bCs/>
+        </w:rPr>
+        <w:t>Respuesta correcta: C</w:t>
+      </w:r>
+    </w:p>
+    <w:p>
+      <w:r>
+        <w:pict w14:anchorId="59AFF1E4">
+          <v:rect id="_x0000_i1182" style="width:0;height:1.5pt" o:hralign="center" o:hrstd="t" o:hr="t" fillcolor="#a0a0a0" stroked="f"/>
+        </w:pict>
+      </w:r>
+    </w:p>
+    <w:p>
+      <w:pPr>
+        <w:rPr>
+          <w:b/>
+          <w:bCs/>
+        </w:rPr>
+      </w:pPr>
+      <w:r>
+        <w:rPr>
+          <w:b/>
+          <w:bCs/>
+        </w:rPr>
+        <w:lastRenderedPageBreak/>
+        <w:t>15. ¿Qué implica la triangulación de información?</w:t>
+      </w:r>
+    </w:p>
+    <w:p>
+      <w:r>
+        <w:t>A) Generar más contenido</w:t>
+      </w:r>
+      <w:r>
+        <w:br/>
+        <w:t>B) Validar información con múltiples fuentes</w:t>
+      </w:r>
+      <w:r>
+        <w:br/>
+        <w:t>C) Usar solo IA</w:t>
+      </w:r>
+      <w:r>
+        <w:br/>
+        <w:t>D) Simplificar datos</w:t>
+      </w:r>
+    </w:p>
+    <w:p>
+      <w:r>
+        <w:rPr>
+          <w:rFonts w:ascii="Segoe UI Emoji" w:hAnsi="Segoe UI Emoji" w:cs="Segoe UI Emoji"/>
+        </w:rPr>
+        <w:t>✅</w:t>
+      </w:r>
+      <w:r>
+        <w:t xml:space="preserve"> </w:t>
+      </w:r>
+      <w:r>
+        <w:rPr>
+          <w:b/>
+          <w:bCs/>
+        </w:rPr>
+        <w:t>Respuesta correcta: B</w:t>
+      </w:r>
+    </w:p>
+    <w:p>
+      <w:r>
+        <w:pict w14:anchorId="4DDFA8BF">
+          <v:rect id="_x0000_i1183" style="width:0;height:1.5pt" o:hralign="center" o:hrstd="t" o:hr="t" fillcolor="#a0a0a0" stroked="f"/>
+        </w:pict>
+      </w:r>
+    </w:p>
+    <w:p>
+      <w:pPr>
+        <w:rPr>
+          <w:b/>
+          <w:bCs/>
+        </w:rPr>
+      </w:pPr>
+      <w:r>
+        <w:rPr>
+          <w:b/>
+          <w:bCs/>
+        </w:rPr>
+        <w:t>16. ¿Cuál es el objetivo de la síntesis de información?</w:t>
+      </w:r>
+    </w:p>
+    <w:p>
+      <w:r>
+        <w:t>A) Hacer el texto más largo</w:t>
+      </w:r>
+      <w:r>
+        <w:br/>
+        <w:t>B) Eliminar contenido</w:t>
+      </w:r>
+      <w:r>
+        <w:br/>
+        <w:t>C) Mantener lo esencial reduciendo volumen</w:t>
+      </w:r>
+      <w:r>
+        <w:br/>
+        <w:t>D) Cambiar el tema</w:t>
+      </w:r>
+    </w:p>
+    <w:p>
+      <w:r>
+        <w:rPr>
+          <w:rFonts w:ascii="Segoe UI Emoji" w:hAnsi="Segoe UI Emoji" w:cs="Segoe UI Emoji"/>
+        </w:rPr>
+        <w:t>✅</w:t>
+      </w:r>
+      <w:r>
+        <w:t xml:space="preserve"> </w:t>
+      </w:r>
+      <w:r>
+        <w:rPr>
+          <w:b/>
+          <w:bCs/>
+        </w:rPr>
+        <w:t>Respuesta correcta: C</w:t>
+      </w:r>
+    </w:p>
+    <w:p>
+      <w:r>
+        <w:pict w14:anchorId="185976F7">
+          <v:rect id="_x0000_i1184" style="width:0;height:1.5pt" o:hralign="center" o:hrstd="t" o:hr="t" fillcolor="#a0a0a0" stroked="f"/>
+        </w:pict>
+      </w:r>
+    </w:p>
+    <w:p>
+      <w:pPr>
+        <w:rPr>
+          <w:b/>
+          <w:bCs/>
+        </w:rPr>
+      </w:pPr>
+      <w:r>
+        <w:rPr>
+          <w:b/>
+          <w:bCs/>
+        </w:rPr>
+        <w:t>17. ¿Qué es el método BLUF?</w:t>
+      </w:r>
+    </w:p>
+    <w:p>
+      <w:r>
+        <w:t>A) Un tipo de IA</w:t>
+      </w:r>
+      <w:r>
+        <w:br/>
+        <w:t>B) Poner la conclusión al inicio del mensaje</w:t>
+      </w:r>
+      <w:r>
+        <w:br/>
+        <w:t>C) Un modelo matemático</w:t>
+      </w:r>
+      <w:r>
+        <w:br/>
+        <w:t xml:space="preserve">D) Un formato de </w:t>
+      </w:r>
+      <w:proofErr w:type="spellStart"/>
+      <w:r>
+        <w:t>prompt</w:t>
+      </w:r>
+      <w:proofErr w:type="spellEnd"/>
+    </w:p>
+    <w:p>
+      <w:r>
+        <w:rPr>
+          <w:rFonts w:ascii="Segoe UI Emoji" w:hAnsi="Segoe UI Emoji" w:cs="Segoe UI Emoji"/>
+        </w:rPr>
+        <w:t>✅</w:t>
+      </w:r>
+      <w:r>
+        <w:t xml:space="preserve"> </w:t>
+      </w:r>
+      <w:r>
+        <w:rPr>
+          <w:b/>
+          <w:bCs/>
+        </w:rPr>
+        <w:t>Respuesta correcta: B</w:t>
+      </w:r>
+    </w:p>
+    <w:p>
+      <w:r>
+        <w:pict w14:anchorId="3B359176">
+          <v:rect id="_x0000_i1185" style="width:0;height:1.5pt" o:hralign="center" o:hrstd="t" o:hr="t" fillcolor="#a0a0a0" stroked="f"/>
+        </w:pict>
+      </w:r>
+    </w:p>
+    <w:p>
+      <w:pPr>
+        <w:rPr>
+          <w:b/>
+          <w:bCs/>
+        </w:rPr>
+      </w:pPr>
+      <w:r>
+        <w:rPr>
+          <w:b/>
+          <w:bCs/>
+        </w:rPr>
+        <w:t>18. ¿Qué permite la adaptación de tono con IA?</w:t>
+      </w:r>
+    </w:p>
+    <w:p>
+      <w:r>
+        <w:t>A) Cambiar idioma</w:t>
+      </w:r>
+      <w:r>
+        <w:br/>
+        <w:t>B) Ajustar el mensaje según el público</w:t>
+      </w:r>
+      <w:r>
+        <w:br/>
+        <w:t>C) Traducir texto</w:t>
+      </w:r>
+      <w:r>
+        <w:br/>
+        <w:t>D) Eliminar errores</w:t>
+      </w:r>
+    </w:p>
+    <w:p>
+      <w:r>
+        <w:rPr>
+          <w:rFonts w:ascii="Segoe UI Emoji" w:hAnsi="Segoe UI Emoji" w:cs="Segoe UI Emoji"/>
+        </w:rPr>
+        <w:t>✅</w:t>
+      </w:r>
+      <w:r>
+        <w:t xml:space="preserve"> </w:t>
+      </w:r>
+      <w:r>
+        <w:rPr>
+          <w:b/>
+          <w:bCs/>
+        </w:rPr>
+        <w:t>Respuesta correcta: B</w:t>
+      </w:r>
+    </w:p>
+    <w:p>
+      <w:r>
+        <w:pict w14:anchorId="111A2A65">
+          <v:rect id="_x0000_i1186" style="width:0;height:1.5pt" o:hralign="center" o:hrstd="t" o:hr="t" fillcolor="#a0a0a0" stroked="f"/>
+        </w:pict>
+      </w:r>
+    </w:p>
+    <w:p>
+      <w:pPr>
+        <w:rPr>
+          <w:b/>
+          <w:bCs/>
+        </w:rPr>
+      </w:pPr>
+      <w:r>
+        <w:rPr>
+          <w:b/>
+          <w:bCs/>
+        </w:rPr>
+        <w:t>19. ¿Cuál es el propósito del refinamiento de textos?</w:t>
+      </w:r>
+    </w:p>
+    <w:p>
+      <w:r>
+        <w:t>A) Hacerlos más largos</w:t>
+      </w:r>
+      <w:r>
+        <w:br/>
+        <w:t>B) Mejorar claridad, precisión y estilo</w:t>
+      </w:r>
+      <w:r>
+        <w:br/>
+        <w:t>C) Cambiar el tema</w:t>
+      </w:r>
+      <w:r>
+        <w:br/>
+        <w:t>D) Simplificar contenido</w:t>
+      </w:r>
+    </w:p>
+    <w:p>
+      <w:r>
+        <w:rPr>
+          <w:rFonts w:ascii="Segoe UI Emoji" w:hAnsi="Segoe UI Emoji" w:cs="Segoe UI Emoji"/>
+        </w:rPr>
+        <w:t>✅</w:t>
+      </w:r>
+      <w:r>
+        <w:t xml:space="preserve"> </w:t>
+      </w:r>
+      <w:r>
+        <w:rPr>
+          <w:b/>
+          <w:bCs/>
+        </w:rPr>
+        <w:t>Respuesta correcta: B</w:t>
+      </w:r>
+    </w:p>
+    <w:p>
+      <w:r>
+        <w:lastRenderedPageBreak/>
+        <w:pict w14:anchorId="33D925F4">
+          <v:rect id="_x0000_i1187" style="width:0;height:1.5pt" o:hralign="center" o:hrstd="t" o:hr="t" fillcolor="#a0a0a0" stroked="f"/>
+        </w:pict>
+      </w:r>
+    </w:p>
+    <w:p>
+      <w:pPr>
+        <w:rPr>
+          <w:b/>
+          <w:bCs/>
+        </w:rPr>
+      </w:pPr>
+      <w:r>
+        <w:rPr>
+          <w:b/>
+          <w:bCs/>
+        </w:rPr>
+        <w:t>20. ¿Cuál es la función principal de la IA en comunicación profesional?</w:t>
+      </w:r>
+    </w:p>
+    <w:p>
+      <w:r>
+        <w:t>A) Reemplazar al usuario</w:t>
+      </w:r>
+      <w:r>
+        <w:br/>
+        <w:t>B) Generar contenido automático sin supervisión</w:t>
+      </w:r>
+      <w:r>
+        <w:br/>
+        <w:t>C) Optimizar la calidad del mensaje</w:t>
+      </w:r>
+      <w:r>
+        <w:br/>
+        <w:t>D) Eliminar la redacción humana</w:t>
+      </w:r>
+    </w:p>
+    <w:p>
+      <w:r>
+        <w:rPr>
+          <w:rFonts w:ascii="Segoe UI Emoji" w:hAnsi="Segoe UI Emoji" w:cs="Segoe UI Emoji"/>
+        </w:rPr>
+        <w:t>✅</w:t>
+      </w:r>
+      <w:r>
+        <w:t xml:space="preserve"> </w:t>
+      </w:r>
+      <w:r>
+        <w:rPr>
+          <w:b/>
+          <w:bCs/>
+        </w:rPr>
+        <w:t>Respuesta correcta: C</w:t>
+      </w:r>
+    </w:p>
     <w:p/>
     <w:sectPr>
       <w:pgSz w:w="12240" w:h="15840"/>
@@ -14865,7 +16781,6 @@
   <w:style w:type="character" w:default="1" w:styleId="Fuentedeprrafopredeter">
     <w:name w:val="Default Paragraph Font"/>
     <w:uiPriority w:val="1"/>
-    <w:semiHidden/>
     <w:unhideWhenUsed/>
   </w:style>
   <w:style w:type="table" w:default="1" w:styleId="Tablanormal">

</xml_diff>